<commit_message>
docs(paper): deepen the write-up — theory, worked signal chains, PID term-by-term, regenerated validation
- New sections: Theory of Operation (Darcy slope method, pore size,
  T-invariance proof), The Control System (discrete PID as implemented),
  Remote Operation and Data Management
- 3 new figures: control-loop block diagram, annotated sim timeline,
  the instrument's own Q-vs-dP chart
- offline_sim.py: accelerated (no-sleep) runs of the production
  sequencer/PID/analysis path; regenerates Tables 1-2 consistently
  (fixes stale temperature-invariance k from an old config)
- 7 -> 14 pages
</commit_message>
<xml_diff>
--- a/docs/paper/Automated_Membrane_Permeability_System_Martinez.docx
+++ b/docs/paper/Automated_Membrane_Permeability_System_Martinez.docx
@@ -88,7 +88,7 @@
           <w:sz w:val="22"/>
           <w:szCs w:val="22"/>
         </w:rPr>
-        <w:t xml:space="preserve">Membrane permeability characterization by constant-pressure permeate collection is conventionally performed manually: an operator regulates the feed pressure with a hand valve while simultaneously timing the collection of permeate with a stopwatch and repositioning the outlet hose between containers. Both tasks introduce operator-dependent error into the flow-rate measurement from which the Darcy permeability is derived. This work presents a low-cost automated test platform, built around a Raspberry Pi 4 single-board computer, that closes the loop on both error sources. Feed pressure is regulated by a proportional–integral–derivative (PID) controller commanding a servo-actuated quarter-turn valve on the compressed-air inlet of an air-over-water pressure vessel, while a three-way solenoid diverter automates the timed routing of permeate between waste and measurement containers. Water temperature is measured in situ and the temperature-dependent viscosity is computed automatically, so that the derived permeability is temperature-corrected per run. The full software stack — hardware abstraction, control loop, test sequencing, safety supervision, data logging, and a browser-based user interface — was validated in a hardware-free simulation mode. Simulated runs held setpoints of 20–60 kPa against a ±8 kPa oscillating supply disturbance, reproduced a reference manual dataset (permeability k = 1.44 × 10⁻¹² m², mean hydraulic pore size 6.78 µm, R² = 0.994), and confirmed that the derived permeability is invariant with water temperature, as theory requires.</w:t>
+        <w:t xml:space="preserve">Membrane permeability characterization by constant-pressure permeate collection is conventionally performed manually: an operator regulates the feed pressure with a hand valve while simultaneously timing the collection of permeate with a stopwatch and repositioning the outlet hose between containers. Both tasks introduce operator-dependent error into the flow-rate measurement from which the Darcy permeability is derived. This work presents a low-cost automated test platform, built around a Raspberry Pi 4 single-board computer, that closes the loop on both error sources. Feed pressure is regulated at 20 Hz by a discrete proportional–integral–derivative (PID) controller — with derivative-on-measurement filtering, back-calculation anti-windup, and rate-limited setpoint ramping — commanding a servo-actuated quarter-turn valve on the compressed-air inlet of an air-over-water pressure vessel. A three-way solenoid diverter automates the timed routing of permeate between waste and measurement containers, so the collection interval is defined by the same clock that samples the pressure. Water temperature is measured in situ and the temperature-dependent viscosity is computed from the Vogel correlation, making the derived permeability temperature-corrected per run. The full software stack — hardware abstraction, control loop, test sequencing, safety supervision, data logging, and a browser-based user interface — was validated in a hardware-free simulation mode built on a first-order plant model. Against a ±8 kPa oscillating supply disturbance, the closed loop held setpoints of 20/40/60 kPa with standard deviations of 0.21–0.69 kPa and 100% of samples inside the ±10% acceptance band. The derived permeability was invariant with water temperature to five significant figures (k = 1.4392 × 10⁻¹² m² at 20, 25, 30, and 35 °C) while the raw slope changed by 39%, as theory requires, and the analysis pipeline reproduced a reference manually acquired dataset (k = 1.44 × 10⁻¹² m², mean hydraulic pore size 6.78 µm, R² = 0.994) to within reading precision.</w:t>
       </w:r>
     </w:p>
     <w:p>
@@ -132,6 +132,23 @@
     </w:p>
     <w:p>
       <w:pPr>
+        <w:spacing w:after="100" w:before="160"/>
+      </w:pPr>
+      <w:r>
+        <w:rPr>
+          <w:rFonts w:ascii="Times New Roman" w:cs="Times New Roman" w:eastAsia="Times New Roman" w:hAnsi="Times New Roman"/>
+          <w:b/>
+          <w:bCs/>
+          <w:i/>
+          <w:iCs/>
+          <w:sz w:val="22"/>
+          <w:szCs w:val="22"/>
+        </w:rPr>
+        <w:t xml:space="preserve">1.1 The measurement and why it matters</w:t>
+      </w:r>
+    </w:p>
+    <w:p>
+      <w:pPr>
         <w:spacing w:after="120" w:line="276"/>
         <w:jc w:val="both"/>
       </w:pPr>
@@ -141,7 +158,24 @@
           <w:sz w:val="22"/>
           <w:szCs w:val="22"/>
         </w:rPr>
-        <w:t xml:space="preserve">The permeability of porous membranes is routinely characterized by driving water through a membrane specimen at a series of controlled transmembrane pressures and measuring the resulting volumetric flow rate. Under laminar, viscous-dominated flow the two quantities are related by Darcy's law [1], and the slope of the flow-rate–versus–pressure line yields the permeability, from which a mean hydraulic pore size follows. In the target application — mesh membranes for two-phase cooling devices, where pore size controls the trade-off between permeate flow and capillary pumping pressure — permeability values in the 10⁻¹²–10⁻¹³ m² range must be resolved reliably across specimens.</w:t>
+        <w:t xml:space="preserve">The permeability of porous membranes is routinely characterized by driving water through a membrane specimen at a series of controlled transmembrane pressures and measuring the resulting volumetric flow rate. Under laminar, viscous-dominated flow the two quantities are proportional (Darcy's law [1]), and the slope of the flow-rate–versus–pressure line yields the permeability, from which a mean hydraulic pore size follows. In the target application — woven-mesh membranes for two-phase cooling devices, where pore size controls the trade-off between permeate flow and capillary pumping pressure — permeability values in the 10⁻¹³–10⁻¹² m² range must be resolved reliably and repeatably across specimens, because design decisions ride on comparisons between meshes whose permeabilities differ by far less than an order of magnitude.</w:t>
+      </w:r>
+    </w:p>
+    <w:p>
+      <w:pPr>
+        <w:spacing w:after="100" w:before="160"/>
+      </w:pPr>
+      <w:r>
+        <w:rPr>
+          <w:rFonts w:ascii="Times New Roman" w:cs="Times New Roman" w:eastAsia="Times New Roman" w:hAnsi="Times New Roman"/>
+          <w:b/>
+          <w:bCs/>
+          <w:i/>
+          <w:iCs/>
+          <w:sz w:val="22"/>
+          <w:szCs w:val="22"/>
+        </w:rPr>
+        <w:t xml:space="preserve">1.2 Anatomy of the manual procedure and its errors</w:t>
       </w:r>
     </w:p>
     <w:p>
@@ -155,7 +189,64 @@
           <w:sz w:val="22"/>
           <w:szCs w:val="22"/>
         </w:rPr>
-        <w:t xml:space="preserve">In the existing manual procedure, a compressor pressurizes a water reservoir; an operator throttles a valve by hand until an analog gauge reads the target pressure, holds it there by continuous adjustment, and simultaneously starts a stopwatch while moving the outlet hose into a graduated container. After a fixed time, the hose is withdrawn and the collected volume is read. This procedure has two operator-dependent error sources: (i) the regulated pressure wanders with compressor cycling and operator attention, and (ii) the collection interval and the hose transfer are timed by hand. Both propagate directly into the measured flow rate and therefore into the reported permeability.</w:t>
+        <w:t xml:space="preserve">In the existing manual procedure, a compressor pressurizes a water reservoir; an operator throttles a valve by hand until an analog gauge reads the target pressure, holds it there by continuous adjustment, and simultaneously starts a stopwatch while moving the outlet hose into a graduated container. After a fixed time the hose is withdrawn and the collected volume is read. Every quantity in the final result passes through a human in real time, and each pass costs accuracy in a different way:</w:t>
+      </w:r>
+    </w:p>
+    <w:p>
+      <w:pPr>
+        <w:pStyle w:val="ListParagraph"/>
+        <w:numPr>
+          <w:ilvl w:val="0"/>
+          <w:numId w:val="2"/>
+        </w:numPr>
+        <w:spacing w:after="60" w:line="276"/>
+        <w:jc w:val="both"/>
+      </w:pPr>
+      <w:r>
+        <w:rPr>
+          <w:rFonts w:ascii="Times New Roman" w:cs="Times New Roman" w:eastAsia="Times New Roman" w:hAnsi="Times New Roman"/>
+          <w:sz w:val="22"/>
+          <w:szCs w:val="22"/>
+        </w:rPr>
+        <w:t xml:space="preserve">Pressure holding. The compressor cycles, so the supply pressure is not constant; the operator chases it with the valve while also watching the clock. At the lowest test point (20 kPa) a hand-held wander of only ±3 kPa is a ±15% error in the independent variable — and, crucially, it is an unrecorded error: the analysis is later performed against the nominal setpoint, as if the pressure had actually been held there.</w:t>
+      </w:r>
+    </w:p>
+    <w:p>
+      <w:pPr>
+        <w:pStyle w:val="ListParagraph"/>
+        <w:numPr>
+          <w:ilvl w:val="0"/>
+          <w:numId w:val="2"/>
+        </w:numPr>
+        <w:spacing w:after="60" w:line="276"/>
+        <w:jc w:val="both"/>
+      </w:pPr>
+      <w:r>
+        <w:rPr>
+          <w:rFonts w:ascii="Times New Roman" w:cs="Times New Roman" w:eastAsia="Times New Roman" w:hAnsi="Times New Roman"/>
+          <w:sz w:val="22"/>
+          <w:szCs w:val="22"/>
+        </w:rPr>
+        <w:t xml:space="preserve">Collection timing. The interval is bounded by two manual hose transfers synchronized by eye with a stopwatch. With a human reaction time of a few tenths of a second at each end, a 60 s window carries an uncertainty of roughly 1–2% — and the permeate spilled or missed during each transfer adds a volume error of the same sign every time, i.e., a bias rather than noise.</w:t>
+      </w:r>
+    </w:p>
+    <w:p>
+      <w:pPr>
+        <w:pStyle w:val="ListParagraph"/>
+        <w:numPr>
+          <w:ilvl w:val="0"/>
+          <w:numId w:val="2"/>
+        </w:numPr>
+        <w:spacing w:after="60" w:line="276"/>
+        <w:jc w:val="both"/>
+      </w:pPr>
+      <w:r>
+        <w:rPr>
+          <w:rFonts w:ascii="Times New Roman" w:cs="Times New Roman" w:eastAsia="Times New Roman" w:hAnsi="Times New Roman"/>
+          <w:sz w:val="22"/>
+          <w:szCs w:val="22"/>
+        </w:rPr>
+        <w:t xml:space="preserve">Attention splitting. Both tasks peak at the same moment (the start of collection), so errors in one are correlated with errors in the other. A pressure excursion during the collection window goes unnoticed precisely when it matters most.</w:t>
       </w:r>
     </w:p>
     <w:p>
@@ -169,7 +260,38 @@
           <w:sz w:val="22"/>
           <w:szCs w:val="22"/>
         </w:rPr>
-        <w:t xml:space="preserve">This paper describes an automated test platform that removes the operator from both tasks while logging every measured quantity. The system was designed around three constraints: minimal cost (commodity hobby-grade actuation and sensing), non-invasive integration with the existing stainless-steel test vessel, and a software architecture that can be exercised end-to-end without hardware, so that control logic and analysis could be verified before the instrument was assembled.</w:t>
+        <w:t xml:space="preserve">The design insight of this work is that these two error sources call for two different remedies. Timing error is eliminated by giving the clock to the computer: a solenoid diverter switched by the same 20 Hz loop that samples the pressure bounds the collection window to software precision (one control tick, 50 ms, or &lt;0.1% of a 60 s window). Pressure error, by contrast, is not so much eliminated as made honest: the controller holds the setpoint as well as a hobby-grade actuator allows, but — more importantly — the analysis is performed against the measured mean pressure of each collection window rather than the nominal target. Imperfect regulation then adds scatter, which the regression averages out, instead of bias, which it cannot (Section 6).</w:t>
+      </w:r>
+    </w:p>
+    <w:p>
+      <w:pPr>
+        <w:spacing w:after="100" w:before="160"/>
+      </w:pPr>
+      <w:r>
+        <w:rPr>
+          <w:rFonts w:ascii="Times New Roman" w:cs="Times New Roman" w:eastAsia="Times New Roman" w:hAnsi="Times New Roman"/>
+          <w:b/>
+          <w:bCs/>
+          <w:i/>
+          <w:iCs/>
+          <w:sz w:val="22"/>
+          <w:szCs w:val="22"/>
+        </w:rPr>
+        <w:t xml:space="preserve">1.3 Design constraints</w:t>
+      </w:r>
+    </w:p>
+    <w:p>
+      <w:pPr>
+        <w:spacing w:after="120" w:line="276"/>
+        <w:jc w:val="both"/>
+      </w:pPr>
+      <w:r>
+        <w:rPr>
+          <w:rFonts w:ascii="Times New Roman" w:cs="Times New Roman" w:eastAsia="Times New Roman" w:hAnsi="Times New Roman"/>
+          <w:sz w:val="22"/>
+          <w:szCs w:val="22"/>
+        </w:rPr>
+        <w:t xml:space="preserve">The platform was designed under three constraints. First, minimal cost: commodity hobby-grade actuation and sensing (a total bill of materials near US$300), accepting coarser regulation in exchange and compensating in the analysis. Second, non-invasive integration: the existing stainless-steel test vessel, its plumbing, and its analog gauge remain untouched; the automation attaches around them. Third, hardware-free verifiability: every line of control logic and analysis had to be exercisable end-to-end on a laptop, with no rig attached, so that the software could be proven before a single part was purchased — and can be regression-tested after every future change.</w:t>
       </w:r>
     </w:p>
     <w:p>
@@ -184,7 +306,7 @@
           <w:sz w:val="24"/>
           <w:szCs w:val="24"/>
         </w:rPr>
-        <w:t xml:space="preserve">2. System Description</w:t>
+        <w:t xml:space="preserve">2. Theory of Operation</w:t>
       </w:r>
     </w:p>
     <w:p>
@@ -201,7 +323,7 @@
           <w:sz w:val="22"/>
           <w:szCs w:val="22"/>
         </w:rPr>
-        <w:t xml:space="preserve">2.1 Apparatus</w:t>
+        <w:t xml:space="preserve">2.1 Darcy's law and the slope method</w:t>
       </w:r>
     </w:p>
     <w:p>
@@ -215,7 +337,745 @@
           <w:sz w:val="22"/>
           <w:szCs w:val="22"/>
         </w:rPr>
-        <w:t xml:space="preserve">The test cell is an existing stainless-steel pressure vessel with the membrane specimen clamped at a bolted mid-plane flange. Compressed air from the laboratory gas panel pressurizes the headspace above a column of distilled water (air-over-water configuration); the pressurized water permeates the membrane and exits through an outlet port. The automation adds five elements to this vessel (Fig. 1): (i) a hobby servomotor (20 kg·cm class) coupled through a 3-D-printed transmission to the quarter-turn ball valve on the air inlet; (ii) a ratiometric pressure transducer (0–103.4 kPa, 0.5–4.5 V) teed into the feed line adjacent to the existing analog gauge; (iii) a waterproof DS18B20 digital thermometer immersed in the permeate stream; (iv) a 12 V three-way solenoid valve on the permeate outlet that routes flow either to waste or to the graduated measurement container; and (v) an adjustable mechanical pressure-relief valve on the air side as a hardware overpressure backstop, independent of all software.</w:t>
+        <w:t xml:space="preserve">For laminar flow of an incompressible fluid through a thin porous layer, Darcy's law relates the volumetric flow rate </w:t>
+      </w:r>
+      <w:r>
+        <w:rPr>
+          <w:rFonts w:ascii="Times New Roman" w:cs="Times New Roman" w:eastAsia="Times New Roman" w:hAnsi="Times New Roman"/>
+          <w:i/>
+          <w:iCs/>
+          <w:sz w:val="22"/>
+          <w:szCs w:val="22"/>
+        </w:rPr>
+        <w:t xml:space="preserve">Q</w:t>
+      </w:r>
+      <w:r>
+        <w:rPr>
+          <w:rFonts w:ascii="Times New Roman" w:cs="Times New Roman" w:eastAsia="Times New Roman" w:hAnsi="Times New Roman"/>
+          <w:sz w:val="22"/>
+          <w:szCs w:val="22"/>
+        </w:rPr>
+        <w:t xml:space="preserve"> (m³/s) to the transmembrane pressure difference Δ</w:t>
+      </w:r>
+      <w:r>
+        <w:rPr>
+          <w:rFonts w:ascii="Times New Roman" w:cs="Times New Roman" w:eastAsia="Times New Roman" w:hAnsi="Times New Roman"/>
+          <w:i/>
+          <w:iCs/>
+          <w:sz w:val="22"/>
+          <w:szCs w:val="22"/>
+        </w:rPr>
+        <w:t xml:space="preserve">P</w:t>
+      </w:r>
+      <w:r>
+        <w:rPr>
+          <w:rFonts w:ascii="Times New Roman" w:cs="Times New Roman" w:eastAsia="Times New Roman" w:hAnsi="Times New Roman"/>
+          <w:sz w:val="22"/>
+          <w:szCs w:val="22"/>
+        </w:rPr>
+        <w:t xml:space="preserve"> (Pa):</w:t>
+      </w:r>
+    </w:p>
+    <w:p>
+      <w:pPr>
+        <w:spacing w:after="80" w:before="80"/>
+        <w:ind w:left="720"/>
+      </w:pPr>
+      <w:r>
+        <w:rPr>
+          <w:rFonts w:ascii="Times New Roman" w:cs="Times New Roman" w:eastAsia="Times New Roman" w:hAnsi="Times New Roman"/>
+          <w:i/>
+          <w:iCs/>
+          <w:sz w:val="22"/>
+          <w:szCs w:val="22"/>
+        </w:rPr>
+        <w:t xml:space="preserve">Q = k · A · ΔP / (μ · L)</w:t>
+      </w:r>
+      <w:r>
+        <w:rPr>
+          <w:rFonts w:ascii="Times New Roman" w:cs="Times New Roman" w:eastAsia="Times New Roman" w:hAnsi="Times New Roman"/>
+          <w:sz w:val="22"/>
+          <w:szCs w:val="22"/>
+        </w:rPr>
+        <w:ptab w:alignment="right" w:relativeTo="margin" w:leader="none"/>
+        <w:t xml:space="preserve">(1)</w:t>
+      </w:r>
+    </w:p>
+    <w:p>
+      <w:pPr>
+        <w:spacing w:after="120" w:line="276"/>
+        <w:jc w:val="both"/>
+      </w:pPr>
+      <w:r>
+        <w:rPr>
+          <w:rFonts w:ascii="Times New Roman" w:cs="Times New Roman" w:eastAsia="Times New Roman" w:hAnsi="Times New Roman"/>
+          <w:sz w:val="22"/>
+          <w:szCs w:val="22"/>
+        </w:rPr>
+        <w:t xml:space="preserve">where </w:t>
+      </w:r>
+      <w:r>
+        <w:rPr>
+          <w:rFonts w:ascii="Times New Roman" w:cs="Times New Roman" w:eastAsia="Times New Roman" w:hAnsi="Times New Roman"/>
+          <w:i/>
+          <w:iCs/>
+          <w:sz w:val="22"/>
+          <w:szCs w:val="22"/>
+        </w:rPr>
+        <w:t xml:space="preserve">k</w:t>
+      </w:r>
+      <w:r>
+        <w:rPr>
+          <w:rFonts w:ascii="Times New Roman" w:cs="Times New Roman" w:eastAsia="Times New Roman" w:hAnsi="Times New Roman"/>
+          <w:sz w:val="22"/>
+          <w:szCs w:val="22"/>
+        </w:rPr>
+        <w:t xml:space="preserve"> (m²) is the permeability — a purely geometric property of the porous structure — </w:t>
+      </w:r>
+      <w:r>
+        <w:rPr>
+          <w:rFonts w:ascii="Times New Roman" w:cs="Times New Roman" w:eastAsia="Times New Roman" w:hAnsi="Times New Roman"/>
+          <w:i/>
+          <w:iCs/>
+          <w:sz w:val="22"/>
+          <w:szCs w:val="22"/>
+        </w:rPr>
+        <w:t xml:space="preserve">A</w:t>
+      </w:r>
+      <w:r>
+        <w:rPr>
+          <w:rFonts w:ascii="Times New Roman" w:cs="Times New Roman" w:eastAsia="Times New Roman" w:hAnsi="Times New Roman"/>
+          <w:sz w:val="22"/>
+          <w:szCs w:val="22"/>
+        </w:rPr>
+        <w:t xml:space="preserve"> (m²) the active membrane area, </w:t>
+      </w:r>
+      <w:r>
+        <w:rPr>
+          <w:rFonts w:ascii="Times New Roman" w:cs="Times New Roman" w:eastAsia="Times New Roman" w:hAnsi="Times New Roman"/>
+          <w:i/>
+          <w:iCs/>
+          <w:sz w:val="22"/>
+          <w:szCs w:val="22"/>
+        </w:rPr>
+        <w:t xml:space="preserve">L</w:t>
+      </w:r>
+      <w:r>
+        <w:rPr>
+          <w:rFonts w:ascii="Times New Roman" w:cs="Times New Roman" w:eastAsia="Times New Roman" w:hAnsi="Times New Roman"/>
+          <w:sz w:val="22"/>
+          <w:szCs w:val="22"/>
+        </w:rPr>
+        <w:t xml:space="preserve"> (m) its thickness, and </w:t>
+      </w:r>
+      <w:r>
+        <w:rPr>
+          <w:rFonts w:ascii="Times New Roman" w:cs="Times New Roman" w:eastAsia="Times New Roman" w:hAnsi="Times New Roman"/>
+          <w:i/>
+          <w:iCs/>
+          <w:sz w:val="22"/>
+          <w:szCs w:val="22"/>
+        </w:rPr>
+        <w:t xml:space="preserve">μ</w:t>
+      </w:r>
+      <w:r>
+        <w:rPr>
+          <w:rFonts w:ascii="Times New Roman" w:cs="Times New Roman" w:eastAsia="Times New Roman" w:hAnsi="Times New Roman"/>
+          <w:sz w:val="22"/>
+          <w:szCs w:val="22"/>
+        </w:rPr>
+        <w:t xml:space="preserve"> (Pa·s) the dynamic viscosity of the fluid. Equation (1) predicts that a plot of </w:t>
+      </w:r>
+      <w:r>
+        <w:rPr>
+          <w:rFonts w:ascii="Times New Roman" w:cs="Times New Roman" w:eastAsia="Times New Roman" w:hAnsi="Times New Roman"/>
+          <w:i/>
+          <w:iCs/>
+          <w:sz w:val="22"/>
+          <w:szCs w:val="22"/>
+        </w:rPr>
+        <w:t xml:space="preserve">Q</w:t>
+      </w:r>
+      <w:r>
+        <w:rPr>
+          <w:rFonts w:ascii="Times New Roman" w:cs="Times New Roman" w:eastAsia="Times New Roman" w:hAnsi="Times New Roman"/>
+          <w:sz w:val="22"/>
+          <w:szCs w:val="22"/>
+        </w:rPr>
+        <w:t xml:space="preserve"> against Δ</w:t>
+      </w:r>
+      <w:r>
+        <w:rPr>
+          <w:rFonts w:ascii="Times New Roman" w:cs="Times New Roman" w:eastAsia="Times New Roman" w:hAnsi="Times New Roman"/>
+          <w:i/>
+          <w:iCs/>
+          <w:sz w:val="22"/>
+          <w:szCs w:val="22"/>
+        </w:rPr>
+        <w:t xml:space="preserve">P</w:t>
+      </w:r>
+      <w:r>
+        <w:rPr>
+          <w:rFonts w:ascii="Times New Roman" w:cs="Times New Roman" w:eastAsia="Times New Roman" w:hAnsi="Times New Roman"/>
+          <w:sz w:val="22"/>
+          <w:szCs w:val="22"/>
+        </w:rPr>
+        <w:t xml:space="preserve"> is a straight line through the origin. In practice the measured line is fitted with a free intercept,</w:t>
+      </w:r>
+    </w:p>
+    <w:p>
+      <w:pPr>
+        <w:spacing w:after="80" w:before="80"/>
+        <w:ind w:left="720"/>
+      </w:pPr>
+      <w:r>
+        <w:rPr>
+          <w:rFonts w:ascii="Times New Roman" w:cs="Times New Roman" w:eastAsia="Times New Roman" w:hAnsi="Times New Roman"/>
+          <w:i/>
+          <w:iCs/>
+          <w:sz w:val="22"/>
+          <w:szCs w:val="22"/>
+        </w:rPr>
+        <w:t xml:space="preserve">Q = a + b · ΔP</w:t>
+      </w:r>
+      <w:r>
+        <w:rPr>
+          <w:rFonts w:ascii="Times New Roman" w:cs="Times New Roman" w:eastAsia="Times New Roman" w:hAnsi="Times New Roman"/>
+          <w:sz w:val="22"/>
+          <w:szCs w:val="22"/>
+        </w:rPr>
+        <w:ptab w:alignment="right" w:relativeTo="margin" w:leader="none"/>
+        <w:t xml:space="preserve">(2)</w:t>
+      </w:r>
+    </w:p>
+    <w:p>
+      <w:pPr>
+        <w:spacing w:after="120" w:line="276"/>
+        <w:jc w:val="both"/>
+      </w:pPr>
+      <w:r>
+        <w:rPr>
+          <w:rFonts w:ascii="Times New Roman" w:cs="Times New Roman" w:eastAsia="Times New Roman" w:hAnsi="Times New Roman"/>
+          <w:sz w:val="22"/>
+          <w:szCs w:val="22"/>
+        </w:rPr>
+        <w:t xml:space="preserve">and the permeability is extracted from the fitted slope </w:t>
+      </w:r>
+      <w:r>
+        <w:rPr>
+          <w:rFonts w:ascii="Times New Roman" w:cs="Times New Roman" w:eastAsia="Times New Roman" w:hAnsi="Times New Roman"/>
+          <w:i/>
+          <w:iCs/>
+          <w:sz w:val="22"/>
+          <w:szCs w:val="22"/>
+        </w:rPr>
+        <w:t xml:space="preserve">b</w:t>
+      </w:r>
+      <w:r>
+        <w:rPr>
+          <w:rFonts w:ascii="Times New Roman" w:cs="Times New Roman" w:eastAsia="Times New Roman" w:hAnsi="Times New Roman"/>
+          <w:sz w:val="22"/>
+          <w:szCs w:val="22"/>
+        </w:rPr>
+        <w:t xml:space="preserve"> alone:</w:t>
+      </w:r>
+    </w:p>
+    <w:p>
+      <w:pPr>
+        <w:spacing w:after="80" w:before="80"/>
+        <w:ind w:left="720"/>
+      </w:pPr>
+      <w:r>
+        <w:rPr>
+          <w:rFonts w:ascii="Times New Roman" w:cs="Times New Roman" w:eastAsia="Times New Roman" w:hAnsi="Times New Roman"/>
+          <w:i/>
+          <w:iCs/>
+          <w:sz w:val="22"/>
+          <w:szCs w:val="22"/>
+        </w:rPr>
+        <w:t xml:space="preserve">k = b</w:t>
+      </w:r>
+      <w:r>
+        <w:rPr>
+          <w:rFonts w:ascii="Times New Roman" w:cs="Times New Roman" w:eastAsia="Times New Roman" w:hAnsi="Times New Roman"/>
+          <w:sz w:val="22"/>
+          <w:szCs w:val="22"/>
+          <w:vertAlign w:val="subscript"/>
+        </w:rPr>
+        <w:t xml:space="preserve">Pa</w:t>
+      </w:r>
+      <w:r>
+        <w:rPr>
+          <w:rFonts w:ascii="Times New Roman" w:cs="Times New Roman" w:eastAsia="Times New Roman" w:hAnsi="Times New Roman"/>
+          <w:i/>
+          <w:iCs/>
+          <w:sz w:val="22"/>
+          <w:szCs w:val="22"/>
+        </w:rPr>
+        <w:t xml:space="preserve"> · μ · L / A</w:t>
+      </w:r>
+      <w:r>
+        <w:rPr>
+          <w:rFonts w:ascii="Times New Roman" w:cs="Times New Roman" w:eastAsia="Times New Roman" w:hAnsi="Times New Roman"/>
+          <w:sz w:val="22"/>
+          <w:szCs w:val="22"/>
+        </w:rPr>
+        <w:ptab w:alignment="right" w:relativeTo="margin" w:leader="none"/>
+        <w:t xml:space="preserve">(3)</w:t>
+      </w:r>
+    </w:p>
+    <w:p>
+      <w:pPr>
+        <w:spacing w:after="120" w:line="276"/>
+        <w:jc w:val="both"/>
+      </w:pPr>
+      <w:r>
+        <w:rPr>
+          <w:rFonts w:ascii="Times New Roman" w:cs="Times New Roman" w:eastAsia="Times New Roman" w:hAnsi="Times New Roman"/>
+          <w:sz w:val="22"/>
+          <w:szCs w:val="22"/>
+        </w:rPr>
+        <w:t xml:space="preserve">with </w:t>
+      </w:r>
+      <w:r>
+        <w:rPr>
+          <w:rFonts w:ascii="Times New Roman" w:cs="Times New Roman" w:eastAsia="Times New Roman" w:hAnsi="Times New Roman"/>
+          <w:i/>
+          <w:iCs/>
+          <w:sz w:val="22"/>
+          <w:szCs w:val="22"/>
+        </w:rPr>
+        <w:t xml:space="preserve">b</w:t>
+      </w:r>
+      <w:r>
+        <w:rPr>
+          <w:rFonts w:ascii="Times New Roman" w:cs="Times New Roman" w:eastAsia="Times New Roman" w:hAnsi="Times New Roman"/>
+          <w:sz w:val="22"/>
+          <w:szCs w:val="22"/>
+          <w:vertAlign w:val="subscript"/>
+        </w:rPr>
+        <w:t xml:space="preserve">Pa</w:t>
+      </w:r>
+      <w:r>
+        <w:rPr>
+          <w:rFonts w:ascii="Times New Roman" w:cs="Times New Roman" w:eastAsia="Times New Roman" w:hAnsi="Times New Roman"/>
+          <w:sz w:val="22"/>
+          <w:szCs w:val="22"/>
+        </w:rPr>
+        <w:t xml:space="preserve"> the slope converted to SI pressure units. This </w:t>
+      </w:r>
+      <w:r>
+        <w:rPr>
+          <w:rFonts w:ascii="Times New Roman" w:cs="Times New Roman" w:eastAsia="Times New Roman" w:hAnsi="Times New Roman"/>
+          <w:i/>
+          <w:iCs/>
+          <w:sz w:val="22"/>
+          <w:szCs w:val="22"/>
+        </w:rPr>
+        <w:t xml:space="preserve">slope method</w:t>
+      </w:r>
+      <w:r>
+        <w:rPr>
+          <w:rFonts w:ascii="Times New Roman" w:cs="Times New Roman" w:eastAsia="Times New Roman" w:hAnsi="Times New Roman"/>
+          <w:sz w:val="22"/>
+          <w:szCs w:val="22"/>
+        </w:rPr>
+        <w:t xml:space="preserve"> is deliberately preferred over the seemingly simpler alternative of computing k from each (</w:t>
+      </w:r>
+      <w:r>
+        <w:rPr>
+          <w:rFonts w:ascii="Times New Roman" w:cs="Times New Roman" w:eastAsia="Times New Roman" w:hAnsi="Times New Roman"/>
+          <w:i/>
+          <w:iCs/>
+          <w:sz w:val="22"/>
+          <w:szCs w:val="22"/>
+        </w:rPr>
+        <w:t xml:space="preserve">ΔP, Q</w:t>
+      </w:r>
+      <w:r>
+        <w:rPr>
+          <w:rFonts w:ascii="Times New Roman" w:cs="Times New Roman" w:eastAsia="Times New Roman" w:hAnsi="Times New Roman"/>
+          <w:sz w:val="22"/>
+          <w:szCs w:val="22"/>
+        </w:rPr>
+        <w:t xml:space="preserve">) point individually and averaging. The free intercept </w:t>
+      </w:r>
+      <w:r>
+        <w:rPr>
+          <w:rFonts w:ascii="Times New Roman" w:cs="Times New Roman" w:eastAsia="Times New Roman" w:hAnsi="Times New Roman"/>
+          <w:i/>
+          <w:iCs/>
+          <w:sz w:val="22"/>
+          <w:szCs w:val="22"/>
+        </w:rPr>
+        <w:t xml:space="preserve">a</w:t>
+      </w:r>
+      <w:r>
+        <w:rPr>
+          <w:rFonts w:ascii="Times New Roman" w:cs="Times New Roman" w:eastAsia="Times New Roman" w:hAnsi="Times New Roman"/>
+          <w:sz w:val="22"/>
+          <w:szCs w:val="22"/>
+        </w:rPr>
+        <w:t xml:space="preserve"> absorbs any systematic offset common to all points — a zero error in the pressure chain, a residual hydrostatic head, a small leak — which in per-point averaging would contaminate every k estimate, and worst at the lowest pressures where the relative offset is largest. The slope, being a difference quantity, is immune to it. The coefficient of determination R² of the fit doubles as a built-in physical check: if the specimen truly follows Darcy's law the points must be collinear, and the software flags any fit with R² &lt; 0.98 for inspection rather than silently reporting a permeability from data that do not support the model.</w:t>
+      </w:r>
+    </w:p>
+    <w:p>
+      <w:pPr>
+        <w:spacing w:after="100" w:before="160"/>
+      </w:pPr>
+      <w:r>
+        <w:rPr>
+          <w:rFonts w:ascii="Times New Roman" w:cs="Times New Roman" w:eastAsia="Times New Roman" w:hAnsi="Times New Roman"/>
+          <w:b/>
+          <w:bCs/>
+          <w:i/>
+          <w:iCs/>
+          <w:sz w:val="22"/>
+          <w:szCs w:val="22"/>
+        </w:rPr>
+        <w:t xml:space="preserve">2.2 From permeability to an equivalent pore size</w:t>
+      </w:r>
+    </w:p>
+    <w:p>
+      <w:pPr>
+        <w:spacing w:after="120" w:line="276"/>
+        <w:jc w:val="both"/>
+      </w:pPr>
+      <w:r>
+        <w:rPr>
+          <w:rFonts w:ascii="Times New Roman" w:cs="Times New Roman" w:eastAsia="Times New Roman" w:hAnsi="Times New Roman"/>
+          <w:sz w:val="22"/>
+          <w:szCs w:val="22"/>
+        </w:rPr>
+        <w:t xml:space="preserve">To convert k into an intuitive length scale, the membrane is modeled as a bundle of parallel cylindrical capillaries. Hagen–Poiseuille flow through a capillary of diameter </w:t>
+      </w:r>
+      <w:r>
+        <w:rPr>
+          <w:rFonts w:ascii="Times New Roman" w:cs="Times New Roman" w:eastAsia="Times New Roman" w:hAnsi="Times New Roman"/>
+          <w:i/>
+          <w:iCs/>
+          <w:sz w:val="22"/>
+          <w:szCs w:val="22"/>
+        </w:rPr>
+        <w:t xml:space="preserve">d</w:t>
+      </w:r>
+      <w:r>
+        <w:rPr>
+          <w:rFonts w:ascii="Times New Roman" w:cs="Times New Roman" w:eastAsia="Times New Roman" w:hAnsi="Times New Roman"/>
+          <w:sz w:val="22"/>
+          <w:szCs w:val="22"/>
+        </w:rPr>
+        <w:t xml:space="preserve"> gives an equivalent Darcy permeability of </w:t>
+      </w:r>
+      <w:r>
+        <w:rPr>
+          <w:rFonts w:ascii="Times New Roman" w:cs="Times New Roman" w:eastAsia="Times New Roman" w:hAnsi="Times New Roman"/>
+          <w:i/>
+          <w:iCs/>
+          <w:sz w:val="22"/>
+          <w:szCs w:val="22"/>
+        </w:rPr>
+        <w:t xml:space="preserve">d</w:t>
+      </w:r>
+      <w:r>
+        <w:rPr>
+          <w:rFonts w:ascii="Times New Roman" w:cs="Times New Roman" w:eastAsia="Times New Roman" w:hAnsi="Times New Roman"/>
+          <w:sz w:val="22"/>
+          <w:szCs w:val="22"/>
+        </w:rPr>
+        <w:t xml:space="preserve">²/32 [5]; inverting, and absorbing porosity into the definition, the laboratory reports a </w:t>
+      </w:r>
+      <w:r>
+        <w:rPr>
+          <w:rFonts w:ascii="Times New Roman" w:cs="Times New Roman" w:eastAsia="Times New Roman" w:hAnsi="Times New Roman"/>
+          <w:i/>
+          <w:iCs/>
+          <w:sz w:val="22"/>
+          <w:szCs w:val="22"/>
+        </w:rPr>
+        <w:t xml:space="preserve">mean hydraulic pore diameter</w:t>
+      </w:r>
+    </w:p>
+    <w:p>
+      <w:pPr>
+        <w:spacing w:after="80" w:before="80"/>
+        <w:ind w:left="720"/>
+      </w:pPr>
+      <w:r>
+        <w:rPr>
+          <w:rFonts w:ascii="Times New Roman" w:cs="Times New Roman" w:eastAsia="Times New Roman" w:hAnsi="Times New Roman"/>
+          <w:i/>
+          <w:iCs/>
+          <w:sz w:val="22"/>
+          <w:szCs w:val="22"/>
+        </w:rPr>
+        <w:t xml:space="preserve">d</w:t>
+      </w:r>
+      <w:r>
+        <w:rPr>
+          <w:rFonts w:ascii="Times New Roman" w:cs="Times New Roman" w:eastAsia="Times New Roman" w:hAnsi="Times New Roman"/>
+          <w:sz w:val="22"/>
+          <w:szCs w:val="22"/>
+          <w:vertAlign w:val="subscript"/>
+        </w:rPr>
+        <w:t xml:space="preserve">h</w:t>
+      </w:r>
+      <w:r>
+        <w:rPr>
+          <w:rFonts w:ascii="Times New Roman" w:cs="Times New Roman" w:eastAsia="Times New Roman" w:hAnsi="Times New Roman"/>
+          <w:i/>
+          <w:iCs/>
+          <w:sz w:val="22"/>
+          <w:szCs w:val="22"/>
+        </w:rPr>
+        <w:t xml:space="preserve"> = √(32 · k)</w:t>
+      </w:r>
+      <w:r>
+        <w:rPr>
+          <w:rFonts w:ascii="Times New Roman" w:cs="Times New Roman" w:eastAsia="Times New Roman" w:hAnsi="Times New Roman"/>
+          <w:sz w:val="22"/>
+          <w:szCs w:val="22"/>
+        </w:rPr>
+        <w:ptab w:alignment="right" w:relativeTo="margin" w:leader="none"/>
+        <w:t xml:space="preserve">(4)</w:t>
+      </w:r>
+    </w:p>
+    <w:p>
+      <w:pPr>
+        <w:spacing w:after="120" w:line="276"/>
+        <w:jc w:val="both"/>
+      </w:pPr>
+      <w:r>
+        <w:rPr>
+          <w:rFonts w:ascii="Times New Roman" w:cs="Times New Roman" w:eastAsia="Times New Roman" w:hAnsi="Times New Roman"/>
+          <w:sz w:val="22"/>
+          <w:szCs w:val="22"/>
+        </w:rPr>
+        <w:t xml:space="preserve">This is an effective, model-based diameter — the size of uniform capillaries that would produce the observed permeability — not a direct geometric measurement; its value is in comparing specimens on a common scale.</w:t>
+      </w:r>
+    </w:p>
+    <w:p>
+      <w:pPr>
+        <w:spacing w:after="100" w:before="160"/>
+      </w:pPr>
+      <w:r>
+        <w:rPr>
+          <w:rFonts w:ascii="Times New Roman" w:cs="Times New Roman" w:eastAsia="Times New Roman" w:hAnsi="Times New Roman"/>
+          <w:b/>
+          <w:bCs/>
+          <w:i/>
+          <w:iCs/>
+          <w:sz w:val="22"/>
+          <w:szCs w:val="22"/>
+        </w:rPr>
+        <w:t xml:space="preserve">2.3 Temperature, viscosity, and the invariance of k</w:t>
+      </w:r>
+    </w:p>
+    <w:p>
+      <w:pPr>
+        <w:spacing w:after="120" w:line="276"/>
+        <w:jc w:val="both"/>
+      </w:pPr>
+      <w:r>
+        <w:rPr>
+          <w:rFonts w:ascii="Times New Roman" w:cs="Times New Roman" w:eastAsia="Times New Roman" w:hAnsi="Times New Roman"/>
+          <w:sz w:val="22"/>
+          <w:szCs w:val="22"/>
+        </w:rPr>
+        <w:t xml:space="preserve">Viscosity is the only fluid property in Eq. (3), and for water it varies steeply with temperature — about 2.2% per °C near room temperature. The system therefore measures the water temperature and evaluates </w:t>
+      </w:r>
+      <w:r>
+        <w:rPr>
+          <w:rFonts w:ascii="Times New Roman" w:cs="Times New Roman" w:eastAsia="Times New Roman" w:hAnsi="Times New Roman"/>
+          <w:i/>
+          <w:iCs/>
+          <w:sz w:val="22"/>
+          <w:szCs w:val="22"/>
+        </w:rPr>
+        <w:t xml:space="preserve">μ</w:t>
+      </w:r>
+      <w:r>
+        <w:rPr>
+          <w:rFonts w:ascii="Times New Roman" w:cs="Times New Roman" w:eastAsia="Times New Roman" w:hAnsi="Times New Roman"/>
+          <w:sz w:val="22"/>
+          <w:szCs w:val="22"/>
+        </w:rPr>
+        <w:t xml:space="preserve"> from the Vogel correlation [2], whose constants for water reproduce tabulated experimental values [3] to better than 1% over the relevant 15–35 °C range:</w:t>
+      </w:r>
+    </w:p>
+    <w:p>
+      <w:pPr>
+        <w:spacing w:after="80" w:before="80"/>
+        <w:ind w:left="720"/>
+      </w:pPr>
+      <w:r>
+        <w:rPr>
+          <w:rFonts w:ascii="Times New Roman" w:cs="Times New Roman" w:eastAsia="Times New Roman" w:hAnsi="Times New Roman"/>
+          <w:i/>
+          <w:iCs/>
+          <w:sz w:val="22"/>
+          <w:szCs w:val="22"/>
+        </w:rPr>
+        <w:t xml:space="preserve">μ(T) = 2.414 × 10</w:t>
+      </w:r>
+      <w:r>
+        <w:rPr>
+          <w:rFonts w:ascii="Times New Roman" w:cs="Times New Roman" w:eastAsia="Times New Roman" w:hAnsi="Times New Roman"/>
+          <w:sz w:val="22"/>
+          <w:szCs w:val="22"/>
+          <w:vertAlign w:val="superscript"/>
+        </w:rPr>
+        <w:t xml:space="preserve">−5</w:t>
+      </w:r>
+      <w:r>
+        <w:rPr>
+          <w:rFonts w:ascii="Times New Roman" w:cs="Times New Roman" w:eastAsia="Times New Roman" w:hAnsi="Times New Roman"/>
+          <w:i/>
+          <w:iCs/>
+          <w:sz w:val="22"/>
+          <w:szCs w:val="22"/>
+        </w:rPr>
+        <w:t xml:space="preserve"> · 10</w:t>
+      </w:r>
+      <w:r>
+        <w:rPr>
+          <w:rFonts w:ascii="Times New Roman" w:cs="Times New Roman" w:eastAsia="Times New Roman" w:hAnsi="Times New Roman"/>
+          <w:sz w:val="22"/>
+          <w:szCs w:val="22"/>
+          <w:vertAlign w:val="superscript"/>
+        </w:rPr>
+        <w:t xml:space="preserve">247.8/(T − 140)</w:t>
+      </w:r>
+      <w:r>
+        <w:rPr>
+          <w:rFonts w:ascii="Times New Roman" w:cs="Times New Roman" w:eastAsia="Times New Roman" w:hAnsi="Times New Roman"/>
+          <w:sz w:val="22"/>
+          <w:szCs w:val="22"/>
+        </w:rPr>
+        <w:t xml:space="preserve">  Pa·s,  T in K</w:t>
+      </w:r>
+      <w:r>
+        <w:rPr>
+          <w:rFonts w:ascii="Times New Roman" w:cs="Times New Roman" w:eastAsia="Times New Roman" w:hAnsi="Times New Roman"/>
+          <w:sz w:val="22"/>
+          <w:szCs w:val="22"/>
+        </w:rPr>
+        <w:ptab w:alignment="right" w:relativeTo="margin" w:leader="none"/>
+        <w:t xml:space="preserve">(5)</w:t>
+      </w:r>
+    </w:p>
+    <w:p>
+      <w:pPr>
+        <w:spacing w:after="120" w:line="276"/>
+        <w:jc w:val="both"/>
+      </w:pPr>
+      <w:r>
+        <w:rPr>
+          <w:rFonts w:ascii="Times New Roman" w:cs="Times New Roman" w:eastAsia="Times New Roman" w:hAnsi="Times New Roman"/>
+          <w:sz w:val="22"/>
+          <w:szCs w:val="22"/>
+        </w:rPr>
+        <w:t xml:space="preserve">(1.002 mPa·s at 20 °C; 0.890 mPa·s at 25 °C). Because the rig runs with distilled water, the pure-water correlation applies without correction. The structure of Eq. (1) then makes a sharp, testable prediction: warmer water is thinner, so at a given pressure it flows faster and the measured slope </w:t>
+      </w:r>
+      <w:r>
+        <w:rPr>
+          <w:rFonts w:ascii="Times New Roman" w:cs="Times New Roman" w:eastAsia="Times New Roman" w:hAnsi="Times New Roman"/>
+          <w:i/>
+          <w:iCs/>
+          <w:sz w:val="22"/>
+          <w:szCs w:val="22"/>
+        </w:rPr>
+        <w:t xml:space="preserve">b</w:t>
+      </w:r>
+      <w:r>
+        <w:rPr>
+          <w:rFonts w:ascii="Times New Roman" w:cs="Times New Roman" w:eastAsia="Times New Roman" w:hAnsi="Times New Roman"/>
+          <w:sz w:val="22"/>
+          <w:szCs w:val="22"/>
+        </w:rPr>
+        <w:t xml:space="preserve"> grows as 1/</w:t>
+      </w:r>
+      <w:r>
+        <w:rPr>
+          <w:rFonts w:ascii="Times New Roman" w:cs="Times New Roman" w:eastAsia="Times New Roman" w:hAnsi="Times New Roman"/>
+          <w:i/>
+          <w:iCs/>
+          <w:sz w:val="22"/>
+          <w:szCs w:val="22"/>
+        </w:rPr>
+        <w:t xml:space="preserve">μ</w:t>
+      </w:r>
+      <w:r>
+        <w:rPr>
+          <w:rFonts w:ascii="Times New Roman" w:cs="Times New Roman" w:eastAsia="Times New Roman" w:hAnsi="Times New Roman"/>
+          <w:sz w:val="22"/>
+          <w:szCs w:val="22"/>
+        </w:rPr>
+        <w:t xml:space="preserve">; but Eq. (3) multiplies that slope by </w:t>
+      </w:r>
+      <w:r>
+        <w:rPr>
+          <w:rFonts w:ascii="Times New Roman" w:cs="Times New Roman" w:eastAsia="Times New Roman" w:hAnsi="Times New Roman"/>
+          <w:i/>
+          <w:iCs/>
+          <w:sz w:val="22"/>
+          <w:szCs w:val="22"/>
+        </w:rPr>
+        <w:t xml:space="preserve">μ</w:t>
+      </w:r>
+      <w:r>
+        <w:rPr>
+          <w:rFonts w:ascii="Times New Roman" w:cs="Times New Roman" w:eastAsia="Times New Roman" w:hAnsi="Times New Roman"/>
+          <w:sz w:val="22"/>
+          <w:szCs w:val="22"/>
+        </w:rPr>
+        <w:t xml:space="preserve"> again, so the derived k must not change with temperature at all. Permeability is geometry, not fluid. This exact cancellation is exploited in two ways: it makes results taken on different days at different room temperatures directly comparable, and it serves as a physical consistency check of the whole pipeline — if k drifts with temperature, something in the chain (a miscalibrated sensor, a wrong viscosity, a leak) is broken. Section 7.3 verifies the cancellation numerically.</w:t>
+      </w:r>
+    </w:p>
+    <w:p>
+      <w:pPr>
+        <w:spacing w:after="120" w:before="240"/>
+      </w:pPr>
+      <w:r>
+        <w:rPr>
+          <w:rFonts w:ascii="Times New Roman" w:cs="Times New Roman" w:eastAsia="Times New Roman" w:hAnsi="Times New Roman"/>
+          <w:b/>
+          <w:bCs/>
+          <w:sz w:val="24"/>
+          <w:szCs w:val="24"/>
+        </w:rPr>
+        <w:t xml:space="preserve">3. System Description</w:t>
+      </w:r>
+    </w:p>
+    <w:p>
+      <w:pPr>
+        <w:spacing w:after="100" w:before="160"/>
+      </w:pPr>
+      <w:r>
+        <w:rPr>
+          <w:rFonts w:ascii="Times New Roman" w:cs="Times New Roman" w:eastAsia="Times New Roman" w:hAnsi="Times New Roman"/>
+          <w:b/>
+          <w:bCs/>
+          <w:i/>
+          <w:iCs/>
+          <w:sz w:val="22"/>
+          <w:szCs w:val="22"/>
+        </w:rPr>
+        <w:t xml:space="preserve">3.1 Apparatus</w:t>
+      </w:r>
+    </w:p>
+    <w:p>
+      <w:pPr>
+        <w:spacing w:after="120" w:line="276"/>
+        <w:jc w:val="both"/>
+      </w:pPr>
+      <w:r>
+        <w:rPr>
+          <w:rFonts w:ascii="Times New Roman" w:cs="Times New Roman" w:eastAsia="Times New Roman" w:hAnsi="Times New Roman"/>
+          <w:sz w:val="22"/>
+          <w:szCs w:val="22"/>
+        </w:rPr>
+        <w:t xml:space="preserve">The test cell is an existing stainless-steel pressure vessel with the membrane specimen clamped at a bolted mid-plane flange. Compressed air from the laboratory gas panel pressurizes the headspace above a column of distilled water (air-over-water configuration); the pressurized water permeates the membrane and exits through an outlet port. The automation adds five elements to this vessel (Fig. 1): (i) a hobby servomotor (20 kg·cm class) coupled through a 3-D-printed 2:1 reduction to the quarter-turn ball valve on the air inlet; (ii) a ratiometric pressure transducer (0–103.4 kPa, 0.5–4.5 V) teed into the feed line adjacent to the existing analog gauge; (iii) a waterproof DS18B20 digital thermometer immersed in the permeate stream; (iv) a 12 V three-way solenoid valve on the permeate outlet that routes flow either to waste or to the graduated measurement container; and (v) an adjustable mechanical pressure-relief valve on the air side as a hardware overpressure backstop, independent of all software.</w:t>
       </w:r>
     </w:p>
     <w:p>
@@ -294,7 +1154,7 @@
           <w:sz w:val="22"/>
           <w:szCs w:val="22"/>
         </w:rPr>
-        <w:t xml:space="preserve">2.2 Sensing chain</w:t>
+        <w:t xml:space="preserve">3.2 Sensing chain: from diaphragm to kilopascals</w:t>
       </w:r>
     </w:p>
     <w:p>
@@ -308,7 +1168,25 @@
           <w:sz w:val="22"/>
           <w:szCs w:val="22"/>
         </w:rPr>
-        <w:t xml:space="preserve">The Raspberry Pi has no analog inputs, so the transducer signal is digitized by a 16-bit ADS1115 analog-to-digital converter on the I²C bus. Because the sensor output spans 0.5–4.5 V while the converter operates from 3.3 V, the signal first passes through a 10 kΩ/20 kΩ resistive divider; the software inverts the divider and the sensor's linear transfer function to recover pressure. The resulting resolution is approximately 0.005 kPa per count — two orders of magnitude finer than the control requirement — so measurement quality is limited by electrical noise (±0.1–0.3 kPa in practice) rather than quantization. The chain is calibrated by a two-point comparison against the existing analog gauge (atmospheric zero and one pressurized point), which also absorbs supply-rail tolerance in the ratiometric sensor. Water temperature is read over the 1-Wire bus at 0.3 Hz on a dedicated slow thread, and the dynamic viscosity of water is evaluated continuously from the Vogel correlation [2,3]:</w:t>
+        <w:t xml:space="preserve">The Raspberry Pi has no analog inputs, so the transducer signal is digitized by a 16-bit ADS1115 analog-to-digital converter on the I²C bus, sampled at 20 Hz. Two electrical details shape the front end. First, the transducer is </w:t>
+      </w:r>
+      <w:r>
+        <w:rPr>
+          <w:rFonts w:ascii="Times New Roman" w:cs="Times New Roman" w:eastAsia="Times New Roman" w:hAnsi="Times New Roman"/>
+          <w:i/>
+          <w:iCs/>
+          <w:sz w:val="22"/>
+          <w:szCs w:val="22"/>
+        </w:rPr>
+        <w:t xml:space="preserve">ratiometric</w:t>
+      </w:r>
+      <w:r>
+        <w:rPr>
+          <w:rFonts w:ascii="Times New Roman" w:cs="Times New Roman" w:eastAsia="Times New Roman" w:hAnsi="Times New Roman"/>
+          <w:sz w:val="22"/>
+          <w:szCs w:val="22"/>
+        </w:rPr>
+        <w:t xml:space="preserve">: its 0.5–4.5 V output is a fixed fraction of its 5 V supply, so the usable signal spans 4.0 V. Second, the ADS1115 operates from the Pi's 3.3 V rail and must never see the sensor's 4.5 V directly; the signal therefore passes through a 10 kΩ/20 kΩ resistive divider with ratio 20/(10+20) = 0.667, mapping 4.5 V down to 3.0 V. The software simply inverts the whole chain — divider, then the sensor's linear transfer function:</w:t>
       </w:r>
     </w:p>
     <w:p>
@@ -324,45 +1202,26 @@
           <w:sz w:val="22"/>
           <w:szCs w:val="22"/>
         </w:rPr>
-        <w:t xml:space="preserve">μ(T) = 2.414 × 10</w:t>
-      </w:r>
-      <w:r>
-        <w:rPr>
-          <w:rFonts w:ascii="Times New Roman" w:cs="Times New Roman" w:eastAsia="Times New Roman" w:hAnsi="Times New Roman"/>
-          <w:sz w:val="22"/>
-          <w:szCs w:val="22"/>
-          <w:vertAlign w:val="superscript"/>
-        </w:rPr>
-        <w:t xml:space="preserve">−5</w:t>
-      </w:r>
-      <w:r>
-        <w:rPr>
-          <w:rFonts w:ascii="Times New Roman" w:cs="Times New Roman" w:eastAsia="Times New Roman" w:hAnsi="Times New Roman"/>
-          <w:i/>
-          <w:iCs/>
-          <w:sz w:val="22"/>
-          <w:szCs w:val="22"/>
-        </w:rPr>
-        <w:t xml:space="preserve"> · 10</w:t>
-      </w:r>
-      <w:r>
-        <w:rPr>
-          <w:rFonts w:ascii="Times New Roman" w:cs="Times New Roman" w:eastAsia="Times New Roman" w:hAnsi="Times New Roman"/>
-          <w:sz w:val="22"/>
-          <w:szCs w:val="22"/>
-          <w:vertAlign w:val="superscript"/>
-        </w:rPr>
-        <w:t xml:space="preserve">247.8/(T − 140)</w:t>
-      </w:r>
-      <w:r>
-        <w:rPr>
-          <w:rFonts w:ascii="Times New Roman" w:cs="Times New Roman" w:eastAsia="Times New Roman" w:hAnsi="Times New Roman"/>
-          <w:i w:val="false"/>
-          <w:iCs w:val="false"/>
-          <w:sz w:val="22"/>
-          <w:szCs w:val="22"/>
-        </w:rPr>
-        <w:t xml:space="preserve">  Pa·s,  T in K</w:t>
+        <w:t xml:space="preserve">P = 103.4 kPa · ( v</w:t>
+      </w:r>
+      <w:r>
+        <w:rPr>
+          <w:rFonts w:ascii="Times New Roman" w:cs="Times New Roman" w:eastAsia="Times New Roman" w:hAnsi="Times New Roman"/>
+          <w:sz w:val="22"/>
+          <w:szCs w:val="22"/>
+          <w:vertAlign w:val="subscript"/>
+        </w:rPr>
+        <w:t xml:space="preserve">ADC</w:t>
+      </w:r>
+      <w:r>
+        <w:rPr>
+          <w:rFonts w:ascii="Times New Roman" w:cs="Times New Roman" w:eastAsia="Times New Roman" w:hAnsi="Times New Roman"/>
+          <w:i/>
+          <w:iCs/>
+          <w:sz w:val="22"/>
+          <w:szCs w:val="22"/>
+        </w:rPr>
+        <w:t xml:space="preserve"> / 0.667 − 0.5 V ) / 4.0 V</w:t>
       </w:r>
       <w:r>
         <w:rPr>
@@ -371,7 +1230,7 @@
           <w:szCs w:val="22"/>
         </w:rPr>
         <w:ptab w:alignment="right" w:relativeTo="margin" w:leader="none"/>
-        <w:t xml:space="preserve">(1)</w:t>
+        <w:t xml:space="preserve">(6)</w:t>
       </w:r>
     </w:p>
     <w:p>
@@ -385,7 +1244,39 @@
           <w:sz w:val="22"/>
           <w:szCs w:val="22"/>
         </w:rPr>
-        <w:t xml:space="preserve">which reproduces tabulated values to better than 1% over 15–35 °C (1.002 mPa·s at 20 °C; 0.890 mPa·s at 25 °C). Because the rig runs with distilled water, the pure-water correlation applies without correction.</w:t>
+        <w:t xml:space="preserve">A worked example makes the chain concrete: at </w:t>
+      </w:r>
+      <w:r>
+        <w:rPr>
+          <w:rFonts w:ascii="Times New Roman" w:cs="Times New Roman" w:eastAsia="Times New Roman" w:hAnsi="Times New Roman"/>
+          <w:i/>
+          <w:iCs/>
+          <w:sz w:val="22"/>
+          <w:szCs w:val="22"/>
+        </w:rPr>
+        <w:t xml:space="preserve">P</w:t>
+      </w:r>
+      <w:r>
+        <w:rPr>
+          <w:rFonts w:ascii="Times New Roman" w:cs="Times New Roman" w:eastAsia="Times New Roman" w:hAnsi="Times New Roman"/>
+          <w:sz w:val="22"/>
+          <w:szCs w:val="22"/>
+        </w:rPr>
+        <w:t xml:space="preserve"> = 40 kPa the transducer outputs 0.5 + (40/103.4)·4.0 = 2.047 V, the divider presents 1.366 V to the converter, and Eq. (6) recovers 40 kPa. At the converter's ±4.096 V range one count is 125 µV, which projects back through the divider and the 25.85 kPa/V sensor slope to a resolution of ≈0.005 kPa per count — two orders of magnitude finer than the control requirement, so measurement quality is limited by electrical noise (±0.1–0.3 kPa expected in practice) rather than quantization. Calibration is a two-point comparison against the existing analog gauge (atmospheric zero and one pressurized point), which also absorbs the supply-rail tolerance that ratiometric sensors inherit. Equation (6) is deliberately not clamped: an out-of-range voltage extrapolates to an implausible pressure, and it is the safety layer's job — not the driver's — to interpret that (Section 8). In the same spirit, any I²C failure makes the driver return a not-a-number reading flagged unhealthy rather than raise an exception: a sensor fault must never crash the loop that is holding a pressurized vessel.</w:t>
+      </w:r>
+    </w:p>
+    <w:p>
+      <w:pPr>
+        <w:spacing w:after="120" w:line="276"/>
+        <w:jc w:val="both"/>
+      </w:pPr>
+      <w:r>
+        <w:rPr>
+          <w:rFonts w:ascii="Times New Roman" w:cs="Times New Roman" w:eastAsia="Times New Roman" w:hAnsi="Times New Roman"/>
+          <w:sz w:val="22"/>
+          <w:szCs w:val="22"/>
+        </w:rPr>
+        <w:t xml:space="preserve">Water temperature is read over the 1-Wire bus from the DS18B20 probe. One conversion takes ≈750 ms — fifteen control periods — so the probe is polled every 3 s from a dedicated slow thread that never blocks the control loop. Each reading updates the viscosity via Eq. (5) live during the run; the analysis then uses the run-mean temperature. If the probe fails (CRC error, missing device), the reading degrades to the configured manual temperature instead of stopping the test.</w:t>
       </w:r>
     </w:p>
     <w:p>
@@ -402,7 +1293,7 @@
           <w:sz w:val="22"/>
           <w:szCs w:val="22"/>
         </w:rPr>
-        <w:t xml:space="preserve">2.3 Pressure actuation</w:t>
+        <w:t xml:space="preserve">3.3 Actuation chain: from percent to valve angle</w:t>
       </w:r>
     </w:p>
     <w:p>
@@ -416,7 +1307,101 @@
           <w:sz w:val="22"/>
           <w:szCs w:val="22"/>
         </w:rPr>
-        <w:t xml:space="preserve">The controller expresses its output as a normalized 0–100% “pressure authority” command: 0% corresponds to the air valve fully closed (the safe state, in which the vessel self-depressurizes through the membrane) and 100% to fully open. The servo maps this command onto the valve stem angle through calibrated pulse-width endpoints. Ball valves have a strongly nonlinear installed flow characteristic; however, the operating point in this application sits near the closed end of travel, which is the flattest region of the curve, and the control specification is deliberately coarse (Section 6). The regulated variable of record is always the independently measured transducer pressure, not the valve position.</w:t>
+        <w:t xml:space="preserve">The controller expresses its output as a normalized 0–100% </w:t>
+      </w:r>
+      <w:r>
+        <w:rPr>
+          <w:rFonts w:ascii="Times New Roman" w:cs="Times New Roman" w:eastAsia="Times New Roman" w:hAnsi="Times New Roman"/>
+          <w:i/>
+          <w:iCs/>
+          <w:sz w:val="22"/>
+          <w:szCs w:val="22"/>
+        </w:rPr>
+        <w:t xml:space="preserve">pressure authority</w:t>
+      </w:r>
+      <w:r>
+        <w:rPr>
+          <w:rFonts w:ascii="Times New Roman" w:cs="Times New Roman" w:eastAsia="Times New Roman" w:hAnsi="Times New Roman"/>
+          <w:sz w:val="22"/>
+          <w:szCs w:val="22"/>
+        </w:rPr>
+        <w:t xml:space="preserve"> command </w:t>
+      </w:r>
+      <w:r>
+        <w:rPr>
+          <w:rFonts w:ascii="Times New Roman" w:cs="Times New Roman" w:eastAsia="Times New Roman" w:hAnsi="Times New Roman"/>
+          <w:i/>
+          <w:iCs/>
+          <w:sz w:val="22"/>
+          <w:szCs w:val="22"/>
+        </w:rPr>
+        <w:t xml:space="preserve">u</w:t>
+      </w:r>
+      <w:r>
+        <w:rPr>
+          <w:rFonts w:ascii="Times New Roman" w:cs="Times New Roman" w:eastAsia="Times New Roman" w:hAnsi="Times New Roman"/>
+          <w:sz w:val="22"/>
+          <w:szCs w:val="22"/>
+        </w:rPr>
+        <w:t xml:space="preserve">: 0% is the air valve fully closed — the safe state, in which the vessel self-depressurizes through the membrane — and 100% fully open. The servo driver maps this linearly onto pulse width:</w:t>
+      </w:r>
+    </w:p>
+    <w:p>
+      <w:pPr>
+        <w:spacing w:after="80" w:before="80"/>
+        <w:ind w:left="720"/>
+      </w:pPr>
+      <w:r>
+        <w:rPr>
+          <w:rFonts w:ascii="Times New Roman" w:cs="Times New Roman" w:eastAsia="Times New Roman" w:hAnsi="Times New Roman"/>
+          <w:i/>
+          <w:iCs/>
+          <w:sz w:val="22"/>
+          <w:szCs w:val="22"/>
+        </w:rPr>
+        <w:t xml:space="preserve">t</w:t>
+      </w:r>
+      <w:r>
+        <w:rPr>
+          <w:rFonts w:ascii="Times New Roman" w:cs="Times New Roman" w:eastAsia="Times New Roman" w:hAnsi="Times New Roman"/>
+          <w:sz w:val="22"/>
+          <w:szCs w:val="22"/>
+          <w:vertAlign w:val="subscript"/>
+        </w:rPr>
+        <w:t xml:space="preserve">pulse</w:t>
+      </w:r>
+      <w:r>
+        <w:rPr>
+          <w:rFonts w:ascii="Times New Roman" w:cs="Times New Roman" w:eastAsia="Times New Roman" w:hAnsi="Times New Roman"/>
+          <w:i/>
+          <w:iCs/>
+          <w:sz w:val="22"/>
+          <w:szCs w:val="22"/>
+        </w:rPr>
+        <w:t xml:space="preserve"> = 700 + 16 · u   µs</w:t>
+      </w:r>
+      <w:r>
+        <w:rPr>
+          <w:rFonts w:ascii="Times New Roman" w:cs="Times New Roman" w:eastAsia="Times New Roman" w:hAnsi="Times New Roman"/>
+          <w:sz w:val="22"/>
+          <w:szCs w:val="22"/>
+        </w:rPr>
+        <w:ptab w:alignment="right" w:relativeTo="margin" w:leader="none"/>
+        <w:t xml:space="preserve">(7)</w:t>
+      </w:r>
+    </w:p>
+    <w:p>
+      <w:pPr>
+        <w:spacing w:after="120" w:line="276"/>
+        <w:jc w:val="both"/>
+      </w:pPr>
+      <w:r>
+        <w:rPr>
+          <w:rFonts w:ascii="Times New Roman" w:cs="Times New Roman" w:eastAsia="Times New Roman" w:hAnsi="Times New Roman"/>
+          <w:sz w:val="22"/>
+          <w:szCs w:val="22"/>
+        </w:rPr>
+        <w:t xml:space="preserve">i.e., 700 µs at 0% and 2300 µs at 100%, endpoints that are calibrated to the valve's useful travel rather than the servo's mechanical limits (over-driving a stalled servo overheats it). The pulses are generated by the pigpio daemon, which times them by DMA in hardware; software-timed PWM on a multitasking operating system jitters by tens of microseconds, which on a 1600 µs span would translate into visible valve chatter. Two properties of this chain matter for control. First, a ball valve's flow characteristic is strongly nonlinear over its 90° travel, but the operating point here sits near the closed end — the flattest region — and the loop gain was tuned there. Second, and central to the design philosophy: the regulated variable of record is always the independently measured transducer pressure, never the valve position. The valve is merely how the controller pushes; the transducer is what the physics is asked about.</w:t>
       </w:r>
     </w:p>
     <w:p>
@@ -433,7 +1418,7 @@
           <w:sz w:val="22"/>
           <w:szCs w:val="22"/>
         </w:rPr>
-        <w:t xml:space="preserve">2.4 Software architecture</w:t>
+        <w:t xml:space="preserve">3.4 Software architecture</w:t>
       </w:r>
     </w:p>
     <w:p>
@@ -447,121 +1432,7 @@
           <w:sz w:val="22"/>
           <w:szCs w:val="22"/>
         </w:rPr>
-        <w:t xml:space="preserve">The control software (Python 3) is organized in layers that communicate only through explicit interfaces (Fig. 2), a structure chosen so that every layer can be tested without the layers below it:</w:t>
-      </w:r>
-    </w:p>
-    <w:p>
-      <w:pPr>
-        <w:pStyle w:val="ListParagraph"/>
-        <w:numPr>
-          <w:ilvl w:val="0"/>
-          <w:numId w:val="2"/>
-        </w:numPr>
-        <w:spacing w:after="60" w:line="276"/>
-        <w:jc w:val="both"/>
-      </w:pPr>
-      <w:r>
-        <w:rPr>
-          <w:rFonts w:ascii="Times New Roman" w:cs="Times New Roman" w:eastAsia="Times New Roman" w:hAnsi="Times New Roman"/>
-          <w:sz w:val="22"/>
-          <w:szCs w:val="22"/>
-        </w:rPr>
-        <w:t xml:space="preserve">Hardware abstraction layer (HAL). Abstract interfaces — PressureSensor, ProportionalValve, DiverterValve, TemperatureSensor — with two interchangeable implementations each: real drivers (ADS1115 over I²C, hardware-timed servo pulses via the pigpio daemon, GPIO/MOSFET solenoid drive, 1-Wire thermometry) and mock drivers bound to a first-order plant model. Selecting mode: sim in the configuration file runs the complete system, including its user interface, with no hardware attached.</w:t>
-      </w:r>
-    </w:p>
-    <w:p>
-      <w:pPr>
-        <w:pStyle w:val="ListParagraph"/>
-        <w:numPr>
-          <w:ilvl w:val="0"/>
-          <w:numId w:val="2"/>
-        </w:numPr>
-        <w:spacing w:after="60" w:line="276"/>
-        <w:jc w:val="both"/>
-      </w:pPr>
-      <w:r>
-        <w:rPr>
-          <w:rFonts w:ascii="Times New Roman" w:cs="Times New Roman" w:eastAsia="Times New Roman" w:hAnsi="Times New Roman"/>
-          <w:sz w:val="22"/>
-          <w:szCs w:val="22"/>
-        </w:rPr>
-        <w:t xml:space="preserve">Control loop. A 20 Hz thread reads the sensor, evaluates safety, and updates a PID controller with back-calculation anti-windup and derivative-on-measurement [4]. Setpoint changes are applied through a rate-limited ramp so the loop approaches each target from below, which suppresses overshoot and cancels mechanical backlash in the valve transmission.</w:t>
-      </w:r>
-    </w:p>
-    <w:p>
-      <w:pPr>
-        <w:pStyle w:val="ListParagraph"/>
-        <w:numPr>
-          <w:ilvl w:val="0"/>
-          <w:numId w:val="2"/>
-        </w:numPr>
-        <w:spacing w:after="60" w:line="276"/>
-        <w:jc w:val="both"/>
-      </w:pPr>
-      <w:r>
-        <w:rPr>
-          <w:rFonts w:ascii="Times New Roman" w:cs="Times New Roman" w:eastAsia="Times New Roman" w:hAnsi="Times New Roman"/>
-          <w:sz w:val="22"/>
-          <w:szCs w:val="22"/>
-        </w:rPr>
-        <w:t xml:space="preserve">Test sequencer. A finite-state machine executes each test point: STABILIZING (the PID holds the setpoint until the measured pressure remains within a configurable tolerance band for a configurable dwell time), then COLLECTING (the diverter routes permeate to the measurement container for a precisely timed interval while pressure statistics are accumulated over that window only), then advance to the next setpoint. A full sequence of setpoints, e.g. 20/40/60 kPa, runs unattended.</w:t>
-      </w:r>
-    </w:p>
-    <w:p>
-      <w:pPr>
-        <w:pStyle w:val="ListParagraph"/>
-        <w:numPr>
-          <w:ilvl w:val="0"/>
-          <w:numId w:val="2"/>
-        </w:numPr>
-        <w:spacing w:after="60" w:line="276"/>
-        <w:jc w:val="both"/>
-      </w:pPr>
-      <w:r>
-        <w:rPr>
-          <w:rFonts w:ascii="Times New Roman" w:cs="Times New Roman" w:eastAsia="Times New Roman" w:hAnsi="Times New Roman"/>
-          <w:sz w:val="22"/>
-          <w:szCs w:val="22"/>
-        </w:rPr>
-        <w:t xml:space="preserve">Safety supervisor. Evaluated every cycle, independent of test state: overpressure beyond a hard software limit triggers an immediate close-and-abort; sensor readings outside the physically plausible range (e.g. a disconnected transducer reading 0 V) are classified as instrument faults after a three-sample grace period — never as “low pressure,” which would otherwise drive the controller to open the air valve against a dead sensor. Any unhandled exception or shutdown path drives both valves to their safe states.</w:t>
-      </w:r>
-    </w:p>
-    <w:p>
-      <w:pPr>
-        <w:pStyle w:val="ListParagraph"/>
-        <w:numPr>
-          <w:ilvl w:val="0"/>
-          <w:numId w:val="2"/>
-        </w:numPr>
-        <w:spacing w:after="60" w:line="276"/>
-        <w:jc w:val="both"/>
-      </w:pPr>
-      <w:r>
-        <w:rPr>
-          <w:rFonts w:ascii="Times New Roman" w:cs="Times New Roman" w:eastAsia="Times New Roman" w:hAnsi="Times New Roman"/>
-          <w:sz w:val="22"/>
-          <w:szCs w:val="22"/>
-        </w:rPr>
-        <w:t xml:space="preserve">Data layer. Each run writes a timestamped CSV (pressure, setpoint, valve command, diverter state, water temperature at 20 Hz), a JSON metadata record (per-point statistics over the collection windows), and the automated analysis products of Section 3, including a chart image and a native spreadsheet workbook whose embedded trendline remains editable.</w:t>
-      </w:r>
-    </w:p>
-    <w:p>
-      <w:pPr>
-        <w:pStyle w:val="ListParagraph"/>
-        <w:numPr>
-          <w:ilvl w:val="0"/>
-          <w:numId w:val="2"/>
-        </w:numPr>
-        <w:spacing w:after="60" w:line="276"/>
-        <w:jc w:val="both"/>
-      </w:pPr>
-      <w:r>
-        <w:rPr>
-          <w:rFonts w:ascii="Times New Roman" w:cs="Times New Roman" w:eastAsia="Times New Roman" w:hAnsi="Times New Roman"/>
-          <w:sz w:val="22"/>
-          <w:szCs w:val="22"/>
-        </w:rPr>
-        <w:t xml:space="preserve">User interface. A web application served by the Pi itself; any browser on the network (laptop or phone) provides live pressure/temperature display, parameter entry (setpoints, tolerance, dwell, collection time, PID gains — all without code changes), start/stop control, and a history panel of all stored runs with one-click download of each run's data products. For off-network operation the interface is published through an authenticated outbound tunnel, so no inbound firewall ports are required.</w:t>
+        <w:t xml:space="preserve">The control software (Python 3) is organized in strict layers that communicate only through explicit interfaces (Fig. 2). The foundation is a hardware abstraction layer (HAL): four small abstract contracts — PressureSensor, ProportionalValve, DiverterValve, TemperatureSensor — each with two interchangeable implementations. The real drivers speak I²C, DMA-timed servo pulses, GPIO/MOSFET solenoid drive, and 1-Wire thermometry; the mock drivers bind to a first-order simulated plant (Section 7.1). A single configuration line, mode: sim, swaps one set for the other, and nothing above the HAL can tell the difference — the identical control loop, sequencer, safety supervisor, analysis pipeline, and web interface run against the simulation. This is what made it possible to validate the entire instrument before its hardware existed. Above the HAL sit the application layer (control loop, test sequencer, safety supervisor, data logger — Sections 4, 5, 8), the analysis layer (Section 6), and the user interface layer (Section 9). Every tunable quantity — setpoints, gains, timings, limits, geometry, pin assignments — lives in one human-readable configuration file; characterizing a new membrane requires editing zero lines of code.</w:t>
       </w:r>
     </w:p>
     <w:p>
@@ -628,37 +1499,6 @@
     </w:p>
     <w:p>
       <w:pPr>
-        <w:spacing w:after="100" w:before="160"/>
-      </w:pPr>
-      <w:r>
-        <w:rPr>
-          <w:rFonts w:ascii="Times New Roman" w:cs="Times New Roman" w:eastAsia="Times New Roman" w:hAnsi="Times New Roman"/>
-          <w:b/>
-          <w:bCs/>
-          <w:i/>
-          <w:iCs/>
-          <w:sz w:val="22"/>
-          <w:szCs w:val="22"/>
-        </w:rPr>
-        <w:t xml:space="preserve">2.5 Automated collection and flow measurement</w:t>
-      </w:r>
-    </w:p>
-    <w:p>
-      <w:pPr>
-        <w:spacing w:after="120" w:line="276"/>
-        <w:jc w:val="both"/>
-      </w:pPr>
-      <w:r>
-        <w:rPr>
-          <w:rFonts w:ascii="Times New Roman" w:cs="Times New Roman" w:eastAsia="Times New Roman" w:hAnsi="Times New Roman"/>
-          <w:sz w:val="22"/>
-          <w:szCs w:val="22"/>
-        </w:rPr>
-        <w:t xml:space="preserve">The three-way diverter replaces both the stopwatch and the manual hose transfer. During stabilization the permeate is routed to waste; the instant the sequencer enters COLLECTING, the solenoid switches the stream into the graduated container and the software clock — not an operator — defines the collection interval. The collected volume is read from the graduated container and entered by the operator at the end of the sequence (the single remaining manual step), and the flow rate follows as Q = V/t with t known to software precision.</w:t>
-      </w:r>
-    </w:p>
-    <w:p>
-      <w:pPr>
         <w:spacing w:after="120" w:before="240"/>
       </w:pPr>
       <w:r>
@@ -669,7 +1509,7 @@
           <w:sz w:val="24"/>
           <w:szCs w:val="24"/>
         </w:rPr>
-        <w:t xml:space="preserve">3. Automated Data Analysis</w:t>
+        <w:t xml:space="preserve">4. The Control System</w:t>
       </w:r>
     </w:p>
     <w:p>
@@ -683,7 +1523,100 @@
           <w:sz w:val="22"/>
           <w:szCs w:val="22"/>
         </w:rPr>
-        <w:t xml:space="preserve">For each completed sequence the system fits the measured flow rates against the measured mean pressures of the corresponding collection windows by ordinary least squares:</w:t>
+        <w:t xml:space="preserve">Figure 3 shows the closed loop. This section explains each element and why it is there, working from the physics of the vessel inward to the discrete control law.</w:t>
+      </w:r>
+    </w:p>
+    <w:p>
+      <w:pPr>
+        <w:spacing w:after="60" w:before="160"/>
+        <w:jc w:val="center"/>
+      </w:pPr>
+      <w:r>
+        <w:drawing>
+          <wp:inline distT="0" distB="0" distL="0" distR="0">
+            <wp:extent cx="5905500" cy="2857500"/>
+            <wp:effectExtent t="0" r="0" b="0" l="0"/>
+            <wp:docPr id="1" name="" descr="" title=""/>
+            <wp:cNvGraphicFramePr>
+              <a:graphicFrameLocks xmlns:a="http://schemas.openxmlformats.org/drawingml/2006/main" noChangeAspect="1"/>
+            </wp:cNvGraphicFramePr>
+            <a:graphic xmlns:a="http://schemas.openxmlformats.org/drawingml/2006/main">
+              <a:graphicData uri="http://schemas.openxmlformats.org/drawingml/2006/picture">
+                <pic:pic xmlns:pic="http://schemas.openxmlformats.org/drawingml/2006/picture">
+                  <pic:nvPicPr>
+                    <pic:cNvPr id="0" name="" descr=""/>
+                    <pic:cNvPicPr>
+                      <a:picLocks noChangeAspect="1" noChangeArrowheads="1"/>
+                    </pic:cNvPicPr>
+                  </pic:nvPicPr>
+                  <pic:blipFill>
+                    <a:blip r:embed="rId9" cstate="none"/>
+                    <a:srcRect/>
+                    <a:stretch>
+                      <a:fillRect/>
+                    </a:stretch>
+                  </pic:blipFill>
+                  <pic:spPr bwMode="auto">
+                    <a:xfrm>
+                      <a:off x="0" y="0"/>
+                      <a:ext cx="5905500" cy="2857500"/>
+                    </a:xfrm>
+                    <a:prstGeom prst="rect">
+                      <a:avLst/>
+                    </a:prstGeom>
+                  </pic:spPr>
+                </pic:pic>
+              </a:graphicData>
+            </a:graphic>
+          </wp:inline>
+        </w:drawing>
+      </w:r>
+    </w:p>
+    <w:p>
+      <w:pPr>
+        <w:spacing w:after="200" w:before="80"/>
+        <w:jc w:val="center"/>
+      </w:pPr>
+      <w:r>
+        <w:rPr>
+          <w:rFonts w:ascii="Times New Roman" w:cs="Times New Roman" w:eastAsia="Times New Roman" w:hAnsi="Times New Roman"/>
+          <w:i/>
+          <w:iCs/>
+          <w:sz w:val="20"/>
+          <w:szCs w:val="20"/>
+        </w:rPr>
+        <w:t xml:space="preserve">Figure 3. Closed-loop structure as implemented. The PID runs at 20 Hz; the supply wobble is the disturbance the loop must reject; the anti-windup path drains the integrator whenever the output clamp is active.</w:t>
+      </w:r>
+    </w:p>
+    <w:p>
+      <w:pPr>
+        <w:spacing w:after="100" w:before="160"/>
+      </w:pPr>
+      <w:r>
+        <w:rPr>
+          <w:rFonts w:ascii="Times New Roman" w:cs="Times New Roman" w:eastAsia="Times New Roman" w:hAnsi="Times New Roman"/>
+          <w:b/>
+          <w:bCs/>
+          <w:i/>
+          <w:iCs/>
+          <w:sz w:val="22"/>
+          <w:szCs w:val="22"/>
+        </w:rPr>
+        <w:t xml:space="preserve">4.1 Plant dynamics: what the controller is fighting</w:t>
+      </w:r>
+    </w:p>
+    <w:p>
+      <w:pPr>
+        <w:spacing w:after="120" w:line="276"/>
+        <w:jc w:val="both"/>
+      </w:pPr>
+      <w:r>
+        <w:rPr>
+          <w:rFonts w:ascii="Times New Roman" w:cs="Times New Roman" w:eastAsia="Times New Roman" w:hAnsi="Times New Roman"/>
+          <w:sz w:val="22"/>
+          <w:szCs w:val="22"/>
+        </w:rPr>
+        <w:t xml:space="preserve">The vessel's pressure dynamics are well approximated by a first-order balance between inflow through the air valve and outflow through the membrane:</w:t>
       </w:r>
     </w:p>
     <w:p>
@@ -699,7 +1632,64 @@
           <w:sz w:val="22"/>
           <w:szCs w:val="22"/>
         </w:rPr>
-        <w:t xml:space="preserve">Q = a + b · ΔP</w:t>
+        <w:t xml:space="preserve">dP/dt = k</w:t>
+      </w:r>
+      <w:r>
+        <w:rPr>
+          <w:rFonts w:ascii="Times New Roman" w:cs="Times New Roman" w:eastAsia="Times New Roman" w:hAnsi="Times New Roman"/>
+          <w:sz w:val="22"/>
+          <w:szCs w:val="22"/>
+          <w:vertAlign w:val="subscript"/>
+        </w:rPr>
+        <w:t xml:space="preserve">in</w:t>
+      </w:r>
+      <w:r>
+        <w:rPr>
+          <w:rFonts w:ascii="Times New Roman" w:cs="Times New Roman" w:eastAsia="Times New Roman" w:hAnsi="Times New Roman"/>
+          <w:i/>
+          <w:iCs/>
+          <w:sz w:val="22"/>
+          <w:szCs w:val="22"/>
+        </w:rPr>
+        <w:t xml:space="preserve"> · (u/100) · (P</w:t>
+      </w:r>
+      <w:r>
+        <w:rPr>
+          <w:rFonts w:ascii="Times New Roman" w:cs="Times New Roman" w:eastAsia="Times New Roman" w:hAnsi="Times New Roman"/>
+          <w:sz w:val="22"/>
+          <w:szCs w:val="22"/>
+          <w:vertAlign w:val="subscript"/>
+        </w:rPr>
+        <w:t xml:space="preserve">s</w:t>
+      </w:r>
+      <w:r>
+        <w:rPr>
+          <w:rFonts w:ascii="Times New Roman" w:cs="Times New Roman" w:eastAsia="Times New Roman" w:hAnsi="Times New Roman"/>
+          <w:i/>
+          <w:iCs/>
+          <w:sz w:val="22"/>
+          <w:szCs w:val="22"/>
+        </w:rPr>
+        <w:t xml:space="preserve">(t) − P)  −  k</w:t>
+      </w:r>
+      <w:r>
+        <w:rPr>
+          <w:rFonts w:ascii="Times New Roman" w:cs="Times New Roman" w:eastAsia="Times New Roman" w:hAnsi="Times New Roman"/>
+          <w:sz w:val="22"/>
+          <w:szCs w:val="22"/>
+          <w:vertAlign w:val="subscript"/>
+        </w:rPr>
+        <w:t xml:space="preserve">drain</w:t>
+      </w:r>
+      <w:r>
+        <w:rPr>
+          <w:rFonts w:ascii="Times New Roman" w:cs="Times New Roman" w:eastAsia="Times New Roman" w:hAnsi="Times New Roman"/>
+          <w:i/>
+          <w:iCs/>
+          <w:sz w:val="22"/>
+          <w:szCs w:val="22"/>
+        </w:rPr>
+        <w:t xml:space="preserve"> · P</w:t>
       </w:r>
       <w:r>
         <w:rPr>
@@ -708,7 +1698,7 @@
           <w:szCs w:val="22"/>
         </w:rPr>
         <w:ptab w:alignment="right" w:relativeTo="margin" w:leader="none"/>
-        <w:t xml:space="preserve">(2)</w:t>
+        <w:t xml:space="preserve">(8)</w:t>
       </w:r>
     </w:p>
     <w:p>
@@ -722,7 +1712,211 @@
           <w:sz w:val="22"/>
           <w:szCs w:val="22"/>
         </w:rPr>
-        <w:t xml:space="preserve">and derives the Darcy permeability from the slope, rather than from any individual point:</w:t>
+        <w:t xml:space="preserve">where </w:t>
+      </w:r>
+      <w:r>
+        <w:rPr>
+          <w:rFonts w:ascii="Times New Roman" w:cs="Times New Roman" w:eastAsia="Times New Roman" w:hAnsi="Times New Roman"/>
+          <w:i/>
+          <w:iCs/>
+          <w:sz w:val="22"/>
+          <w:szCs w:val="22"/>
+        </w:rPr>
+        <w:t xml:space="preserve">P</w:t>
+      </w:r>
+      <w:r>
+        <w:rPr>
+          <w:rFonts w:ascii="Times New Roman" w:cs="Times New Roman" w:eastAsia="Times New Roman" w:hAnsi="Times New Roman"/>
+          <w:sz w:val="22"/>
+          <w:szCs w:val="22"/>
+          <w:vertAlign w:val="subscript"/>
+        </w:rPr>
+        <w:t xml:space="preserve">s</w:t>
+      </w:r>
+      <w:r>
+        <w:rPr>
+          <w:rFonts w:ascii="Times New Roman" w:cs="Times New Roman" w:eastAsia="Times New Roman" w:hAnsi="Times New Roman"/>
+          <w:i/>
+          <w:iCs/>
+          <w:sz w:val="22"/>
+          <w:szCs w:val="22"/>
+        </w:rPr>
+        <w:t xml:space="preserve">(t)</w:t>
+      </w:r>
+      <w:r>
+        <w:rPr>
+          <w:rFonts w:ascii="Times New Roman" w:cs="Times New Roman" w:eastAsia="Times New Roman" w:hAnsi="Times New Roman"/>
+          <w:sz w:val="22"/>
+          <w:szCs w:val="22"/>
+        </w:rPr>
+        <w:t xml:space="preserve"> is the supply pressure and the two rate constants encode the valve's admittance and the membrane's permeation. Two features of Eq. (8) drove design decisions well beyond the controller gains. First, the plant is </w:t>
+      </w:r>
+      <w:r>
+        <w:rPr>
+          <w:rFonts w:ascii="Times New Roman" w:cs="Times New Roman" w:eastAsia="Times New Roman" w:hAnsi="Times New Roman"/>
+          <w:i/>
+          <w:iCs/>
+          <w:sz w:val="22"/>
+          <w:szCs w:val="22"/>
+        </w:rPr>
+        <w:t xml:space="preserve">asymmetric</w:t>
+      </w:r>
+      <w:r>
+        <w:rPr>
+          <w:rFonts w:ascii="Times New Roman" w:cs="Times New Roman" w:eastAsia="Times New Roman" w:hAnsi="Times New Roman"/>
+          <w:sz w:val="22"/>
+          <w:szCs w:val="22"/>
+        </w:rPr>
+        <w:t xml:space="preserve">: with the valve open the vessel fills within seconds, but with the valve closed it can only drain through the membrane, with a time constant 1/</w:t>
+      </w:r>
+      <w:r>
+        <w:rPr>
+          <w:rFonts w:ascii="Times New Roman" w:cs="Times New Roman" w:eastAsia="Times New Roman" w:hAnsi="Times New Roman"/>
+          <w:i/>
+          <w:iCs/>
+          <w:sz w:val="22"/>
+          <w:szCs w:val="22"/>
+        </w:rPr>
+        <w:t xml:space="preserve">k</w:t>
+      </w:r>
+      <w:r>
+        <w:rPr>
+          <w:rFonts w:ascii="Times New Roman" w:cs="Times New Roman" w:eastAsia="Times New Roman" w:hAnsi="Times New Roman"/>
+          <w:sz w:val="22"/>
+          <w:szCs w:val="22"/>
+          <w:vertAlign w:val="subscript"/>
+        </w:rPr>
+        <w:t xml:space="preserve">drain</w:t>
+      </w:r>
+      <w:r>
+        <w:rPr>
+          <w:rFonts w:ascii="Times New Roman" w:cs="Times New Roman" w:eastAsia="Times New Roman" w:hAnsi="Times New Roman"/>
+          <w:sz w:val="22"/>
+          <w:szCs w:val="22"/>
+        </w:rPr>
+        <w:t xml:space="preserve"> of roughly 20 s. Overshoot is therefore cheap to cause and expensive to undo — which motivates both the setpoint ramp (Section 4.3) and the sequencer's policy of visiting setpoints in ascending order, so the slow draining direction is never on the critical path. Second, the supply is not constant: compressor cycling is modeled as a sinusoidal wobble </w:t>
+      </w:r>
+      <w:r>
+        <w:rPr>
+          <w:rFonts w:ascii="Times New Roman" w:cs="Times New Roman" w:eastAsia="Times New Roman" w:hAnsi="Times New Roman"/>
+          <w:i/>
+          <w:iCs/>
+          <w:sz w:val="22"/>
+          <w:szCs w:val="22"/>
+        </w:rPr>
+        <w:t xml:space="preserve">P</w:t>
+      </w:r>
+      <w:r>
+        <w:rPr>
+          <w:rFonts w:ascii="Times New Roman" w:cs="Times New Roman" w:eastAsia="Times New Roman" w:hAnsi="Times New Roman"/>
+          <w:sz w:val="22"/>
+          <w:szCs w:val="22"/>
+          <w:vertAlign w:val="subscript"/>
+        </w:rPr>
+        <w:t xml:space="preserve">s</w:t>
+      </w:r>
+      <w:r>
+        <w:rPr>
+          <w:rFonts w:ascii="Times New Roman" w:cs="Times New Roman" w:eastAsia="Times New Roman" w:hAnsi="Times New Roman"/>
+          <w:i/>
+          <w:iCs/>
+          <w:sz w:val="22"/>
+          <w:szCs w:val="22"/>
+        </w:rPr>
+        <w:t xml:space="preserve">(t)</w:t>
+      </w:r>
+      <w:r>
+        <w:rPr>
+          <w:rFonts w:ascii="Times New Roman" w:cs="Times New Roman" w:eastAsia="Times New Roman" w:hAnsi="Times New Roman"/>
+          <w:sz w:val="22"/>
+          <w:szCs w:val="22"/>
+        </w:rPr>
+        <w:t xml:space="preserve"> = 100 + 8·sin(2π</w:t>
+      </w:r>
+      <w:r>
+        <w:rPr>
+          <w:rFonts w:ascii="Times New Roman" w:cs="Times New Roman" w:eastAsia="Times New Roman" w:hAnsi="Times New Roman"/>
+          <w:i/>
+          <w:iCs/>
+          <w:sz w:val="22"/>
+          <w:szCs w:val="22"/>
+        </w:rPr>
+        <w:t xml:space="preserve">t</w:t>
+      </w:r>
+      <w:r>
+        <w:rPr>
+          <w:rFonts w:ascii="Times New Roman" w:cs="Times New Roman" w:eastAsia="Times New Roman" w:hAnsi="Times New Roman"/>
+          <w:sz w:val="22"/>
+          <w:szCs w:val="22"/>
+        </w:rPr>
+        <w:t xml:space="preserve">/25 s) kPa. This is the disturbance the loop exists to reject, and the simulation deliberately makes it worse than the bench is expected to be.</w:t>
+      </w:r>
+    </w:p>
+    <w:p>
+      <w:pPr>
+        <w:spacing w:after="100" w:before="160"/>
+      </w:pPr>
+      <w:r>
+        <w:rPr>
+          <w:rFonts w:ascii="Times New Roman" w:cs="Times New Roman" w:eastAsia="Times New Roman" w:hAnsi="Times New Roman"/>
+          <w:b/>
+          <w:bCs/>
+          <w:i/>
+          <w:iCs/>
+          <w:sz w:val="22"/>
+          <w:szCs w:val="22"/>
+        </w:rPr>
+        <w:t xml:space="preserve">4.2 The discrete control law, term by term</w:t>
+      </w:r>
+    </w:p>
+    <w:p>
+      <w:pPr>
+        <w:spacing w:after="120" w:line="276"/>
+        <w:jc w:val="both"/>
+      </w:pPr>
+      <w:r>
+        <w:rPr>
+          <w:rFonts w:ascii="Times New Roman" w:cs="Times New Roman" w:eastAsia="Times New Roman" w:hAnsi="Times New Roman"/>
+          <w:sz w:val="22"/>
+          <w:szCs w:val="22"/>
+        </w:rPr>
+        <w:t xml:space="preserve">Every 50 ms the loop computes the error between the (ramped) target </w:t>
+      </w:r>
+      <w:r>
+        <w:rPr>
+          <w:rFonts w:ascii="Times New Roman" w:cs="Times New Roman" w:eastAsia="Times New Roman" w:hAnsi="Times New Roman"/>
+          <w:i/>
+          <w:iCs/>
+          <w:sz w:val="22"/>
+          <w:szCs w:val="22"/>
+        </w:rPr>
+        <w:t xml:space="preserve">r</w:t>
+      </w:r>
+      <w:r>
+        <w:rPr>
+          <w:rFonts w:ascii="Times New Roman" w:cs="Times New Roman" w:eastAsia="Times New Roman" w:hAnsi="Times New Roman"/>
+          <w:sz w:val="22"/>
+          <w:szCs w:val="22"/>
+        </w:rPr>
+        <w:t xml:space="preserve"> and the measured pressure </w:t>
+      </w:r>
+      <w:r>
+        <w:rPr>
+          <w:rFonts w:ascii="Times New Roman" w:cs="Times New Roman" w:eastAsia="Times New Roman" w:hAnsi="Times New Roman"/>
+          <w:i/>
+          <w:iCs/>
+          <w:sz w:val="22"/>
+          <w:szCs w:val="22"/>
+        </w:rPr>
+        <w:t xml:space="preserve">ŷ</w:t>
+      </w:r>
+      <w:r>
+        <w:rPr>
+          <w:rFonts w:ascii="Times New Roman" w:cs="Times New Roman" w:eastAsia="Times New Roman" w:hAnsi="Times New Roman"/>
+          <w:sz w:val="22"/>
+          <w:szCs w:val="22"/>
+        </w:rPr>
+        <w:t xml:space="preserve">, and updates three terms:</w:t>
       </w:r>
     </w:p>
     <w:p>
@@ -738,26 +1932,7 @@
           <w:sz w:val="22"/>
           <w:szCs w:val="22"/>
         </w:rPr>
-        <w:t xml:space="preserve">k = b</w:t>
-      </w:r>
-      <w:r>
-        <w:rPr>
-          <w:rFonts w:ascii="Times New Roman" w:cs="Times New Roman" w:eastAsia="Times New Roman" w:hAnsi="Times New Roman"/>
-          <w:sz w:val="22"/>
-          <w:szCs w:val="22"/>
-          <w:vertAlign w:val="subscript"/>
-        </w:rPr>
-        <w:t xml:space="preserve">Pa</w:t>
-      </w:r>
-      <w:r>
-        <w:rPr>
-          <w:rFonts w:ascii="Times New Roman" w:cs="Times New Roman" w:eastAsia="Times New Roman" w:hAnsi="Times New Roman"/>
-          <w:i/>
-          <w:iCs/>
-          <w:sz w:val="22"/>
-          <w:szCs w:val="22"/>
-        </w:rPr>
-        <w:t xml:space="preserve"> · μ · L / A</w:t>
+        <w:t xml:space="preserve">e[n] = r[n] − ŷ[n]</w:t>
       </w:r>
       <w:r>
         <w:rPr>
@@ -766,7 +1941,7 @@
           <w:szCs w:val="22"/>
         </w:rPr>
         <w:ptab w:alignment="right" w:relativeTo="margin" w:leader="none"/>
-        <w:t xml:space="preserve">(3)</w:t>
+        <w:t xml:space="preserve">(9)</w:t>
       </w:r>
     </w:p>
     <w:p>
@@ -782,26 +1957,133 @@
           <w:sz w:val="22"/>
           <w:szCs w:val="22"/>
         </w:rPr>
+        <w:t xml:space="preserve">I[n] = I[n−1] + K</w:t>
+      </w:r>
+      <w:r>
+        <w:rPr>
+          <w:rFonts w:ascii="Times New Roman" w:cs="Times New Roman" w:eastAsia="Times New Roman" w:hAnsi="Times New Roman"/>
+          <w:sz w:val="22"/>
+          <w:szCs w:val="22"/>
+          <w:vertAlign w:val="subscript"/>
+        </w:rPr>
+        <w:t xml:space="preserve">i</w:t>
+      </w:r>
+      <w:r>
+        <w:rPr>
+          <w:rFonts w:ascii="Times New Roman" w:cs="Times New Roman" w:eastAsia="Times New Roman" w:hAnsi="Times New Roman"/>
+          <w:i/>
+          <w:iCs/>
+          <w:sz w:val="22"/>
+          <w:szCs w:val="22"/>
+        </w:rPr>
+        <w:t xml:space="preserve"> · e[n] · Δt</w:t>
+      </w:r>
+      <w:r>
+        <w:rPr>
+          <w:rFonts w:ascii="Times New Roman" w:cs="Times New Roman" w:eastAsia="Times New Roman" w:hAnsi="Times New Roman"/>
+          <w:sz w:val="22"/>
+          <w:szCs w:val="22"/>
+        </w:rPr>
+        <w:ptab w:alignment="right" w:relativeTo="margin" w:leader="none"/>
+        <w:t xml:space="preserve">(10)</w:t>
+      </w:r>
+    </w:p>
+    <w:p>
+      <w:pPr>
+        <w:spacing w:after="80" w:before="80"/>
+        <w:ind w:left="720"/>
+      </w:pPr>
+      <w:r>
+        <w:rPr>
+          <w:rFonts w:ascii="Times New Roman" w:cs="Times New Roman" w:eastAsia="Times New Roman" w:hAnsi="Times New Roman"/>
+          <w:i/>
+          <w:iCs/>
+          <w:sz w:val="22"/>
+          <w:szCs w:val="22"/>
+        </w:rPr>
+        <w:t xml:space="preserve">ṙ[n] = ṙ[n−1] + α · ( (ŷ[n] − ŷ[n−1])/Δt − ṙ[n−1] ),   α = Δt/(τ</w:t>
+      </w:r>
+      <w:r>
+        <w:rPr>
+          <w:rFonts w:ascii="Times New Roman" w:cs="Times New Roman" w:eastAsia="Times New Roman" w:hAnsi="Times New Roman"/>
+          <w:sz w:val="22"/>
+          <w:szCs w:val="22"/>
+          <w:vertAlign w:val="subscript"/>
+        </w:rPr>
         <w:t xml:space="preserve">d</w:t>
       </w:r>
       <w:r>
         <w:rPr>
           <w:rFonts w:ascii="Times New Roman" w:cs="Times New Roman" w:eastAsia="Times New Roman" w:hAnsi="Times New Roman"/>
+          <w:i/>
+          <w:iCs/>
+          <w:sz w:val="22"/>
+          <w:szCs w:val="22"/>
+        </w:rPr>
+        <w:t xml:space="preserve"> + Δt)</w:t>
+      </w:r>
+      <w:r>
+        <w:rPr>
+          <w:rFonts w:ascii="Times New Roman" w:cs="Times New Roman" w:eastAsia="Times New Roman" w:hAnsi="Times New Roman"/>
+          <w:sz w:val="22"/>
+          <w:szCs w:val="22"/>
+        </w:rPr>
+        <w:ptab w:alignment="right" w:relativeTo="margin" w:leader="none"/>
+        <w:t xml:space="preserve">(11)</w:t>
+      </w:r>
+    </w:p>
+    <w:p>
+      <w:pPr>
+        <w:spacing w:after="80" w:before="80"/>
+        <w:ind w:left="720"/>
+      </w:pPr>
+      <w:r>
+        <w:rPr>
+          <w:rFonts w:ascii="Times New Roman" w:cs="Times New Roman" w:eastAsia="Times New Roman" w:hAnsi="Times New Roman"/>
+          <w:i/>
+          <w:iCs/>
+          <w:sz w:val="22"/>
+          <w:szCs w:val="22"/>
+        </w:rPr>
+        <w:t xml:space="preserve">u[n] = clamp( K</w:t>
+      </w:r>
+      <w:r>
+        <w:rPr>
+          <w:rFonts w:ascii="Times New Roman" w:cs="Times New Roman" w:eastAsia="Times New Roman" w:hAnsi="Times New Roman"/>
           <w:sz w:val="22"/>
           <w:szCs w:val="22"/>
           <w:vertAlign w:val="subscript"/>
         </w:rPr>
-        <w:t xml:space="preserve">h</w:t>
-      </w:r>
-      <w:r>
-        <w:rPr>
-          <w:rFonts w:ascii="Times New Roman" w:cs="Times New Roman" w:eastAsia="Times New Roman" w:hAnsi="Times New Roman"/>
-          <w:i/>
-          <w:iCs/>
-          <w:sz w:val="22"/>
-          <w:szCs w:val="22"/>
-        </w:rPr>
-        <w:t xml:space="preserve"> = √(32 k)</w:t>
+        <w:t xml:space="preserve">p</w:t>
+      </w:r>
+      <w:r>
+        <w:rPr>
+          <w:rFonts w:ascii="Times New Roman" w:cs="Times New Roman" w:eastAsia="Times New Roman" w:hAnsi="Times New Roman"/>
+          <w:i/>
+          <w:iCs/>
+          <w:sz w:val="22"/>
+          <w:szCs w:val="22"/>
+        </w:rPr>
+        <w:t xml:space="preserve">·e[n] + I[n] − K</w:t>
+      </w:r>
+      <w:r>
+        <w:rPr>
+          <w:rFonts w:ascii="Times New Roman" w:cs="Times New Roman" w:eastAsia="Times New Roman" w:hAnsi="Times New Roman"/>
+          <w:sz w:val="22"/>
+          <w:szCs w:val="22"/>
+          <w:vertAlign w:val="subscript"/>
+        </w:rPr>
+        <w:t xml:space="preserve">d</w:t>
+      </w:r>
+      <w:r>
+        <w:rPr>
+          <w:rFonts w:ascii="Times New Roman" w:cs="Times New Roman" w:eastAsia="Times New Roman" w:hAnsi="Times New Roman"/>
+          <w:i/>
+          <w:iCs/>
+          <w:sz w:val="22"/>
+          <w:szCs w:val="22"/>
+        </w:rPr>
+        <w:t xml:space="preserve">·ṙ[n],  0,  100 )</w:t>
       </w:r>
       <w:r>
         <w:rPr>
@@ -810,7 +2092,7 @@
           <w:szCs w:val="22"/>
         </w:rPr>
         <w:ptab w:alignment="right" w:relativeTo="margin" w:leader="none"/>
-        <w:t xml:space="preserve">(4)</w:t>
+        <w:t xml:space="preserve">(12)</w:t>
       </w:r>
     </w:p>
     <w:p>
@@ -824,17 +2106,17 @@
           <w:sz w:val="22"/>
           <w:szCs w:val="22"/>
         </w:rPr>
-        <w:t xml:space="preserve">where </w:t>
-      </w:r>
-      <w:r>
-        <w:rPr>
-          <w:rFonts w:ascii="Times New Roman" w:cs="Times New Roman" w:eastAsia="Times New Roman" w:hAnsi="Times New Roman"/>
-          <w:i/>
-          <w:iCs/>
-          <w:sz w:val="22"/>
-          <w:szCs w:val="22"/>
-        </w:rPr>
-        <w:t xml:space="preserve">b</w:t>
+        <w:t xml:space="preserve">with gains </w:t>
+      </w:r>
+      <w:r>
+        <w:rPr>
+          <w:rFonts w:ascii="Times New Roman" w:cs="Times New Roman" w:eastAsia="Times New Roman" w:hAnsi="Times New Roman"/>
+          <w:i/>
+          <w:iCs/>
+          <w:sz w:val="22"/>
+          <w:szCs w:val="22"/>
+        </w:rPr>
+        <w:t xml:space="preserve">K</w:t>
       </w:r>
       <w:r>
         <w:rPr>
@@ -843,77 +2125,59 @@
           <w:szCs w:val="22"/>
           <w:vertAlign w:val="subscript"/>
         </w:rPr>
-        <w:t xml:space="preserve">Pa</w:t>
-      </w:r>
-      <w:r>
-        <w:rPr>
-          <w:rFonts w:ascii="Times New Roman" w:cs="Times New Roman" w:eastAsia="Times New Roman" w:hAnsi="Times New Roman"/>
-          <w:sz w:val="22"/>
-          <w:szCs w:val="22"/>
-        </w:rPr>
-        <w:t xml:space="preserve"> is the fitted slope converted to SI pressure units, </w:t>
-      </w:r>
-      <w:r>
-        <w:rPr>
-          <w:rFonts w:ascii="Times New Roman" w:cs="Times New Roman" w:eastAsia="Times New Roman" w:hAnsi="Times New Roman"/>
-          <w:i/>
-          <w:iCs/>
-          <w:sz w:val="22"/>
-          <w:szCs w:val="22"/>
-        </w:rPr>
-        <w:t xml:space="preserve">μ</w:t>
-      </w:r>
-      <w:r>
-        <w:rPr>
-          <w:rFonts w:ascii="Times New Roman" w:cs="Times New Roman" w:eastAsia="Times New Roman" w:hAnsi="Times New Roman"/>
-          <w:sz w:val="22"/>
-          <w:szCs w:val="22"/>
-        </w:rPr>
-        <w:t xml:space="preserve"> the viscosity evaluated at the run-mean measured water temperature, </w:t>
-      </w:r>
-      <w:r>
-        <w:rPr>
-          <w:rFonts w:ascii="Times New Roman" w:cs="Times New Roman" w:eastAsia="Times New Roman" w:hAnsi="Times New Roman"/>
-          <w:i/>
-          <w:iCs/>
-          <w:sz w:val="22"/>
-          <w:szCs w:val="22"/>
-        </w:rPr>
-        <w:t xml:space="preserve">L</w:t>
-      </w:r>
-      <w:r>
-        <w:rPr>
-          <w:rFonts w:ascii="Times New Roman" w:cs="Times New Roman" w:eastAsia="Times New Roman" w:hAnsi="Times New Roman"/>
-          <w:sz w:val="22"/>
-          <w:szCs w:val="22"/>
-        </w:rPr>
-        <w:t xml:space="preserve"> the membrane thickness, </w:t>
-      </w:r>
-      <w:r>
-        <w:rPr>
-          <w:rFonts w:ascii="Times New Roman" w:cs="Times New Roman" w:eastAsia="Times New Roman" w:hAnsi="Times New Roman"/>
-          <w:i/>
-          <w:iCs/>
-          <w:sz w:val="22"/>
-          <w:szCs w:val="22"/>
-        </w:rPr>
-        <w:t xml:space="preserve">A</w:t>
-      </w:r>
-      <w:r>
-        <w:rPr>
-          <w:rFonts w:ascii="Times New Roman" w:cs="Times New Roman" w:eastAsia="Times New Roman" w:hAnsi="Times New Roman"/>
-          <w:sz w:val="22"/>
-          <w:szCs w:val="22"/>
-        </w:rPr>
-        <w:t xml:space="preserve"> the active area, and </w:t>
-      </w:r>
-      <w:r>
-        <w:rPr>
-          <w:rFonts w:ascii="Times New Roman" w:cs="Times New Roman" w:eastAsia="Times New Roman" w:hAnsi="Times New Roman"/>
-          <w:i/>
-          <w:iCs/>
-          <w:sz w:val="22"/>
-          <w:szCs w:val="22"/>
+        <w:t xml:space="preserve">p</w:t>
+      </w:r>
+      <w:r>
+        <w:rPr>
+          <w:rFonts w:ascii="Times New Roman" w:cs="Times New Roman" w:eastAsia="Times New Roman" w:hAnsi="Times New Roman"/>
+          <w:sz w:val="22"/>
+          <w:szCs w:val="22"/>
+        </w:rPr>
+        <w:t xml:space="preserve"> = 4.0, </w:t>
+      </w:r>
+      <w:r>
+        <w:rPr>
+          <w:rFonts w:ascii="Times New Roman" w:cs="Times New Roman" w:eastAsia="Times New Roman" w:hAnsi="Times New Roman"/>
+          <w:i/>
+          <w:iCs/>
+          <w:sz w:val="22"/>
+          <w:szCs w:val="22"/>
+        </w:rPr>
+        <w:t xml:space="preserve">K</w:t>
+      </w:r>
+      <w:r>
+        <w:rPr>
+          <w:rFonts w:ascii="Times New Roman" w:cs="Times New Roman" w:eastAsia="Times New Roman" w:hAnsi="Times New Roman"/>
+          <w:sz w:val="22"/>
+          <w:szCs w:val="22"/>
+          <w:vertAlign w:val="subscript"/>
+        </w:rPr>
+        <w:t xml:space="preserve">i</w:t>
+      </w:r>
+      <w:r>
+        <w:rPr>
+          <w:rFonts w:ascii="Times New Roman" w:cs="Times New Roman" w:eastAsia="Times New Roman" w:hAnsi="Times New Roman"/>
+          <w:sz w:val="22"/>
+          <w:szCs w:val="22"/>
+        </w:rPr>
+        <w:t xml:space="preserve"> = 0.4, </w:t>
+      </w:r>
+      <w:r>
+        <w:rPr>
+          <w:rFonts w:ascii="Times New Roman" w:cs="Times New Roman" w:eastAsia="Times New Roman" w:hAnsi="Times New Roman"/>
+          <w:i/>
+          <w:iCs/>
+          <w:sz w:val="22"/>
+          <w:szCs w:val="22"/>
+        </w:rPr>
+        <w:t xml:space="preserve">K</w:t>
+      </w:r>
+      <w:r>
+        <w:rPr>
+          <w:rFonts w:ascii="Times New Roman" w:cs="Times New Roman" w:eastAsia="Times New Roman" w:hAnsi="Times New Roman"/>
+          <w:sz w:val="22"/>
+          <w:szCs w:val="22"/>
+          <w:vertAlign w:val="subscript"/>
         </w:rPr>
         <w:t xml:space="preserve">d</w:t>
       </w:r>
@@ -922,17 +2186,201 @@
           <w:rFonts w:ascii="Times New Roman" w:cs="Times New Roman" w:eastAsia="Times New Roman" w:hAnsi="Times New Roman"/>
           <w:sz w:val="22"/>
           <w:szCs w:val="22"/>
+        </w:rPr>
+        <w:t xml:space="preserve"> = 1.0 and derivative filter time constant </w:t>
+      </w:r>
+      <w:r>
+        <w:rPr>
+          <w:rFonts w:ascii="Times New Roman" w:cs="Times New Roman" w:eastAsia="Times New Roman" w:hAnsi="Times New Roman"/>
+          <w:i/>
+          <w:iCs/>
+          <w:sz w:val="22"/>
+          <w:szCs w:val="22"/>
+        </w:rPr>
+        <w:t xml:space="preserve">τ</w:t>
+      </w:r>
+      <w:r>
+        <w:rPr>
+          <w:rFonts w:ascii="Times New Roman" w:cs="Times New Roman" w:eastAsia="Times New Roman" w:hAnsi="Times New Roman"/>
+          <w:sz w:val="22"/>
+          <w:szCs w:val="22"/>
           <w:vertAlign w:val="subscript"/>
         </w:rPr>
-        <w:t xml:space="preserve">h</w:t>
-      </w:r>
-      <w:r>
-        <w:rPr>
-          <w:rFonts w:ascii="Times New Roman" w:cs="Times New Roman" w:eastAsia="Times New Roman" w:hAnsi="Times New Roman"/>
-          <w:sz w:val="22"/>
-          <w:szCs w:val="22"/>
-        </w:rPr>
-        <w:t xml:space="preserve"> the mean hydraulic pore diameter. The slope method uses all replicate points simultaneously and is robust to the experimental scatter that corrupts per-point permeability averaging; the coefficient of determination R² of the fit doubles as a quantitative check that the specimen follows Darcy's law (a threshold of R² ≥ 0.98 is applied). Because pressure enters the analysis as the measured mean over each collection window, moderate imperfection in pressure regulation biases the result far less than it would in a fixed-nominal-pressure protocol: the regression is performed against what the pressure actually was, not what it was supposed to be.</w:t>
+        <w:t xml:space="preserve">d</w:t>
+      </w:r>
+      <w:r>
+        <w:rPr>
+          <w:rFonts w:ascii="Times New Roman" w:cs="Times New Roman" w:eastAsia="Times New Roman" w:hAnsi="Times New Roman"/>
+          <w:sz w:val="22"/>
+          <w:szCs w:val="22"/>
+        </w:rPr>
+        <w:t xml:space="preserve"> = 0.3 s, all tuned in simulation against the asymmetric plant. Three implementation choices deserve explanation, because each prevents a specific failure:</w:t>
+      </w:r>
+    </w:p>
+    <w:p>
+      <w:pPr>
+        <w:pStyle w:val="ListParagraph"/>
+        <w:numPr>
+          <w:ilvl w:val="0"/>
+          <w:numId w:val="2"/>
+        </w:numPr>
+        <w:spacing w:after="60" w:line="276"/>
+        <w:jc w:val="both"/>
+      </w:pPr>
+      <w:r>
+        <w:rPr>
+          <w:rFonts w:ascii="Times New Roman" w:cs="Times New Roman" w:eastAsia="Times New Roman" w:hAnsi="Times New Roman"/>
+          <w:b/>
+          <w:bCs/>
+          <w:sz w:val="22"/>
+          <w:szCs w:val="22"/>
+        </w:rPr>
+        <w:t xml:space="preserve">Derivative on measurement, not on error (Eq. 11–12). </w:t>
+      </w:r>
+      <w:r>
+        <w:rPr>
+          <w:rFonts w:ascii="Times New Roman" w:cs="Times New Roman" w:eastAsia="Times New Roman" w:hAnsi="Times New Roman"/>
+          <w:sz w:val="22"/>
+          <w:szCs w:val="22"/>
+        </w:rPr>
+        <w:t xml:space="preserve">Differentiating the error would differentiate the setpoint too, so every setpoint step would fire an impulse through the D term — a “derivative kick” that slams the valve [4]. Differentiating only the measurement gives the same damping action with no kick. The sign is negative in Eq. (12): rising pressure pushes the valve toward closed.</w:t>
+      </w:r>
+    </w:p>
+    <w:p>
+      <w:pPr>
+        <w:pStyle w:val="ListParagraph"/>
+        <w:numPr>
+          <w:ilvl w:val="0"/>
+          <w:numId w:val="2"/>
+        </w:numPr>
+        <w:spacing w:after="60" w:line="276"/>
+        <w:jc w:val="both"/>
+      </w:pPr>
+      <w:r>
+        <w:rPr>
+          <w:rFonts w:ascii="Times New Roman" w:cs="Times New Roman" w:eastAsia="Times New Roman" w:hAnsi="Times New Roman"/>
+          <w:b/>
+          <w:bCs/>
+          <w:sz w:val="22"/>
+          <w:szCs w:val="22"/>
+        </w:rPr>
+        <w:t xml:space="preserve">A filtered derivative (Eq. 11). </w:t>
+      </w:r>
+      <w:r>
+        <w:rPr>
+          <w:rFonts w:ascii="Times New Roman" w:cs="Times New Roman" w:eastAsia="Times New Roman" w:hAnsi="Times New Roman"/>
+          <w:sz w:val="22"/>
+          <w:szCs w:val="22"/>
+        </w:rPr>
+        <w:t xml:space="preserve">The pressure reading carries ±0.15 kPa of sample-to-sample noise. Naively differencing it at 20 Hz would produce phantom rates of ±3–4 kPa/s — with K</w:t>
+      </w:r>
+      <w:r>
+        <w:rPr>
+          <w:rFonts w:ascii="Times New Roman" w:cs="Times New Roman" w:eastAsia="Times New Roman" w:hAnsi="Times New Roman"/>
+          <w:sz w:val="22"/>
+          <w:szCs w:val="22"/>
+          <w:vertAlign w:val="subscript"/>
+        </w:rPr>
+        <w:t xml:space="preserve">d</w:t>
+      </w:r>
+      <w:r>
+        <w:rPr>
+          <w:rFonts w:ascii="Times New Roman" w:cs="Times New Roman" w:eastAsia="Times New Roman" w:hAnsi="Times New Roman"/>
+          <w:sz w:val="22"/>
+          <w:szCs w:val="22"/>
+        </w:rPr>
+        <w:t xml:space="preserve"> = 1, several percent of full valve authority in pure noise. The first-order filter (α ≈ 0.14 at these settings) averages the rate estimate over ≈0.3 s, trading a small lag for a usable signal.</w:t>
+      </w:r>
+    </w:p>
+    <w:p>
+      <w:pPr>
+        <w:pStyle w:val="ListParagraph"/>
+        <w:numPr>
+          <w:ilvl w:val="0"/>
+          <w:numId w:val="2"/>
+        </w:numPr>
+        <w:spacing w:after="60" w:line="276"/>
+        <w:jc w:val="both"/>
+      </w:pPr>
+      <w:r>
+        <w:rPr>
+          <w:rFonts w:ascii="Times New Roman" w:cs="Times New Roman" w:eastAsia="Times New Roman" w:hAnsi="Times New Roman"/>
+          <w:b/>
+          <w:bCs/>
+          <w:sz w:val="22"/>
+          <w:szCs w:val="22"/>
+        </w:rPr>
+        <w:t xml:space="preserve">Back-calculation anti-windup (the dashed path in Fig. 3). </w:t>
+      </w:r>
+      <w:r>
+        <w:rPr>
+          <w:rFonts w:ascii="Times New Roman" w:cs="Times New Roman" w:eastAsia="Times New Roman" w:hAnsi="Times New Roman"/>
+          <w:sz w:val="22"/>
+          <w:szCs w:val="22"/>
+        </w:rPr>
+        <w:t xml:space="preserve">When the demanded output exceeds the clamp — e.g. the raw sum is 112% but the valve saturates at 100% — a plain integrator would keep accumulating error it can never act on, then discharge it as a large overshoot once the error reverses. Here the excess (100 − 112 = −12) is added back into the integrator in the same tick, so the integrator always holds exactly the value consistent with the output actually applied. Saturation then ends cleanly, with no stored surplus to burn off.</w:t>
+      </w:r>
+    </w:p>
+    <w:p>
+      <w:pPr>
+        <w:spacing w:after="100" w:before="160"/>
+      </w:pPr>
+      <w:r>
+        <w:rPr>
+          <w:rFonts w:ascii="Times New Roman" w:cs="Times New Roman" w:eastAsia="Times New Roman" w:hAnsi="Times New Roman"/>
+          <w:b/>
+          <w:bCs/>
+          <w:i/>
+          <w:iCs/>
+          <w:sz w:val="22"/>
+          <w:szCs w:val="22"/>
+        </w:rPr>
+        <w:t xml:space="preserve">4.3 Setpoint ramping</w:t>
+      </w:r>
+    </w:p>
+    <w:p>
+      <w:pPr>
+        <w:spacing w:after="120" w:line="276"/>
+        <w:jc w:val="both"/>
+      </w:pPr>
+      <w:r>
+        <w:rPr>
+          <w:rFonts w:ascii="Times New Roman" w:cs="Times New Roman" w:eastAsia="Times New Roman" w:hAnsi="Times New Roman"/>
+          <w:sz w:val="22"/>
+          <w:szCs w:val="22"/>
+        </w:rPr>
+        <w:t xml:space="preserve">Setpoint changes are not applied as steps. When the sequencer moves to a new target, the controller's internal reference starts at the current measured pressure and slews toward the true setpoint at 3 kPa/s. This keeps the error term small throughout the transit — so the integrator never winds up during the approach — and makes the loop arrive at each target from below, which on the asymmetric plant of Section 4.1 suppresses overshoot and also takes up any mechanical backlash in the printed valve transmission from a consistent direction. One subtlety: the acceptance test for “stabilized” (Section 5) is always evaluated against the true setpoint, never the moving ramp target, so ramping cannot fake a stabilization.</w:t>
+      </w:r>
+    </w:p>
+    <w:p>
+      <w:pPr>
+        <w:spacing w:after="100" w:before="160"/>
+      </w:pPr>
+      <w:r>
+        <w:rPr>
+          <w:rFonts w:ascii="Times New Roman" w:cs="Times New Roman" w:eastAsia="Times New Roman" w:hAnsi="Times New Roman"/>
+          <w:b/>
+          <w:bCs/>
+          <w:i/>
+          <w:iCs/>
+          <w:sz w:val="22"/>
+          <w:szCs w:val="22"/>
+        </w:rPr>
+        <w:t xml:space="preserve">4.4 Loop timing</w:t>
+      </w:r>
+    </w:p>
+    <w:p>
+      <w:pPr>
+        <w:spacing w:after="120" w:line="276"/>
+        <w:jc w:val="both"/>
+      </w:pPr>
+      <w:r>
+        <w:rPr>
+          <w:rFonts w:ascii="Times New Roman" w:cs="Times New Roman" w:eastAsia="Times New Roman" w:hAnsi="Times New Roman"/>
+          <w:sz w:val="22"/>
+          <w:szCs w:val="22"/>
+        </w:rPr>
+        <w:t xml:space="preserve">The control thread runs on a fixed timebase: each tick's deadline is the previous deadline plus 50 ms, not “now plus 50 ms,” so timing errors do not accumulate. If a tick overruns (e.g., the operating system stalls the thread), the scheduler re-synchronizes to the current time rather than firing a burst of catch-up ticks — a burst would feed the integrator several identical error samples in a few milliseconds, which is indistinguishable from a plant that stopped responding.</w:t>
       </w:r>
     </w:p>
     <w:p>
@@ -947,7 +2395,7 @@
           <w:sz w:val="24"/>
           <w:szCs w:val="24"/>
         </w:rPr>
-        <w:t xml:space="preserve">4. Validation in Simulation</w:t>
+        <w:t xml:space="preserve">5. Automated Test Sequencing</w:t>
       </w:r>
     </w:p>
     <w:p>
@@ -961,24 +2409,156 @@
           <w:sz w:val="22"/>
           <w:szCs w:val="22"/>
         </w:rPr>
-        <w:t xml:space="preserve">All control logic, sequencing, safety behavior, and analysis were exercised in the hardware-free simulation mode, in which the mock plant follows first-order pressure dynamics with a sinusoidally oscillating supply (emulating compressor cycling) and produces a Darcy-consistent permeate flow whose magnitude scales inversely with viscosity.</w:t>
-      </w:r>
-    </w:p>
-    <w:p>
-      <w:pPr>
-        <w:spacing w:after="100" w:before="160"/>
+        <w:t xml:space="preserve">A full characterization is a sequence of test points, each requiring: reach the pressure, prove it is being held, collect permeate for a precisely known interval, and move on. A four-state finite-state machine (IDLE → STABILIZING → COLLECTING → … → DONE) encodes this protocol; Figure 4 shows it executing on the simulated plant.</w:t>
+      </w:r>
+    </w:p>
+    <w:p>
+      <w:pPr>
+        <w:pStyle w:val="ListParagraph"/>
+        <w:numPr>
+          <w:ilvl w:val="0"/>
+          <w:numId w:val="2"/>
+        </w:numPr>
+        <w:spacing w:after="60" w:line="276"/>
+        <w:jc w:val="both"/>
       </w:pPr>
       <w:r>
         <w:rPr>
           <w:rFonts w:ascii="Times New Roman" w:cs="Times New Roman" w:eastAsia="Times New Roman" w:hAnsi="Times New Roman"/>
           <w:b/>
           <w:bCs/>
-          <w:i/>
-          <w:iCs/>
-          <w:sz w:val="22"/>
-          <w:szCs w:val="22"/>
-        </w:rPr>
-        <w:t xml:space="preserve">4.1 Disturbance rejection</w:t>
+          <w:sz w:val="22"/>
+          <w:szCs w:val="22"/>
+        </w:rPr>
+        <w:t xml:space="preserve">STABILIZING. </w:t>
+      </w:r>
+      <w:r>
+        <w:rPr>
+          <w:rFonts w:ascii="Times New Roman" w:cs="Times New Roman" w:eastAsia="Times New Roman" w:hAnsi="Times New Roman"/>
+          <w:sz w:val="22"/>
+          <w:szCs w:val="22"/>
+        </w:rPr>
+        <w:t xml:space="preserve">The PID drives toward the setpoint while the sequencer watches the measured pressure against an acceptance band of ±10% of the setpoint (±2 kPa at 20 kPa). The pressure must remain inside the band continuously for a 5 s dwell; a single excursion resets the dwell clock to zero. This continuity requirement is what distinguishes “regulating” from “passing through”: a pressure that oscillates across the band can never accumulate 5 s in band, no matter how often it visits. If stabilization is not achieved within 180 s, the point is recorded as failed with an explicit reason and the sequence advances — one unreachable setpoint costs one data point, not the run.</w:t>
+      </w:r>
+    </w:p>
+    <w:p>
+      <w:pPr>
+        <w:pStyle w:val="ListParagraph"/>
+        <w:numPr>
+          <w:ilvl w:val="0"/>
+          <w:numId w:val="2"/>
+        </w:numPr>
+        <w:spacing w:after="60" w:line="276"/>
+        <w:jc w:val="both"/>
+      </w:pPr>
+      <w:r>
+        <w:rPr>
+          <w:rFonts w:ascii="Times New Roman" w:cs="Times New Roman" w:eastAsia="Times New Roman" w:hAnsi="Times New Roman"/>
+          <w:b/>
+          <w:bCs/>
+          <w:sz w:val="22"/>
+          <w:szCs w:val="22"/>
+        </w:rPr>
+        <w:t xml:space="preserve">COLLECTING. </w:t>
+      </w:r>
+      <w:r>
+        <w:rPr>
+          <w:rFonts w:ascii="Times New Roman" w:cs="Times New Roman" w:eastAsia="Times New Roman" w:hAnsi="Times New Roman"/>
+          <w:sz w:val="22"/>
+          <w:szCs w:val="22"/>
+        </w:rPr>
+        <w:t xml:space="preserve">On entry the solenoid diverter switches the permeate stream from waste to the graduated container, and a fresh statistics accumulator starts. For exactly 60 s (1200 samples at 20 Hz) the sequencer accumulates the pressure's mean, standard deviation, minimum, maximum, and in-band fraction — over the collection window only, because that is the only interval whose pressure history matters to the flow measurement. On exit the diverter drops back to waste (its de-energized, fail-safe position) and the machine advances to the next setpoint or to DONE.</w:t>
+      </w:r>
+    </w:p>
+    <w:p>
+      <w:pPr>
+        <w:pStyle w:val="ListParagraph"/>
+        <w:numPr>
+          <w:ilvl w:val="0"/>
+          <w:numId w:val="2"/>
+        </w:numPr>
+        <w:spacing w:after="60" w:line="276"/>
+        <w:jc w:val="both"/>
+      </w:pPr>
+      <w:r>
+        <w:rPr>
+          <w:rFonts w:ascii="Times New Roman" w:cs="Times New Roman" w:eastAsia="Times New Roman" w:hAnsi="Times New Roman"/>
+          <w:b/>
+          <w:bCs/>
+          <w:sz w:val="22"/>
+          <w:szCs w:val="22"/>
+        </w:rPr>
+        <w:t xml:space="preserve">Ascending order. </w:t>
+      </w:r>
+      <w:r>
+        <w:rPr>
+          <w:rFonts w:ascii="Times New Roman" w:cs="Times New Roman" w:eastAsia="Times New Roman" w:hAnsi="Times New Roman"/>
+          <w:sz w:val="22"/>
+          <w:szCs w:val="22"/>
+        </w:rPr>
+        <w:t xml:space="preserve">Setpoints are visited low-to-high. The plant of Eq. (8) fills in seconds but drains in tens of seconds; descending steps would spend most of the run waiting for pressure to leak away through the membrane.</w:t>
+      </w:r>
+    </w:p>
+    <w:p>
+      <w:pPr>
+        <w:spacing w:after="60" w:before="160"/>
+        <w:jc w:val="center"/>
+      </w:pPr>
+      <w:r>
+        <w:drawing>
+          <wp:inline distT="0" distB="0" distL="0" distR="0">
+            <wp:extent cx="5905500" cy="3324225"/>
+            <wp:effectExtent t="0" r="0" b="0" l="0"/>
+            <wp:docPr id="1" name="" descr="" title=""/>
+            <wp:cNvGraphicFramePr>
+              <a:graphicFrameLocks xmlns:a="http://schemas.openxmlformats.org/drawingml/2006/main" noChangeAspect="1"/>
+            </wp:cNvGraphicFramePr>
+            <a:graphic xmlns:a="http://schemas.openxmlformats.org/drawingml/2006/main">
+              <a:graphicData uri="http://schemas.openxmlformats.org/drawingml/2006/picture">
+                <pic:pic xmlns:pic="http://schemas.openxmlformats.org/drawingml/2006/picture">
+                  <pic:nvPicPr>
+                    <pic:cNvPr id="0" name="" descr=""/>
+                    <pic:cNvPicPr>
+                      <a:picLocks noChangeAspect="1" noChangeArrowheads="1"/>
+                    </pic:cNvPicPr>
+                  </pic:nvPicPr>
+                  <pic:blipFill>
+                    <a:blip r:embed="rId10" cstate="none"/>
+                    <a:srcRect/>
+                    <a:stretch>
+                      <a:fillRect/>
+                    </a:stretch>
+                  </pic:blipFill>
+                  <pic:spPr bwMode="auto">
+                    <a:xfrm>
+                      <a:off x="0" y="0"/>
+                      <a:ext cx="5905500" cy="3324225"/>
+                    </a:xfrm>
+                    <a:prstGeom prst="rect">
+                      <a:avLst/>
+                    </a:prstGeom>
+                  </pic:spPr>
+                </pic:pic>
+              </a:graphicData>
+            </a:graphic>
+          </wp:inline>
+        </w:drawing>
+      </w:r>
+    </w:p>
+    <w:p>
+      <w:pPr>
+        <w:spacing w:after="200" w:before="80"/>
+        <w:jc w:val="center"/>
+      </w:pPr>
+      <w:r>
+        <w:rPr>
+          <w:rFonts w:ascii="Times New Roman" w:cs="Times New Roman" w:eastAsia="Times New Roman" w:hAnsi="Times New Roman"/>
+          <w:i/>
+          <w:iCs/>
+          <w:sz w:val="20"/>
+          <w:szCs w:val="20"/>
+        </w:rPr>
+        <w:t xml:space="preserve">Figure 4. A complete simulated 20/40/60 kPa sequence (215 s). Top: measured pressure, setpoint, ±10% acceptance bands, and the three 60 s collection windows (shaded). Bottom: valve command. The ~25 s periodicity visible in the valve trace — most clearly at 60 kPa — is the PID counter-modulating against the ±8 kPa supply wobble; the pressure trace above it stays flat.</w:t>
       </w:r>
     </w:p>
     <w:p>
@@ -992,7 +2572,677 @@
           <w:sz w:val="22"/>
           <w:szCs w:val="22"/>
         </w:rPr>
-        <w:t xml:space="preserve">With the simulated supply oscillating by ±8 kPa with a 25 s period, the closed loop held each setpoint of a 20/40/60 kPa sequence with sub-kilopascal standard deviation while the valve command visibly counter-modulated by 9–13% of full scale (Table 1).</w:t>
+        <w:t xml:space="preserve">The volume collected in each window is read from the graduated container and entered by the operator at the end of the sequence — the single remaining manual step — and the flow rate for point </w:t>
+      </w:r>
+      <w:r>
+        <w:rPr>
+          <w:rFonts w:ascii="Times New Roman" w:cs="Times New Roman" w:eastAsia="Times New Roman" w:hAnsi="Times New Roman"/>
+          <w:i/>
+          <w:iCs/>
+          <w:sz w:val="22"/>
+          <w:szCs w:val="22"/>
+        </w:rPr>
+        <w:t xml:space="preserve">i</w:t>
+      </w:r>
+      <w:r>
+        <w:rPr>
+          <w:rFonts w:ascii="Times New Roman" w:cs="Times New Roman" w:eastAsia="Times New Roman" w:hAnsi="Times New Roman"/>
+          <w:sz w:val="22"/>
+          <w:szCs w:val="22"/>
+        </w:rPr>
+        <w:t xml:space="preserve"> follows as</w:t>
+      </w:r>
+    </w:p>
+    <w:p>
+      <w:pPr>
+        <w:spacing w:after="80" w:before="80"/>
+        <w:ind w:left="720"/>
+      </w:pPr>
+      <w:r>
+        <w:rPr>
+          <w:rFonts w:ascii="Times New Roman" w:cs="Times New Roman" w:eastAsia="Times New Roman" w:hAnsi="Times New Roman"/>
+          <w:i/>
+          <w:iCs/>
+          <w:sz w:val="22"/>
+          <w:szCs w:val="22"/>
+        </w:rPr>
+        <w:t xml:space="preserve">Q</w:t>
+      </w:r>
+      <w:r>
+        <w:rPr>
+          <w:rFonts w:ascii="Times New Roman" w:cs="Times New Roman" w:eastAsia="Times New Roman" w:hAnsi="Times New Roman"/>
+          <w:sz w:val="22"/>
+          <w:szCs w:val="22"/>
+          <w:vertAlign w:val="subscript"/>
+        </w:rPr>
+        <w:t xml:space="preserve">i</w:t>
+      </w:r>
+      <w:r>
+        <w:rPr>
+          <w:rFonts w:ascii="Times New Roman" w:cs="Times New Roman" w:eastAsia="Times New Roman" w:hAnsi="Times New Roman"/>
+          <w:i/>
+          <w:iCs/>
+          <w:sz w:val="22"/>
+          <w:szCs w:val="22"/>
+        </w:rPr>
+        <w:t xml:space="preserve"> = V</w:t>
+      </w:r>
+      <w:r>
+        <w:rPr>
+          <w:rFonts w:ascii="Times New Roman" w:cs="Times New Roman" w:eastAsia="Times New Roman" w:hAnsi="Times New Roman"/>
+          <w:sz w:val="22"/>
+          <w:szCs w:val="22"/>
+          <w:vertAlign w:val="subscript"/>
+        </w:rPr>
+        <w:t xml:space="preserve">i</w:t>
+      </w:r>
+      <w:r>
+        <w:rPr>
+          <w:rFonts w:ascii="Times New Roman" w:cs="Times New Roman" w:eastAsia="Times New Roman" w:hAnsi="Times New Roman"/>
+          <w:i/>
+          <w:iCs/>
+          <w:sz w:val="22"/>
+          <w:szCs w:val="22"/>
+        </w:rPr>
+        <w:t xml:space="preserve"> / t</w:t>
+      </w:r>
+      <w:r>
+        <w:rPr>
+          <w:rFonts w:ascii="Times New Roman" w:cs="Times New Roman" w:eastAsia="Times New Roman" w:hAnsi="Times New Roman"/>
+          <w:sz w:val="22"/>
+          <w:szCs w:val="22"/>
+          <w:vertAlign w:val="subscript"/>
+        </w:rPr>
+        <w:t xml:space="preserve">c</w:t>
+      </w:r>
+      <w:r>
+        <w:rPr>
+          <w:rFonts w:ascii="Times New Roman" w:cs="Times New Roman" w:eastAsia="Times New Roman" w:hAnsi="Times New Roman"/>
+          <w:sz w:val="22"/>
+          <w:szCs w:val="22"/>
+        </w:rPr>
+        <w:t xml:space="preserve"> ,</w:t>
+      </w:r>
+      <w:r>
+        <w:rPr>
+          <w:rFonts w:ascii="Times New Roman" w:cs="Times New Roman" w:eastAsia="Times New Roman" w:hAnsi="Times New Roman"/>
+          <w:sz w:val="22"/>
+          <w:szCs w:val="22"/>
+        </w:rPr>
+        <w:ptab w:alignment="right" w:relativeTo="margin" w:leader="none"/>
+        <w:t xml:space="preserve">(13)</w:t>
+      </w:r>
+    </w:p>
+    <w:p>
+      <w:pPr>
+        <w:spacing w:after="120" w:line="276"/>
+        <w:jc w:val="both"/>
+      </w:pPr>
+      <w:r>
+        <w:rPr>
+          <w:rFonts w:ascii="Times New Roman" w:cs="Times New Roman" w:eastAsia="Times New Roman" w:hAnsi="Times New Roman"/>
+          <w:sz w:val="22"/>
+          <w:szCs w:val="22"/>
+        </w:rPr>
+        <w:t xml:space="preserve">with the collection time </w:t>
+      </w:r>
+      <w:r>
+        <w:rPr>
+          <w:rFonts w:ascii="Times New Roman" w:cs="Times New Roman" w:eastAsia="Times New Roman" w:hAnsi="Times New Roman"/>
+          <w:i/>
+          <w:iCs/>
+          <w:sz w:val="22"/>
+          <w:szCs w:val="22"/>
+        </w:rPr>
+        <w:t xml:space="preserve">t</w:t>
+      </w:r>
+      <w:r>
+        <w:rPr>
+          <w:rFonts w:ascii="Times New Roman" w:cs="Times New Roman" w:eastAsia="Times New Roman" w:hAnsi="Times New Roman"/>
+          <w:sz w:val="22"/>
+          <w:szCs w:val="22"/>
+          <w:vertAlign w:val="subscript"/>
+        </w:rPr>
+        <w:t xml:space="preserve">c</w:t>
+      </w:r>
+      <w:r>
+        <w:rPr>
+          <w:rFonts w:ascii="Times New Roman" w:cs="Times New Roman" w:eastAsia="Times New Roman" w:hAnsi="Times New Roman"/>
+          <w:sz w:val="22"/>
+          <w:szCs w:val="22"/>
+        </w:rPr>
+        <w:t xml:space="preserve"> known to software precision. In simulation the volume is instead integrated directly from the modeled flow, which is what allows the end-to-end validation of Section 7 to run with no operator at all. A detail of the terminal state: once the sequence ends, the controller latches a sticky “finished” flag that persists until the next start command, so a user interface polling every 500 ms cannot miss the completion event between two control ticks.</w:t>
+      </w:r>
+    </w:p>
+    <w:p>
+      <w:pPr>
+        <w:spacing w:after="120" w:before="240"/>
+      </w:pPr>
+      <w:r>
+        <w:rPr>
+          <w:rFonts w:ascii="Times New Roman" w:cs="Times New Roman" w:eastAsia="Times New Roman" w:hAnsi="Times New Roman"/>
+          <w:b/>
+          <w:bCs/>
+          <w:sz w:val="24"/>
+          <w:szCs w:val="24"/>
+        </w:rPr>
+        <w:t xml:space="preserve">6. Automated Data Analysis</w:t>
+      </w:r>
+    </w:p>
+    <w:p>
+      <w:pPr>
+        <w:spacing w:after="120" w:line="276"/>
+        <w:jc w:val="both"/>
+      </w:pPr>
+      <w:r>
+        <w:rPr>
+          <w:rFonts w:ascii="Times New Roman" w:cs="Times New Roman" w:eastAsia="Times New Roman" w:hAnsi="Times New Roman"/>
+          <w:sz w:val="22"/>
+          <w:szCs w:val="22"/>
+        </w:rPr>
+        <w:t xml:space="preserve">When the volumes are entered, the system fits Eq. (2) to the points (</w:t>
+      </w:r>
+      <w:r>
+        <w:rPr>
+          <w:rFonts w:ascii="Times New Roman" w:cs="Times New Roman" w:eastAsia="Times New Roman" w:hAnsi="Times New Roman"/>
+          <w:i/>
+          <w:iCs/>
+          <w:sz w:val="22"/>
+          <w:szCs w:val="22"/>
+        </w:rPr>
+        <w:t xml:space="preserve">P̄</w:t>
+      </w:r>
+      <w:r>
+        <w:rPr>
+          <w:rFonts w:ascii="Times New Roman" w:cs="Times New Roman" w:eastAsia="Times New Roman" w:hAnsi="Times New Roman"/>
+          <w:sz w:val="22"/>
+          <w:szCs w:val="22"/>
+          <w:vertAlign w:val="subscript"/>
+        </w:rPr>
+        <w:t xml:space="preserve">i</w:t>
+      </w:r>
+      <w:r>
+        <w:rPr>
+          <w:rFonts w:ascii="Times New Roman" w:cs="Times New Roman" w:eastAsia="Times New Roman" w:hAnsi="Times New Roman"/>
+          <w:i/>
+          <w:iCs/>
+          <w:sz w:val="22"/>
+          <w:szCs w:val="22"/>
+        </w:rPr>
+        <w:t xml:space="preserve">, Q</w:t>
+      </w:r>
+      <w:r>
+        <w:rPr>
+          <w:rFonts w:ascii="Times New Roman" w:cs="Times New Roman" w:eastAsia="Times New Roman" w:hAnsi="Times New Roman"/>
+          <w:sz w:val="22"/>
+          <w:szCs w:val="22"/>
+          <w:vertAlign w:val="subscript"/>
+        </w:rPr>
+        <w:t xml:space="preserve">i</w:t>
+      </w:r>
+      <w:r>
+        <w:rPr>
+          <w:rFonts w:ascii="Times New Roman" w:cs="Times New Roman" w:eastAsia="Times New Roman" w:hAnsi="Times New Roman"/>
+          <w:sz w:val="22"/>
+          <w:szCs w:val="22"/>
+        </w:rPr>
+        <w:t xml:space="preserve">) — where </w:t>
+      </w:r>
+      <w:r>
+        <w:rPr>
+          <w:rFonts w:ascii="Times New Roman" w:cs="Times New Roman" w:eastAsia="Times New Roman" w:hAnsi="Times New Roman"/>
+          <w:i/>
+          <w:iCs/>
+          <w:sz w:val="22"/>
+          <w:szCs w:val="22"/>
+        </w:rPr>
+        <w:t xml:space="preserve">P̄</w:t>
+      </w:r>
+      <w:r>
+        <w:rPr>
+          <w:rFonts w:ascii="Times New Roman" w:cs="Times New Roman" w:eastAsia="Times New Roman" w:hAnsi="Times New Roman"/>
+          <w:sz w:val="22"/>
+          <w:szCs w:val="22"/>
+          <w:vertAlign w:val="subscript"/>
+        </w:rPr>
+        <w:t xml:space="preserve">i</w:t>
+      </w:r>
+      <w:r>
+        <w:rPr>
+          <w:rFonts w:ascii="Times New Roman" w:cs="Times New Roman" w:eastAsia="Times New Roman" w:hAnsi="Times New Roman"/>
+          <w:sz w:val="22"/>
+          <w:szCs w:val="22"/>
+        </w:rPr>
+        <w:t xml:space="preserve"> is the </w:t>
+      </w:r>
+      <w:r>
+        <w:rPr>
+          <w:rFonts w:ascii="Times New Roman" w:cs="Times New Roman" w:eastAsia="Times New Roman" w:hAnsi="Times New Roman"/>
+          <w:i/>
+          <w:iCs/>
+          <w:sz w:val="22"/>
+          <w:szCs w:val="22"/>
+        </w:rPr>
+        <w:t xml:space="preserve">measured mean</w:t>
+      </w:r>
+      <w:r>
+        <w:rPr>
+          <w:rFonts w:ascii="Times New Roman" w:cs="Times New Roman" w:eastAsia="Times New Roman" w:hAnsi="Times New Roman"/>
+          <w:sz w:val="22"/>
+          <w:szCs w:val="22"/>
+        </w:rPr>
+        <w:t xml:space="preserve"> pressure of collection window </w:t>
+      </w:r>
+      <w:r>
+        <w:rPr>
+          <w:rFonts w:ascii="Times New Roman" w:cs="Times New Roman" w:eastAsia="Times New Roman" w:hAnsi="Times New Roman"/>
+          <w:i/>
+          <w:iCs/>
+          <w:sz w:val="22"/>
+          <w:szCs w:val="22"/>
+        </w:rPr>
+        <w:t xml:space="preserve">i</w:t>
+      </w:r>
+      <w:r>
+        <w:rPr>
+          <w:rFonts w:ascii="Times New Roman" w:cs="Times New Roman" w:eastAsia="Times New Roman" w:hAnsi="Times New Roman"/>
+          <w:sz w:val="22"/>
+          <w:szCs w:val="22"/>
+        </w:rPr>
+        <w:t xml:space="preserve">, not the nominal setpoint — by ordinary least squares:</w:t>
+      </w:r>
+    </w:p>
+    <w:p>
+      <w:pPr>
+        <w:spacing w:after="80" w:before="80"/>
+        <w:ind w:left="720"/>
+      </w:pPr>
+      <w:r>
+        <w:rPr>
+          <w:rFonts w:ascii="Times New Roman" w:cs="Times New Roman" w:eastAsia="Times New Roman" w:hAnsi="Times New Roman"/>
+          <w:i/>
+          <w:iCs/>
+          <w:sz w:val="22"/>
+          <w:szCs w:val="22"/>
+        </w:rPr>
+        <w:t xml:space="preserve">b = Σ(P̄</w:t>
+      </w:r>
+      <w:r>
+        <w:rPr>
+          <w:rFonts w:ascii="Times New Roman" w:cs="Times New Roman" w:eastAsia="Times New Roman" w:hAnsi="Times New Roman"/>
+          <w:sz w:val="22"/>
+          <w:szCs w:val="22"/>
+          <w:vertAlign w:val="subscript"/>
+        </w:rPr>
+        <w:t xml:space="preserve">i</w:t>
+      </w:r>
+      <w:r>
+        <w:rPr>
+          <w:rFonts w:ascii="Times New Roman" w:cs="Times New Roman" w:eastAsia="Times New Roman" w:hAnsi="Times New Roman"/>
+          <w:i/>
+          <w:iCs/>
+          <w:sz w:val="22"/>
+          <w:szCs w:val="22"/>
+        </w:rPr>
+        <w:t xml:space="preserve"> − P̄)(Q</w:t>
+      </w:r>
+      <w:r>
+        <w:rPr>
+          <w:rFonts w:ascii="Times New Roman" w:cs="Times New Roman" w:eastAsia="Times New Roman" w:hAnsi="Times New Roman"/>
+          <w:sz w:val="22"/>
+          <w:szCs w:val="22"/>
+          <w:vertAlign w:val="subscript"/>
+        </w:rPr>
+        <w:t xml:space="preserve">i</w:t>
+      </w:r>
+      <w:r>
+        <w:rPr>
+          <w:rFonts w:ascii="Times New Roman" w:cs="Times New Roman" w:eastAsia="Times New Roman" w:hAnsi="Times New Roman"/>
+          <w:i/>
+          <w:iCs/>
+          <w:sz w:val="22"/>
+          <w:szCs w:val="22"/>
+        </w:rPr>
+        <w:t xml:space="preserve"> − Q̄) / Σ(P̄</w:t>
+      </w:r>
+      <w:r>
+        <w:rPr>
+          <w:rFonts w:ascii="Times New Roman" w:cs="Times New Roman" w:eastAsia="Times New Roman" w:hAnsi="Times New Roman"/>
+          <w:sz w:val="22"/>
+          <w:szCs w:val="22"/>
+          <w:vertAlign w:val="subscript"/>
+        </w:rPr>
+        <w:t xml:space="preserve">i</w:t>
+      </w:r>
+      <w:r>
+        <w:rPr>
+          <w:rFonts w:ascii="Times New Roman" w:cs="Times New Roman" w:eastAsia="Times New Roman" w:hAnsi="Times New Roman"/>
+          <w:i/>
+          <w:iCs/>
+          <w:sz w:val="22"/>
+          <w:szCs w:val="22"/>
+        </w:rPr>
+        <w:t xml:space="preserve"> − P̄)²</w:t>
+      </w:r>
+      <w:r>
+        <w:rPr>
+          <w:rFonts w:ascii="Times New Roman" w:cs="Times New Roman" w:eastAsia="Times New Roman" w:hAnsi="Times New Roman"/>
+          <w:sz w:val="22"/>
+          <w:szCs w:val="22"/>
+        </w:rPr>
+        <w:ptab w:alignment="right" w:relativeTo="margin" w:leader="none"/>
+        <w:t xml:space="preserve">(14)</w:t>
+      </w:r>
+    </w:p>
+    <w:p>
+      <w:pPr>
+        <w:spacing w:after="120" w:line="276"/>
+        <w:jc w:val="both"/>
+      </w:pPr>
+      <w:r>
+        <w:rPr>
+          <w:rFonts w:ascii="Times New Roman" w:cs="Times New Roman" w:eastAsia="Times New Roman" w:hAnsi="Times New Roman"/>
+          <w:sz w:val="22"/>
+          <w:szCs w:val="22"/>
+        </w:rPr>
+        <w:t xml:space="preserve">then converts the slope to SI units (</w:t>
+      </w:r>
+      <w:r>
+        <w:rPr>
+          <w:rFonts w:ascii="Times New Roman" w:cs="Times New Roman" w:eastAsia="Times New Roman" w:hAnsi="Times New Roman"/>
+          <w:i/>
+          <w:iCs/>
+          <w:sz w:val="22"/>
+          <w:szCs w:val="22"/>
+        </w:rPr>
+        <w:t xml:space="preserve">b</w:t>
+      </w:r>
+      <w:r>
+        <w:rPr>
+          <w:rFonts w:ascii="Times New Roman" w:cs="Times New Roman" w:eastAsia="Times New Roman" w:hAnsi="Times New Roman"/>
+          <w:sz w:val="22"/>
+          <w:szCs w:val="22"/>
+          <w:vertAlign w:val="subscript"/>
+        </w:rPr>
+        <w:t xml:space="preserve">Pa</w:t>
+      </w:r>
+      <w:r>
+        <w:rPr>
+          <w:rFonts w:ascii="Times New Roman" w:cs="Times New Roman" w:eastAsia="Times New Roman" w:hAnsi="Times New Roman"/>
+          <w:i/>
+          <w:iCs/>
+          <w:sz w:val="22"/>
+          <w:szCs w:val="22"/>
+        </w:rPr>
+        <w:t xml:space="preserve"> = b</w:t>
+      </w:r>
+      <w:r>
+        <w:rPr>
+          <w:rFonts w:ascii="Times New Roman" w:cs="Times New Roman" w:eastAsia="Times New Roman" w:hAnsi="Times New Roman"/>
+          <w:sz w:val="22"/>
+          <w:szCs w:val="22"/>
+        </w:rPr>
+        <w:t xml:space="preserve">/1000 for pressures logged in kPa) and applies Eqs. (3)–(4) with </w:t>
+      </w:r>
+      <w:r>
+        <w:rPr>
+          <w:rFonts w:ascii="Times New Roman" w:cs="Times New Roman" w:eastAsia="Times New Roman" w:hAnsi="Times New Roman"/>
+          <w:i/>
+          <w:iCs/>
+          <w:sz w:val="22"/>
+          <w:szCs w:val="22"/>
+        </w:rPr>
+        <w:t xml:space="preserve">μ</w:t>
+      </w:r>
+      <w:r>
+        <w:rPr>
+          <w:rFonts w:ascii="Times New Roman" w:cs="Times New Roman" w:eastAsia="Times New Roman" w:hAnsi="Times New Roman"/>
+          <w:sz w:val="22"/>
+          <w:szCs w:val="22"/>
+        </w:rPr>
+        <w:t xml:space="preserve"> evaluated at the run-mean measured water temperature. Regressing against measured means is the analytical half of the design argument begun in Section 1.2: the regulation layer's job is only to keep each cluster of pressures near its target; the analysis never pretends the pressure was anything other than what the transducer recorded. Coarse regulation therefore widens the scatter of points along the fitted line — which R² reports honestly — but does not displace the line. The fit, the derived k and </w:t>
+      </w:r>
+      <w:r>
+        <w:rPr>
+          <w:rFonts w:ascii="Times New Roman" w:cs="Times New Roman" w:eastAsia="Times New Roman" w:hAnsi="Times New Roman"/>
+          <w:i/>
+          <w:iCs/>
+          <w:sz w:val="22"/>
+          <w:szCs w:val="22"/>
+        </w:rPr>
+        <w:t xml:space="preserve">d</w:t>
+      </w:r>
+      <w:r>
+        <w:rPr>
+          <w:rFonts w:ascii="Times New Roman" w:cs="Times New Roman" w:eastAsia="Times New Roman" w:hAnsi="Times New Roman"/>
+          <w:sz w:val="22"/>
+          <w:szCs w:val="22"/>
+          <w:vertAlign w:val="subscript"/>
+        </w:rPr>
+        <w:t xml:space="preserve">h</w:t>
+      </w:r>
+      <w:r>
+        <w:rPr>
+          <w:rFonts w:ascii="Times New Roman" w:cs="Times New Roman" w:eastAsia="Times New Roman" w:hAnsi="Times New Roman"/>
+          <w:sz w:val="22"/>
+          <w:szCs w:val="22"/>
+        </w:rPr>
+        <w:t xml:space="preserve">, and the R² verdict are computed automatically the moment volumes are entered, and every run leaves a complete, self-describing evidence trail on disk:</w:t>
+      </w:r>
+    </w:p>
+    <w:p>
+      <w:pPr>
+        <w:pStyle w:val="ListParagraph"/>
+        <w:numPr>
+          <w:ilvl w:val="0"/>
+          <w:numId w:val="2"/>
+        </w:numPr>
+        <w:spacing w:after="60" w:line="276"/>
+        <w:jc w:val="both"/>
+      </w:pPr>
+      <w:r>
+        <w:rPr>
+          <w:rFonts w:ascii="Times New Roman" w:cs="Times New Roman" w:eastAsia="Times New Roman" w:hAnsi="Times New Roman"/>
+          <w:sz w:val="22"/>
+          <w:szCs w:val="22"/>
+        </w:rPr>
+        <w:t xml:space="preserve">A 20 Hz time-series CSV — timestamp, phase, setpoint, measured pressure, valve command, diverter state, in-band flag, water temperature — sufficient to reconstruct the entire run.</w:t>
+      </w:r>
+    </w:p>
+    <w:p>
+      <w:pPr>
+        <w:pStyle w:val="ListParagraph"/>
+        <w:numPr>
+          <w:ilvl w:val="0"/>
+          <w:numId w:val="2"/>
+        </w:numPr>
+        <w:spacing w:after="60" w:line="276"/>
+        <w:jc w:val="both"/>
+      </w:pPr>
+      <w:r>
+        <w:rPr>
+          <w:rFonts w:ascii="Times New Roman" w:cs="Times New Roman" w:eastAsia="Times New Roman" w:hAnsi="Times New Roman"/>
+          <w:sz w:val="22"/>
+          <w:szCs w:val="22"/>
+        </w:rPr>
+        <w:t xml:space="preserve">A metadata JSON with the per-window statistics (mean, standard deviation, minimum, maximum, in-band fraction, sample count), the entered volumes, and the configuration that produced them.</w:t>
+      </w:r>
+    </w:p>
+    <w:p>
+      <w:pPr>
+        <w:pStyle w:val="ListParagraph"/>
+        <w:numPr>
+          <w:ilvl w:val="0"/>
+          <w:numId w:val="2"/>
+        </w:numPr>
+        <w:spacing w:after="60" w:line="276"/>
+        <w:jc w:val="both"/>
+      </w:pPr>
+      <w:r>
+        <w:rPr>
+          <w:rFonts w:ascii="Times New Roman" w:cs="Times New Roman" w:eastAsia="Times New Roman" w:hAnsi="Times New Roman"/>
+          <w:sz w:val="22"/>
+          <w:szCs w:val="22"/>
+        </w:rPr>
+        <w:t xml:space="preserve">An analysis JSON with the fit (slope, intercept, R²), k, pore size, viscosity, and temperature.</w:t>
+      </w:r>
+    </w:p>
+    <w:p>
+      <w:pPr>
+        <w:pStyle w:val="ListParagraph"/>
+        <w:numPr>
+          <w:ilvl w:val="0"/>
+          <w:numId w:val="2"/>
+        </w:numPr>
+        <w:spacing w:after="60" w:line="276"/>
+        <w:jc w:val="both"/>
+      </w:pPr>
+      <w:r>
+        <w:rPr>
+          <w:rFonts w:ascii="Times New Roman" w:cs="Times New Roman" w:eastAsia="Times New Roman" w:hAnsi="Times New Roman"/>
+          <w:sz w:val="22"/>
+          <w:szCs w:val="22"/>
+        </w:rPr>
+        <w:t xml:space="preserve">A publication-style chart image (Fig. 5), and a native spreadsheet workbook containing the raw table, the derived quantities, and a genuine embedded scatter chart with a linear trendline — so the spreadsheet recomputes the equation and R² live if a volume is corrected after the fact.</w:t>
+      </w:r>
+    </w:p>
+    <w:p>
+      <w:pPr>
+        <w:spacing w:after="60" w:before="160"/>
+        <w:jc w:val="center"/>
+      </w:pPr>
+      <w:r>
+        <w:drawing>
+          <wp:inline distT="0" distB="0" distL="0" distR="0">
+            <wp:extent cx="5143500" cy="3381375"/>
+            <wp:effectExtent t="0" r="0" b="0" l="0"/>
+            <wp:docPr id="1" name="" descr="" title=""/>
+            <wp:cNvGraphicFramePr>
+              <a:graphicFrameLocks xmlns:a="http://schemas.openxmlformats.org/drawingml/2006/main" noChangeAspect="1"/>
+            </wp:cNvGraphicFramePr>
+            <a:graphic xmlns:a="http://schemas.openxmlformats.org/drawingml/2006/main">
+              <a:graphicData uri="http://schemas.openxmlformats.org/drawingml/2006/picture">
+                <pic:pic xmlns:pic="http://schemas.openxmlformats.org/drawingml/2006/picture">
+                  <pic:nvPicPr>
+                    <pic:cNvPr id="0" name="" descr=""/>
+                    <pic:cNvPicPr>
+                      <a:picLocks noChangeAspect="1" noChangeArrowheads="1"/>
+                    </pic:cNvPicPr>
+                  </pic:nvPicPr>
+                  <pic:blipFill>
+                    <a:blip r:embed="rId11" cstate="none"/>
+                    <a:srcRect/>
+                    <a:stretch>
+                      <a:fillRect/>
+                    </a:stretch>
+                  </pic:blipFill>
+                  <pic:spPr bwMode="auto">
+                    <a:xfrm>
+                      <a:off x="0" y="0"/>
+                      <a:ext cx="5143500" cy="3381375"/>
+                    </a:xfrm>
+                    <a:prstGeom prst="rect">
+                      <a:avLst/>
+                    </a:prstGeom>
+                  </pic:spPr>
+                </pic:pic>
+              </a:graphicData>
+            </a:graphic>
+          </wp:inline>
+        </w:drawing>
+      </w:r>
+    </w:p>
+    <w:p>
+      <w:pPr>
+        <w:spacing w:after="200" w:before="80"/>
+        <w:jc w:val="center"/>
+      </w:pPr>
+      <w:r>
+        <w:rPr>
+          <w:rFonts w:ascii="Times New Roman" w:cs="Times New Roman" w:eastAsia="Times New Roman" w:hAnsi="Times New Roman"/>
+          <w:i/>
+          <w:iCs/>
+          <w:sz w:val="20"/>
+          <w:szCs w:val="20"/>
+        </w:rPr>
+        <w:t xml:space="preserve">Figure 5. The chart the instrument itself produces for the simulated run of Fig. 4: flow rate versus measured mean pressure, the fitted line (Eq. 2), and the derived permeability and pore size, annotated with the water temperature and viscosity used.</w:t>
+      </w:r>
+    </w:p>
+    <w:p>
+      <w:pPr>
+        <w:spacing w:after="120" w:before="240"/>
+      </w:pPr>
+      <w:r>
+        <w:rPr>
+          <w:rFonts w:ascii="Times New Roman" w:cs="Times New Roman" w:eastAsia="Times New Roman" w:hAnsi="Times New Roman"/>
+          <w:b/>
+          <w:bCs/>
+          <w:sz w:val="24"/>
+          <w:szCs w:val="24"/>
+        </w:rPr>
+        <w:t xml:space="preserve">7. Validation in Simulation</w:t>
+      </w:r>
+    </w:p>
+    <w:p>
+      <w:pPr>
+        <w:spacing w:after="100" w:before="160"/>
+      </w:pPr>
+      <w:r>
+        <w:rPr>
+          <w:rFonts w:ascii="Times New Roman" w:cs="Times New Roman" w:eastAsia="Times New Roman" w:hAnsi="Times New Roman"/>
+          <w:b/>
+          <w:bCs/>
+          <w:i/>
+          <w:iCs/>
+          <w:sz w:val="22"/>
+          <w:szCs w:val="22"/>
+        </w:rPr>
+        <w:t xml:space="preserve">7.1 Method</w:t>
+      </w:r>
+    </w:p>
+    <w:p>
+      <w:pPr>
+        <w:spacing w:after="120" w:line="276"/>
+        <w:jc w:val="both"/>
+      </w:pPr>
+      <w:r>
+        <w:rPr>
+          <w:rFonts w:ascii="Times New Roman" w:cs="Times New Roman" w:eastAsia="Times New Roman" w:hAnsi="Times New Roman"/>
+          <w:sz w:val="22"/>
+          <w:szCs w:val="22"/>
+        </w:rPr>
+        <w:t xml:space="preserve">All control logic, sequencing, safety behavior, and analysis were exercised against the mock plant of Eq. (8), configured with a 100 kPa supply, the ±8 kPa / 25 s wobble, Gaussian process noise, ±0.15 kPa sensor noise, and a Darcy-consistent permeate flow law whose magnitude scales as 1/μ with the simulated water temperature — so the plant physically embodies the viscosity dependence the analysis is supposed to cancel. The runs reported below execute the exact production code path (sequencer, PID, safety, analysis); only the clock is accelerated, which is possible precisely because every module takes time as an input rather than reading it.</w:t>
+      </w:r>
+    </w:p>
+    <w:p>
+      <w:pPr>
+        <w:spacing w:after="100" w:before="160"/>
+      </w:pPr>
+      <w:r>
+        <w:rPr>
+          <w:rFonts w:ascii="Times New Roman" w:cs="Times New Roman" w:eastAsia="Times New Roman" w:hAnsi="Times New Roman"/>
+          <w:b/>
+          <w:bCs/>
+          <w:i/>
+          <w:iCs/>
+          <w:sz w:val="22"/>
+          <w:szCs w:val="22"/>
+        </w:rPr>
+        <w:t xml:space="preserve">7.2 Disturbance rejection</w:t>
+      </w:r>
+    </w:p>
+    <w:p>
+      <w:pPr>
+        <w:spacing w:after="120" w:line="276"/>
+        <w:jc w:val="both"/>
+      </w:pPr>
+      <w:r>
+        <w:rPr>
+          <w:rFonts w:ascii="Times New Roman" w:cs="Times New Roman" w:eastAsia="Times New Roman" w:hAnsi="Times New Roman"/>
+          <w:sz w:val="22"/>
+          <w:szCs w:val="22"/>
+        </w:rPr>
+        <w:t xml:space="preserve">Table 1 summarizes a complete 20/40/60 kPa sequence at 21 °C under the full disturbance model (the run of Fig. 4). The closed loop held every setpoint with a standard deviation of 0.21–0.69 kPa — an order of magnitude inside the ±10% acceptance band — and 100% of collection-window samples in band, while the valve command counter-modulated by 7–14% of full scale to absorb the supply wobble. The bottom panel of Fig. 4 makes the division of labor visible: the disturbance appears in the actuator, so that it does not appear in the pressure.</w:t>
       </w:r>
     </w:p>
     <w:tbl>
@@ -1008,15 +3258,16 @@
         </w:tblBorders>
       </w:tblPr>
       <w:tblGrid>
-        <w:gridCol w:w="2340"/>
-        <w:gridCol w:w="2340"/>
-        <w:gridCol w:w="2340"/>
-        <w:gridCol w:w="2340"/>
+        <w:gridCol w:w="1720"/>
+        <w:gridCol w:w="1720"/>
+        <w:gridCol w:w="1870"/>
+        <w:gridCol w:w="1870"/>
+        <w:gridCol w:w="2180"/>
       </w:tblGrid>
       <w:tr>
         <w:tc>
           <w:tcPr>
-            <w:tcW w:type="dxa" w:w="2340"/>
+            <w:tcW w:type="dxa" w:w="1720"/>
             <w:shd w:fill="E8EDF4" w:val="clear"/>
             <w:tcMar>
               <w:top w:type="dxa" w:w="60"/>
@@ -1043,7 +3294,7 @@
         </w:tc>
         <w:tc>
           <w:tcPr>
-            <w:tcW w:type="dxa" w:w="2340"/>
+            <w:tcW w:type="dxa" w:w="1720"/>
             <w:shd w:fill="E8EDF4" w:val="clear"/>
             <w:tcMar>
               <w:top w:type="dxa" w:w="60"/>
@@ -1070,7 +3321,7 @@
         </w:tc>
         <w:tc>
           <w:tcPr>
-            <w:tcW w:type="dxa" w:w="2340"/>
+            <w:tcW w:type="dxa" w:w="1870"/>
             <w:shd w:fill="E8EDF4" w:val="clear"/>
             <w:tcMar>
               <w:top w:type="dxa" w:w="60"/>
@@ -1097,7 +3348,7 @@
         </w:tc>
         <w:tc>
           <w:tcPr>
-            <w:tcW w:type="dxa" w:w="2340"/>
+            <w:tcW w:type="dxa" w:w="1870"/>
             <w:shd w:fill="E8EDF4" w:val="clear"/>
             <w:tcMar>
               <w:top w:type="dxa" w:w="60"/>
@@ -1122,11 +3373,38 @@
             </w:r>
           </w:p>
         </w:tc>
+        <w:tc>
+          <w:tcPr>
+            <w:tcW w:type="dxa" w:w="2180"/>
+            <w:shd w:fill="E8EDF4" w:val="clear"/>
+            <w:tcMar>
+              <w:top w:type="dxa" w:w="60"/>
+              <w:left w:type="dxa" w:w="100"/>
+              <w:bottom w:type="dxa" w:w="60"/>
+              <w:right w:type="dxa" w:w="100"/>
+            </w:tcMar>
+          </w:tcPr>
+          <w:p>
+            <w:pPr>
+              <w:jc w:val="center"/>
+            </w:pPr>
+            <w:r>
+              <w:rPr>
+                <w:rFonts w:ascii="Times New Roman" w:cs="Times New Roman" w:eastAsia="Times New Roman" w:hAnsi="Times New Roman"/>
+                <w:b/>
+                <w:bCs/>
+                <w:sz w:val="20"/>
+                <w:szCs w:val="20"/>
+              </w:rPr>
+              <w:t xml:space="preserve">Valve span (%FS)</w:t>
+            </w:r>
+          </w:p>
+        </w:tc>
       </w:tr>
       <w:tr>
         <w:tc>
           <w:tcPr>
-            <w:tcW w:type="dxa" w:w="2340"/>
+            <w:tcW w:type="dxa" w:w="1720"/>
             <w:tcMar>
               <w:top w:type="dxa" w:w="60"/>
               <w:left w:type="dxa" w:w="100"/>
@@ -1152,7 +3430,7 @@
         </w:tc>
         <w:tc>
           <w:tcPr>
-            <w:tcW w:type="dxa" w:w="2340"/>
+            <w:tcW w:type="dxa" w:w="1720"/>
             <w:tcMar>
               <w:top w:type="dxa" w:w="60"/>
               <w:left w:type="dxa" w:w="100"/>
@@ -1172,13 +3450,13 @@
                 <w:sz w:val="20"/>
                 <w:szCs w:val="20"/>
               </w:rPr>
-              <w:t xml:space="preserve">19.46</w:t>
+              <w:t xml:space="preserve">20.09</w:t>
             </w:r>
           </w:p>
         </w:tc>
         <w:tc>
           <w:tcPr>
-            <w:tcW w:type="dxa" w:w="2340"/>
+            <w:tcW w:type="dxa" w:w="1870"/>
             <w:tcMar>
               <w:top w:type="dxa" w:w="60"/>
               <w:left w:type="dxa" w:w="100"/>
@@ -1198,13 +3476,13 @@
                 <w:sz w:val="20"/>
                 <w:szCs w:val="20"/>
               </w:rPr>
-              <w:t xml:space="preserve">0.42</w:t>
+              <w:t xml:space="preserve">0.21</w:t>
             </w:r>
           </w:p>
         </w:tc>
         <w:tc>
           <w:tcPr>
-            <w:tcW w:type="dxa" w:w="2340"/>
+            <w:tcW w:type="dxa" w:w="1870"/>
             <w:tcMar>
               <w:top w:type="dxa" w:w="60"/>
               <w:left w:type="dxa" w:w="100"/>
@@ -1228,11 +3506,37 @@
             </w:r>
           </w:p>
         </w:tc>
+        <w:tc>
+          <w:tcPr>
+            <w:tcW w:type="dxa" w:w="2180"/>
+            <w:tcMar>
+              <w:top w:type="dxa" w:w="60"/>
+              <w:left w:type="dxa" w:w="100"/>
+              <w:bottom w:type="dxa" w:w="60"/>
+              <w:right w:type="dxa" w:w="100"/>
+            </w:tcMar>
+          </w:tcPr>
+          <w:p>
+            <w:pPr>
+              <w:jc w:val="center"/>
+            </w:pPr>
+            <w:r>
+              <w:rPr>
+                <w:rFonts w:ascii="Times New Roman" w:cs="Times New Roman" w:eastAsia="Times New Roman" w:hAnsi="Times New Roman"/>
+                <w:b w:val="false"/>
+                <w:bCs w:val="false"/>
+                <w:sz w:val="20"/>
+                <w:szCs w:val="20"/>
+              </w:rPr>
+              <w:t xml:space="preserve">7.0</w:t>
+            </w:r>
+          </w:p>
+        </w:tc>
       </w:tr>
       <w:tr>
         <w:tc>
           <w:tcPr>
-            <w:tcW w:type="dxa" w:w="2340"/>
+            <w:tcW w:type="dxa" w:w="1720"/>
             <w:tcMar>
               <w:top w:type="dxa" w:w="60"/>
               <w:left w:type="dxa" w:w="100"/>
@@ -1258,7 +3562,7 @@
         </w:tc>
         <w:tc>
           <w:tcPr>
-            <w:tcW w:type="dxa" w:w="2340"/>
+            <w:tcW w:type="dxa" w:w="1720"/>
             <w:tcMar>
               <w:top w:type="dxa" w:w="60"/>
               <w:left w:type="dxa" w:w="100"/>
@@ -1278,13 +3582,13 @@
                 <w:sz w:val="20"/>
                 <w:szCs w:val="20"/>
               </w:rPr>
-              <w:t xml:space="preserve">39.53</w:t>
+              <w:t xml:space="preserve">40.08</w:t>
             </w:r>
           </w:p>
         </w:tc>
         <w:tc>
           <w:tcPr>
-            <w:tcW w:type="dxa" w:w="2340"/>
+            <w:tcW w:type="dxa" w:w="1870"/>
             <w:tcMar>
               <w:top w:type="dxa" w:w="60"/>
               <w:left w:type="dxa" w:w="100"/>
@@ -1304,13 +3608,13 @@
                 <w:sz w:val="20"/>
                 <w:szCs w:val="20"/>
               </w:rPr>
-              <w:t xml:space="preserve">0.37</w:t>
+              <w:t xml:space="preserve">0.28</w:t>
             </w:r>
           </w:p>
         </w:tc>
         <w:tc>
           <w:tcPr>
-            <w:tcW w:type="dxa" w:w="2340"/>
+            <w:tcW w:type="dxa" w:w="1870"/>
             <w:tcMar>
               <w:top w:type="dxa" w:w="60"/>
               <w:left w:type="dxa" w:w="100"/>
@@ -1334,11 +3638,37 @@
             </w:r>
           </w:p>
         </w:tc>
+        <w:tc>
+          <w:tcPr>
+            <w:tcW w:type="dxa" w:w="2180"/>
+            <w:tcMar>
+              <w:top w:type="dxa" w:w="60"/>
+              <w:left w:type="dxa" w:w="100"/>
+              <w:bottom w:type="dxa" w:w="60"/>
+              <w:right w:type="dxa" w:w="100"/>
+            </w:tcMar>
+          </w:tcPr>
+          <w:p>
+            <w:pPr>
+              <w:jc w:val="center"/>
+            </w:pPr>
+            <w:r>
+              <w:rPr>
+                <w:rFonts w:ascii="Times New Roman" w:cs="Times New Roman" w:eastAsia="Times New Roman" w:hAnsi="Times New Roman"/>
+                <w:b w:val="false"/>
+                <w:bCs w:val="false"/>
+                <w:sz w:val="20"/>
+                <w:szCs w:val="20"/>
+              </w:rPr>
+              <w:t xml:space="preserve">8.9</w:t>
+            </w:r>
+          </w:p>
+        </w:tc>
       </w:tr>
       <w:tr>
         <w:tc>
           <w:tcPr>
-            <w:tcW w:type="dxa" w:w="2340"/>
+            <w:tcW w:type="dxa" w:w="1720"/>
             <w:tcMar>
               <w:top w:type="dxa" w:w="60"/>
               <w:left w:type="dxa" w:w="100"/>
@@ -1364,7 +3694,7 @@
         </w:tc>
         <w:tc>
           <w:tcPr>
-            <w:tcW w:type="dxa" w:w="2340"/>
+            <w:tcW w:type="dxa" w:w="1720"/>
             <w:tcMar>
               <w:top w:type="dxa" w:w="60"/>
               <w:left w:type="dxa" w:w="100"/>
@@ -1384,13 +3714,13 @@
                 <w:sz w:val="20"/>
                 <w:szCs w:val="20"/>
               </w:rPr>
-              <w:t xml:space="preserve">59.07</w:t>
+              <w:t xml:space="preserve">60.06</w:t>
             </w:r>
           </w:p>
         </w:tc>
         <w:tc>
           <w:tcPr>
-            <w:tcW w:type="dxa" w:w="2340"/>
+            <w:tcW w:type="dxa" w:w="1870"/>
             <w:tcMar>
               <w:top w:type="dxa" w:w="60"/>
               <w:left w:type="dxa" w:w="100"/>
@@ -1410,13 +3740,13 @@
                 <w:sz w:val="20"/>
                 <w:szCs w:val="20"/>
               </w:rPr>
-              <w:t xml:space="preserve">0.77</w:t>
+              <w:t xml:space="preserve">0.69</w:t>
             </w:r>
           </w:p>
         </w:tc>
         <w:tc>
           <w:tcPr>
-            <w:tcW w:type="dxa" w:w="2340"/>
+            <w:tcW w:type="dxa" w:w="1870"/>
             <w:tcMar>
               <w:top w:type="dxa" w:w="60"/>
               <w:left w:type="dxa" w:w="100"/>
@@ -1440,6 +3770,32 @@
             </w:r>
           </w:p>
         </w:tc>
+        <w:tc>
+          <w:tcPr>
+            <w:tcW w:type="dxa" w:w="2180"/>
+            <w:tcMar>
+              <w:top w:type="dxa" w:w="60"/>
+              <w:left w:type="dxa" w:w="100"/>
+              <w:bottom w:type="dxa" w:w="60"/>
+              <w:right w:type="dxa" w:w="100"/>
+            </w:tcMar>
+          </w:tcPr>
+          <w:p>
+            <w:pPr>
+              <w:jc w:val="center"/>
+            </w:pPr>
+            <w:r>
+              <w:rPr>
+                <w:rFonts w:ascii="Times New Roman" w:cs="Times New Roman" w:eastAsia="Times New Roman" w:hAnsi="Times New Roman"/>
+                <w:b w:val="false"/>
+                <w:bCs w:val="false"/>
+                <w:sz w:val="20"/>
+                <w:szCs w:val="20"/>
+              </w:rPr>
+              <w:t xml:space="preserve">13.7</w:t>
+            </w:r>
+          </w:p>
+        </w:tc>
       </w:tr>
     </w:tbl>
     <w:p>
@@ -1455,7 +3811,7 @@
           <w:sz w:val="20"/>
           <w:szCs w:val="20"/>
         </w:rPr>
-        <w:t xml:space="preserve">Table 1. Setpoint tracking under a ±8 kPa oscillating supply disturbance (simulation).</w:t>
+        <w:t xml:space="preserve">Table 1. Setpoint tracking under the ±8 kPa / 25 s supply disturbance (simulation, 1200 samples per window). “Valve span” is the peak-to-peak counter-modulation of the valve command during the collection window.</w:t>
       </w:r>
     </w:p>
     <w:p>
@@ -1472,7 +3828,7 @@
           <w:sz w:val="22"/>
           <w:szCs w:val="22"/>
         </w:rPr>
-        <w:t xml:space="preserve">4.2 Temperature invariance of the derived permeability</w:t>
+        <w:t xml:space="preserve">7.3 Temperature invariance of the derived permeability</w:t>
       </w:r>
     </w:p>
     <w:p>
@@ -1486,7 +3842,576 @@
           <w:sz w:val="22"/>
           <w:szCs w:val="22"/>
         </w:rPr>
-        <w:t xml:space="preserve">Permeability is a geometric property of the specimen; viscosity and flow rate vary with temperature but must cancel in Eq. (3). Running the identical simulated specimen at 20, 25, 30, and 35 °C, the fitted slope varied with temperature as expected while the derived k remained constant to five significant figures (5.4253 × 10⁻¹³ m², 0.000% spread) — a built-in physical consistency check that will also serve as a quality-control diagnostic on the real instrument.</w:t>
+        <w:t xml:space="preserve">Running the identical simulated specimen at 20, 25, 30, and 35 °C (Table 2), the raw fitted slope grew by 39% — exactly tracking 1/μ as the thinner water flowed faster — while the derived permeability remained 1.4392 × 10⁻¹² m² to five significant figures at all four temperatures (0.000% spread). The cancellation predicted in Section 2.3 holds through the entire implemented pipeline: simulated physics, control, sequencing, statistics, viscosity model, and fit. On the physical instrument this same sweep becomes a commissioning diagnostic: a k that drifts with water temperature indicts the measurement chain, not the membrane.</w:t>
+      </w:r>
+    </w:p>
+    <w:tbl>
+      <w:tblPr>
+        <w:tblW w:type="dxa" w:w="9400"/>
+        <w:tblBorders>
+          <w:top w:val="single" w:color="auto" w:sz="4"/>
+          <w:left w:val="single" w:color="auto" w:sz="4"/>
+          <w:bottom w:val="single" w:color="auto" w:sz="4"/>
+          <w:right w:val="single" w:color="auto" w:sz="4"/>
+          <w:insideH w:val="single" w:color="auto" w:sz="4"/>
+          <w:insideV w:val="single" w:color="auto" w:sz="4"/>
+        </w:tblBorders>
+      </w:tblPr>
+      <w:tblGrid>
+        <w:gridCol w:w="1900"/>
+        <w:gridCol w:w="2200"/>
+        <w:gridCol w:w="2650"/>
+        <w:gridCol w:w="2650"/>
+      </w:tblGrid>
+      <w:tr>
+        <w:tc>
+          <w:tcPr>
+            <w:tcW w:type="dxa" w:w="1900"/>
+            <w:shd w:fill="E8EDF4" w:val="clear"/>
+            <w:tcMar>
+              <w:top w:type="dxa" w:w="60"/>
+              <w:left w:type="dxa" w:w="100"/>
+              <w:bottom w:type="dxa" w:w="60"/>
+              <w:right w:type="dxa" w:w="100"/>
+            </w:tcMar>
+          </w:tcPr>
+          <w:p>
+            <w:pPr>
+              <w:jc w:val="center"/>
+            </w:pPr>
+            <w:r>
+              <w:rPr>
+                <w:rFonts w:ascii="Times New Roman" w:cs="Times New Roman" w:eastAsia="Times New Roman" w:hAnsi="Times New Roman"/>
+                <w:b/>
+                <w:bCs/>
+                <w:sz w:val="20"/>
+                <w:szCs w:val="20"/>
+              </w:rPr>
+              <w:t xml:space="preserve">T (°C)</w:t>
+            </w:r>
+          </w:p>
+        </w:tc>
+        <w:tc>
+          <w:tcPr>
+            <w:tcW w:type="dxa" w:w="2200"/>
+            <w:shd w:fill="E8EDF4" w:val="clear"/>
+            <w:tcMar>
+              <w:top w:type="dxa" w:w="60"/>
+              <w:left w:type="dxa" w:w="100"/>
+              <w:bottom w:type="dxa" w:w="60"/>
+              <w:right w:type="dxa" w:w="100"/>
+            </w:tcMar>
+          </w:tcPr>
+          <w:p>
+            <w:pPr>
+              <w:jc w:val="center"/>
+            </w:pPr>
+            <w:r>
+              <w:rPr>
+                <w:rFonts w:ascii="Times New Roman" w:cs="Times New Roman" w:eastAsia="Times New Roman" w:hAnsi="Times New Roman"/>
+                <w:b/>
+                <w:bCs/>
+                <w:sz w:val="20"/>
+                <w:szCs w:val="20"/>
+              </w:rPr>
+              <w:t xml:space="preserve">μ (mPa·s)</w:t>
+            </w:r>
+          </w:p>
+        </w:tc>
+        <w:tc>
+          <w:tcPr>
+            <w:tcW w:type="dxa" w:w="2650"/>
+            <w:shd w:fill="E8EDF4" w:val="clear"/>
+            <w:tcMar>
+              <w:top w:type="dxa" w:w="60"/>
+              <w:left w:type="dxa" w:w="100"/>
+              <w:bottom w:type="dxa" w:w="60"/>
+              <w:right w:type="dxa" w:w="100"/>
+            </w:tcMar>
+          </w:tcPr>
+          <w:p>
+            <w:pPr>
+              <w:jc w:val="center"/>
+            </w:pPr>
+            <w:r>
+              <w:rPr>
+                <w:rFonts w:ascii="Times New Roman" w:cs="Times New Roman" w:eastAsia="Times New Roman" w:hAnsi="Times New Roman"/>
+                <w:b/>
+                <w:bCs/>
+                <w:sz w:val="20"/>
+                <w:szCs w:val="20"/>
+              </w:rPr>
+              <w:t xml:space="preserve">Slope ((m³/s)/kPa)</w:t>
+            </w:r>
+          </w:p>
+        </w:tc>
+        <w:tc>
+          <w:tcPr>
+            <w:tcW w:type="dxa" w:w="2650"/>
+            <w:shd w:fill="E8EDF4" w:val="clear"/>
+            <w:tcMar>
+              <w:top w:type="dxa" w:w="60"/>
+              <w:left w:type="dxa" w:w="100"/>
+              <w:bottom w:type="dxa" w:w="60"/>
+              <w:right w:type="dxa" w:w="100"/>
+            </w:tcMar>
+          </w:tcPr>
+          <w:p>
+            <w:pPr>
+              <w:jc w:val="center"/>
+            </w:pPr>
+            <w:r>
+              <w:rPr>
+                <w:rFonts w:ascii="Times New Roman" w:cs="Times New Roman" w:eastAsia="Times New Roman" w:hAnsi="Times New Roman"/>
+                <w:b/>
+                <w:bCs/>
+                <w:sz w:val="20"/>
+                <w:szCs w:val="20"/>
+              </w:rPr>
+              <w:t xml:space="preserve">k (m²)</w:t>
+            </w:r>
+          </w:p>
+        </w:tc>
+      </w:tr>
+      <w:tr>
+        <w:tc>
+          <w:tcPr>
+            <w:tcW w:type="dxa" w:w="1900"/>
+            <w:tcMar>
+              <w:top w:type="dxa" w:w="60"/>
+              <w:left w:type="dxa" w:w="100"/>
+              <w:bottom w:type="dxa" w:w="60"/>
+              <w:right w:type="dxa" w:w="100"/>
+            </w:tcMar>
+          </w:tcPr>
+          <w:p>
+            <w:pPr>
+              <w:jc w:val="center"/>
+            </w:pPr>
+            <w:r>
+              <w:rPr>
+                <w:rFonts w:ascii="Times New Roman" w:cs="Times New Roman" w:eastAsia="Times New Roman" w:hAnsi="Times New Roman"/>
+                <w:b w:val="false"/>
+                <w:bCs w:val="false"/>
+                <w:sz w:val="20"/>
+                <w:szCs w:val="20"/>
+              </w:rPr>
+              <w:t xml:space="preserve">20</w:t>
+            </w:r>
+          </w:p>
+        </w:tc>
+        <w:tc>
+          <w:tcPr>
+            <w:tcW w:type="dxa" w:w="2200"/>
+            <w:tcMar>
+              <w:top w:type="dxa" w:w="60"/>
+              <w:left w:type="dxa" w:w="100"/>
+              <w:bottom w:type="dxa" w:w="60"/>
+              <w:right w:type="dxa" w:w="100"/>
+            </w:tcMar>
+          </w:tcPr>
+          <w:p>
+            <w:pPr>
+              <w:jc w:val="center"/>
+            </w:pPr>
+            <w:r>
+              <w:rPr>
+                <w:rFonts w:ascii="Times New Roman" w:cs="Times New Roman" w:eastAsia="Times New Roman" w:hAnsi="Times New Roman"/>
+                <w:b w:val="false"/>
+                <w:bCs w:val="false"/>
+                <w:sz w:val="20"/>
+                <w:szCs w:val="20"/>
+              </w:rPr>
+              <w:t xml:space="preserve">1.002</w:t>
+            </w:r>
+          </w:p>
+        </w:tc>
+        <w:tc>
+          <w:tcPr>
+            <w:tcW w:type="dxa" w:w="2650"/>
+            <w:tcMar>
+              <w:top w:type="dxa" w:w="60"/>
+              <w:left w:type="dxa" w:w="100"/>
+              <w:bottom w:type="dxa" w:w="60"/>
+              <w:right w:type="dxa" w:w="100"/>
+            </w:tcMar>
+          </w:tcPr>
+          <w:p>
+            <w:pPr>
+              <w:jc w:val="center"/>
+            </w:pPr>
+            <w:r>
+              <w:rPr>
+                <w:rFonts w:ascii="Times New Roman" w:cs="Times New Roman" w:eastAsia="Times New Roman" w:hAnsi="Times New Roman"/>
+                <w:b w:val="false"/>
+                <w:bCs w:val="false"/>
+                <w:sz w:val="20"/>
+                <w:szCs w:val="20"/>
+              </w:rPr>
+              <w:t xml:space="preserve">7.859 × 10⁻⁷</w:t>
+            </w:r>
+          </w:p>
+        </w:tc>
+        <w:tc>
+          <w:tcPr>
+            <w:tcW w:type="dxa" w:w="2650"/>
+            <w:tcMar>
+              <w:top w:type="dxa" w:w="60"/>
+              <w:left w:type="dxa" w:w="100"/>
+              <w:bottom w:type="dxa" w:w="60"/>
+              <w:right w:type="dxa" w:w="100"/>
+            </w:tcMar>
+          </w:tcPr>
+          <w:p>
+            <w:pPr>
+              <w:jc w:val="center"/>
+            </w:pPr>
+            <w:r>
+              <w:rPr>
+                <w:rFonts w:ascii="Times New Roman" w:cs="Times New Roman" w:eastAsia="Times New Roman" w:hAnsi="Times New Roman"/>
+                <w:b w:val="false"/>
+                <w:bCs w:val="false"/>
+                <w:sz w:val="20"/>
+                <w:szCs w:val="20"/>
+              </w:rPr>
+              <w:t xml:space="preserve">1.4392 × 10⁻¹²</w:t>
+            </w:r>
+          </w:p>
+        </w:tc>
+      </w:tr>
+      <w:tr>
+        <w:tc>
+          <w:tcPr>
+            <w:tcW w:type="dxa" w:w="1900"/>
+            <w:tcMar>
+              <w:top w:type="dxa" w:w="60"/>
+              <w:left w:type="dxa" w:w="100"/>
+              <w:bottom w:type="dxa" w:w="60"/>
+              <w:right w:type="dxa" w:w="100"/>
+            </w:tcMar>
+          </w:tcPr>
+          <w:p>
+            <w:pPr>
+              <w:jc w:val="center"/>
+            </w:pPr>
+            <w:r>
+              <w:rPr>
+                <w:rFonts w:ascii="Times New Roman" w:cs="Times New Roman" w:eastAsia="Times New Roman" w:hAnsi="Times New Roman"/>
+                <w:b w:val="false"/>
+                <w:bCs w:val="false"/>
+                <w:sz w:val="20"/>
+                <w:szCs w:val="20"/>
+              </w:rPr>
+              <w:t xml:space="preserve">25</w:t>
+            </w:r>
+          </w:p>
+        </w:tc>
+        <w:tc>
+          <w:tcPr>
+            <w:tcW w:type="dxa" w:w="2200"/>
+            <w:tcMar>
+              <w:top w:type="dxa" w:w="60"/>
+              <w:left w:type="dxa" w:w="100"/>
+              <w:bottom w:type="dxa" w:w="60"/>
+              <w:right w:type="dxa" w:w="100"/>
+            </w:tcMar>
+          </w:tcPr>
+          <w:p>
+            <w:pPr>
+              <w:jc w:val="center"/>
+            </w:pPr>
+            <w:r>
+              <w:rPr>
+                <w:rFonts w:ascii="Times New Roman" w:cs="Times New Roman" w:eastAsia="Times New Roman" w:hAnsi="Times New Roman"/>
+                <w:b w:val="false"/>
+                <w:bCs w:val="false"/>
+                <w:sz w:val="20"/>
+                <w:szCs w:val="20"/>
+              </w:rPr>
+              <w:t xml:space="preserve">0.890</w:t>
+            </w:r>
+          </w:p>
+        </w:tc>
+        <w:tc>
+          <w:tcPr>
+            <w:tcW w:type="dxa" w:w="2650"/>
+            <w:tcMar>
+              <w:top w:type="dxa" w:w="60"/>
+              <w:left w:type="dxa" w:w="100"/>
+              <w:bottom w:type="dxa" w:w="60"/>
+              <w:right w:type="dxa" w:w="100"/>
+            </w:tcMar>
+          </w:tcPr>
+          <w:p>
+            <w:pPr>
+              <w:jc w:val="center"/>
+            </w:pPr>
+            <w:r>
+              <w:rPr>
+                <w:rFonts w:ascii="Times New Roman" w:cs="Times New Roman" w:eastAsia="Times New Roman" w:hAnsi="Times New Roman"/>
+                <w:b w:val="false"/>
+                <w:bCs w:val="false"/>
+                <w:sz w:val="20"/>
+                <w:szCs w:val="20"/>
+              </w:rPr>
+              <w:t xml:space="preserve">8.842 × 10⁻⁷</w:t>
+            </w:r>
+          </w:p>
+        </w:tc>
+        <w:tc>
+          <w:tcPr>
+            <w:tcW w:type="dxa" w:w="2650"/>
+            <w:tcMar>
+              <w:top w:type="dxa" w:w="60"/>
+              <w:left w:type="dxa" w:w="100"/>
+              <w:bottom w:type="dxa" w:w="60"/>
+              <w:right w:type="dxa" w:w="100"/>
+            </w:tcMar>
+          </w:tcPr>
+          <w:p>
+            <w:pPr>
+              <w:jc w:val="center"/>
+            </w:pPr>
+            <w:r>
+              <w:rPr>
+                <w:rFonts w:ascii="Times New Roman" w:cs="Times New Roman" w:eastAsia="Times New Roman" w:hAnsi="Times New Roman"/>
+                <w:b w:val="false"/>
+                <w:bCs w:val="false"/>
+                <w:sz w:val="20"/>
+                <w:szCs w:val="20"/>
+              </w:rPr>
+              <w:t xml:space="preserve">1.4392 × 10⁻¹²</w:t>
+            </w:r>
+          </w:p>
+        </w:tc>
+      </w:tr>
+      <w:tr>
+        <w:tc>
+          <w:tcPr>
+            <w:tcW w:type="dxa" w:w="1900"/>
+            <w:tcMar>
+              <w:top w:type="dxa" w:w="60"/>
+              <w:left w:type="dxa" w:w="100"/>
+              <w:bottom w:type="dxa" w:w="60"/>
+              <w:right w:type="dxa" w:w="100"/>
+            </w:tcMar>
+          </w:tcPr>
+          <w:p>
+            <w:pPr>
+              <w:jc w:val="center"/>
+            </w:pPr>
+            <w:r>
+              <w:rPr>
+                <w:rFonts w:ascii="Times New Roman" w:cs="Times New Roman" w:eastAsia="Times New Roman" w:hAnsi="Times New Roman"/>
+                <w:b w:val="false"/>
+                <w:bCs w:val="false"/>
+                <w:sz w:val="20"/>
+                <w:szCs w:val="20"/>
+              </w:rPr>
+              <w:t xml:space="preserve">30</w:t>
+            </w:r>
+          </w:p>
+        </w:tc>
+        <w:tc>
+          <w:tcPr>
+            <w:tcW w:type="dxa" w:w="2200"/>
+            <w:tcMar>
+              <w:top w:type="dxa" w:w="60"/>
+              <w:left w:type="dxa" w:w="100"/>
+              <w:bottom w:type="dxa" w:w="60"/>
+              <w:right w:type="dxa" w:w="100"/>
+            </w:tcMar>
+          </w:tcPr>
+          <w:p>
+            <w:pPr>
+              <w:jc w:val="center"/>
+            </w:pPr>
+            <w:r>
+              <w:rPr>
+                <w:rFonts w:ascii="Times New Roman" w:cs="Times New Roman" w:eastAsia="Times New Roman" w:hAnsi="Times New Roman"/>
+                <w:b w:val="false"/>
+                <w:bCs w:val="false"/>
+                <w:sz w:val="20"/>
+                <w:szCs w:val="20"/>
+              </w:rPr>
+              <w:t xml:space="preserve">0.797</w:t>
+            </w:r>
+          </w:p>
+        </w:tc>
+        <w:tc>
+          <w:tcPr>
+            <w:tcW w:type="dxa" w:w="2650"/>
+            <w:tcMar>
+              <w:top w:type="dxa" w:w="60"/>
+              <w:left w:type="dxa" w:w="100"/>
+              <w:bottom w:type="dxa" w:w="60"/>
+              <w:right w:type="dxa" w:w="100"/>
+            </w:tcMar>
+          </w:tcPr>
+          <w:p>
+            <w:pPr>
+              <w:jc w:val="center"/>
+            </w:pPr>
+            <w:r>
+              <w:rPr>
+                <w:rFonts w:ascii="Times New Roman" w:cs="Times New Roman" w:eastAsia="Times New Roman" w:hAnsi="Times New Roman"/>
+                <w:b w:val="false"/>
+                <w:bCs w:val="false"/>
+                <w:sz w:val="20"/>
+                <w:szCs w:val="20"/>
+              </w:rPr>
+              <w:t xml:space="preserve">9.875 × 10⁻⁷</w:t>
+            </w:r>
+          </w:p>
+        </w:tc>
+        <w:tc>
+          <w:tcPr>
+            <w:tcW w:type="dxa" w:w="2650"/>
+            <w:tcMar>
+              <w:top w:type="dxa" w:w="60"/>
+              <w:left w:type="dxa" w:w="100"/>
+              <w:bottom w:type="dxa" w:w="60"/>
+              <w:right w:type="dxa" w:w="100"/>
+            </w:tcMar>
+          </w:tcPr>
+          <w:p>
+            <w:pPr>
+              <w:jc w:val="center"/>
+            </w:pPr>
+            <w:r>
+              <w:rPr>
+                <w:rFonts w:ascii="Times New Roman" w:cs="Times New Roman" w:eastAsia="Times New Roman" w:hAnsi="Times New Roman"/>
+                <w:b w:val="false"/>
+                <w:bCs w:val="false"/>
+                <w:sz w:val="20"/>
+                <w:szCs w:val="20"/>
+              </w:rPr>
+              <w:t xml:space="preserve">1.4392 × 10⁻¹²</w:t>
+            </w:r>
+          </w:p>
+        </w:tc>
+      </w:tr>
+      <w:tr>
+        <w:tc>
+          <w:tcPr>
+            <w:tcW w:type="dxa" w:w="1900"/>
+            <w:tcMar>
+              <w:top w:type="dxa" w:w="60"/>
+              <w:left w:type="dxa" w:w="100"/>
+              <w:bottom w:type="dxa" w:w="60"/>
+              <w:right w:type="dxa" w:w="100"/>
+            </w:tcMar>
+          </w:tcPr>
+          <w:p>
+            <w:pPr>
+              <w:jc w:val="center"/>
+            </w:pPr>
+            <w:r>
+              <w:rPr>
+                <w:rFonts w:ascii="Times New Roman" w:cs="Times New Roman" w:eastAsia="Times New Roman" w:hAnsi="Times New Roman"/>
+                <w:b w:val="false"/>
+                <w:bCs w:val="false"/>
+                <w:sz w:val="20"/>
+                <w:szCs w:val="20"/>
+              </w:rPr>
+              <w:t xml:space="preserve">35</w:t>
+            </w:r>
+          </w:p>
+        </w:tc>
+        <w:tc>
+          <w:tcPr>
+            <w:tcW w:type="dxa" w:w="2200"/>
+            <w:tcMar>
+              <w:top w:type="dxa" w:w="60"/>
+              <w:left w:type="dxa" w:w="100"/>
+              <w:bottom w:type="dxa" w:w="60"/>
+              <w:right w:type="dxa" w:w="100"/>
+            </w:tcMar>
+          </w:tcPr>
+          <w:p>
+            <w:pPr>
+              <w:jc w:val="center"/>
+            </w:pPr>
+            <w:r>
+              <w:rPr>
+                <w:rFonts w:ascii="Times New Roman" w:cs="Times New Roman" w:eastAsia="Times New Roman" w:hAnsi="Times New Roman"/>
+                <w:b w:val="false"/>
+                <w:bCs w:val="false"/>
+                <w:sz w:val="20"/>
+                <w:szCs w:val="20"/>
+              </w:rPr>
+              <w:t xml:space="preserve">0.718</w:t>
+            </w:r>
+          </w:p>
+        </w:tc>
+        <w:tc>
+          <w:tcPr>
+            <w:tcW w:type="dxa" w:w="2650"/>
+            <w:tcMar>
+              <w:top w:type="dxa" w:w="60"/>
+              <w:left w:type="dxa" w:w="100"/>
+              <w:bottom w:type="dxa" w:w="60"/>
+              <w:right w:type="dxa" w:w="100"/>
+            </w:tcMar>
+          </w:tcPr>
+          <w:p>
+            <w:pPr>
+              <w:jc w:val="center"/>
+            </w:pPr>
+            <w:r>
+              <w:rPr>
+                <w:rFonts w:ascii="Times New Roman" w:cs="Times New Roman" w:eastAsia="Times New Roman" w:hAnsi="Times New Roman"/>
+                <w:b w:val="false"/>
+                <w:bCs w:val="false"/>
+                <w:sz w:val="20"/>
+                <w:szCs w:val="20"/>
+              </w:rPr>
+              <w:t xml:space="preserve">1.096 × 10⁻⁶</w:t>
+            </w:r>
+          </w:p>
+        </w:tc>
+        <w:tc>
+          <w:tcPr>
+            <w:tcW w:type="dxa" w:w="2650"/>
+            <w:tcMar>
+              <w:top w:type="dxa" w:w="60"/>
+              <w:left w:type="dxa" w:w="100"/>
+              <w:bottom w:type="dxa" w:w="60"/>
+              <w:right w:type="dxa" w:w="100"/>
+            </w:tcMar>
+          </w:tcPr>
+          <w:p>
+            <w:pPr>
+              <w:jc w:val="center"/>
+            </w:pPr>
+            <w:r>
+              <w:rPr>
+                <w:rFonts w:ascii="Times New Roman" w:cs="Times New Roman" w:eastAsia="Times New Roman" w:hAnsi="Times New Roman"/>
+                <w:b w:val="false"/>
+                <w:bCs w:val="false"/>
+                <w:sz w:val="20"/>
+                <w:szCs w:val="20"/>
+              </w:rPr>
+              <w:t xml:space="preserve">1.4392 × 10⁻¹²</w:t>
+            </w:r>
+          </w:p>
+        </w:tc>
+      </w:tr>
+    </w:tbl>
+    <w:p>
+      <w:pPr>
+        <w:spacing w:after="200" w:before="80"/>
+        <w:jc w:val="center"/>
+      </w:pPr>
+      <w:r>
+        <w:rPr>
+          <w:rFonts w:ascii="Times New Roman" w:cs="Times New Roman" w:eastAsia="Times New Roman" w:hAnsi="Times New Roman"/>
+          <w:i/>
+          <w:iCs/>
+          <w:sz w:val="20"/>
+          <w:szCs w:val="20"/>
+        </w:rPr>
+        <w:t xml:space="preserve">Table 2. Temperature sweep of the identical simulated specimen: the slope varies with viscosity; the permeability does not.</w:t>
       </w:r>
     </w:p>
     <w:p>
@@ -1503,7 +4428,7 @@
           <w:sz w:val="22"/>
           <w:szCs w:val="22"/>
         </w:rPr>
-        <w:t xml:space="preserve">4.3 Reproduction of a reference manual dataset</w:t>
+        <w:t xml:space="preserve">7.4 Reproduction of a reference manual dataset</w:t>
       </w:r>
     </w:p>
     <w:p>
@@ -1517,7 +4442,7 @@
           <w:sz w:val="22"/>
           <w:szCs w:val="22"/>
         </w:rPr>
-        <w:t xml:space="preserve">The analysis pipeline was benchmarked against a manually acquired 60-mesh dataset previously analyzed in a spreadsheet. The automated fit returned slope 7.858 × 10⁻⁷ (m³/s)/kPa, R² = 0.9936, k = 1.437 × 10⁻¹² m², and dh = 6.78 µm, matching the spreadsheet reference (7.86 × 10⁻⁷; 0.9936; 1.44 × 10⁻¹²; 6.79 µm) to within reading precision.</w:t>
+        <w:t xml:space="preserve">The analysis pipeline was benchmarked against a manually acquired 60-mesh dataset previously analyzed in a spreadsheet. The automated fit returned slope 7.858 × 10⁻⁷ (m³/s)/kPa, R² = 0.9936, k = 1.437 × 10⁻¹² m², and dh = 6.78 µm, matching the spreadsheet reference (7.86 × 10⁻⁷; 0.9936; 1.44 × 10⁻¹²; 6.79 µm) to within reading precision. One contrast between Sections 7.2 and 7.4 is instructive: the simulated runs fit with R² ≈ 0.99999 because their 2% instantaneous flow noise is averaged over 1200 samples per window, while the real manual dataset carries R² = 0.9936 — the difference is a measure of exactly the operator-dependent scatter this instrument is built to remove.</w:t>
       </w:r>
     </w:p>
     <w:p>
@@ -1532,7 +4457,7 @@
           <w:sz w:val="24"/>
           <w:szCs w:val="24"/>
         </w:rPr>
-        <w:t xml:space="preserve">5. Safety Design</w:t>
+        <w:t xml:space="preserve">8. Safety Design</w:t>
       </w:r>
     </w:p>
     <w:p>
@@ -1546,7 +4471,7 @@
           <w:sz w:val="22"/>
           <w:szCs w:val="22"/>
         </w:rPr>
-        <w:t xml:space="preserve">Protection is layered so that no single failure — software, sensor, or actuator — can leave the vessel pressurizing uncontrolled (Table 2). The safe state is “air inlet closed”: with the feed shut, the vessel self-depressurizes through the membrane. Because the servo holds position on power loss rather than springing closed, the mechanical relief valve, set above the software cutoff but far below the vessel rating, is the ultimate backstop and is deliberately independent of all electronics.</w:t>
+        <w:t xml:space="preserve">Protection is layered so that no single failure — software, sensor, or actuator — can leave the vessel pressurizing uncontrolled (Table 3). The safe state is “air inlet closed, diverter to waste”: with the feed shut, the vessel self-depressurizes through the membrane, and the diverter reaches waste by de-energizing, so it fails safe on any power loss. The servo does not share that property — it holds position when power is lost — which is precisely why the mechanical relief valve, set above the software cutoff but far below the vessel rating, is the ultimate backstop and is deliberately independent of all electronics.</w:t>
       </w:r>
     </w:p>
     <w:tbl>
@@ -1983,7 +4908,7 @@
           <w:sz w:val="20"/>
           <w:szCs w:val="20"/>
         </w:rPr>
-        <w:t xml:space="preserve">Table 2. Defense-in-depth pressure ladder.</w:t>
+        <w:t xml:space="preserve">Table 3. Defense-in-depth pressure ladder.</w:t>
       </w:r>
     </w:p>
     <w:p>
@@ -1997,7 +4922,7 @@
           <w:sz w:val="22"/>
           <w:szCs w:val="22"/>
         </w:rPr>
-        <w:t xml:space="preserve">The sensor-fault philosophy deserves emphasis: a disconnected 0.5–4.5 V transducer reads near 0 V, which naive scaling would interpret as strong vacuum-side error and answer by opening the air valve. The supervisor instead classifies out-of-range signals as instrument faults and forces the safe state — a failure mode identified during design review and treated as the highest-priority safety requirement of the software.</w:t>
+        <w:t xml:space="preserve">The safety supervisor runs on every control tick, before the controller, and independent of test state. Its logic distinguishes two failure classes with different urgencies. Overpressure — a healthy, numerical reading above 80 kPa — triggers on the very first sample: close, abort, alarm. Sensor faults use the opposite policy. A reading is classified as bad if the driver flagged it unhealthy, if it is not a number, or if it falls outside the physically plausible −5 to 105 kPa window; only three consecutive bad reads declare a fault, so a single I²C glitch does not abort a one-hour session, while a real failure is caught within 150 ms. The plausibility window exists because of a specific, dangerous failure mode identified during design review: a disconnected transducer reads 0 V, which Eq. (6) maps to −12.9 kPa. A controller that believed that number would see “pressure far too low” and open the air valve wide against a dead sensor. Because −12.9 kPa is below the −5 kPa plausibility floor, the supervisor instead declares an instrument fault and forces the safe state. Two further guarantees close the remaining gaps: the entire control tick runs inside an exception handler whose failure path is the safe state (a software bug vents the vessel rather than abandoning it mid-command), and the commissioning checklist includes a live kill test — unplugging the transducer mid-run must vent and abort within the grace window.</w:t>
       </w:r>
     </w:p>
     <w:p>
@@ -2012,7 +4937,36 @@
           <w:sz w:val="24"/>
           <w:szCs w:val="24"/>
         </w:rPr>
-        <w:t xml:space="preserve">6. Limitations and Future Work</w:t>
+        <w:t xml:space="preserve">9. Remote Operation and Data Management</w:t>
+      </w:r>
+    </w:p>
+    <w:p>
+      <w:pPr>
+        <w:spacing w:after="120" w:line="276"/>
+        <w:jc w:val="both"/>
+      </w:pPr>
+      <w:r>
+        <w:rPr>
+          <w:rFonts w:ascii="Times New Roman" w:cs="Times New Roman" w:eastAsia="Times New Roman" w:hAnsi="Times New Roman"/>
+          <w:sz w:val="22"/>
+          <w:szCs w:val="22"/>
+        </w:rPr>
+        <w:t xml:space="preserve">The Pi serves a self-contained single-page web interface — no external assets, so it works on an isolated lab network — through which any browser can watch the live pressure and temperature (polled every 500 ms), edit every test parameter (setpoints, tolerance, dwell, collection time, PID gains) without code changes, start and stop sequences, enter the measured volumes, and browse the accumulated history of runs, each downloadable as chart, spreadsheet, raw CSV, or JSON. The HTTP surface is a small typed API (status, start, stop, analyze, runs) that a future script or laboratory information system could drive directly. Two deployment details matter for a device that actuates hardware. The server binds only to the loopback interface; off-network access is provided by an outbound authenticated tunnel to a subdomain, which traverses the university firewall without any inbound port and places an identity check (email allow-list) in front of every request — the interface that can open an air valve is never exposed bare. And every run file is served through a strict name filter (timestamps only), so the download endpoints cannot be used to walk the filesystem.</w:t>
+      </w:r>
+    </w:p>
+    <w:p>
+      <w:pPr>
+        <w:spacing w:after="120" w:before="240"/>
+      </w:pPr>
+      <w:r>
+        <w:rPr>
+          <w:rFonts w:ascii="Times New Roman" w:cs="Times New Roman" w:eastAsia="Times New Roman" w:hAnsi="Times New Roman"/>
+          <w:b/>
+          <w:bCs/>
+          <w:sz w:val="24"/>
+          <w:szCs w:val="24"/>
+        </w:rPr>
+        <w:t xml:space="preserve">10. Limitations and Future Work</w:t>
       </w:r>
     </w:p>
     <w:p>
@@ -2031,7 +4985,7 @@
           <w:sz w:val="22"/>
           <w:szCs w:val="22"/>
         </w:rPr>
-        <w:t xml:space="preserve">Coarse pressure regulation. A servo-driven ball valve is expected to regulate to roughly ±10–15% rather than the ±2% of a laboratory proportional valve. This is an accepted design trade: as noted in Section 3, the analysis regresses against measured pressures, so regulation coarseness increases scatter but not bias. A stepper-driven needle valve is the identified upgrade path if finer holding proves necessary.</w:t>
+        <w:t xml:space="preserve">Coarse pressure regulation. A servo-driven ball valve is expected to regulate to roughly ±10–15% on the physical rig, versus the ±2% of a laboratory proportional valve. This is an accepted trade, made safe by the architecture: the analysis regresses against measured window means (Section 6), so regulation coarseness widens scatter but does not bias k. A stepper-driven needle valve is the identified upgrade path if finer holding proves necessary.</w:t>
       </w:r>
     </w:p>
     <w:p>
@@ -2050,7 +5004,7 @@
           <w:sz w:val="22"/>
           <w:szCs w:val="22"/>
         </w:rPr>
-        <w:t xml:space="preserve">Actuator torque margin. The valve-stem breakaway torque has not yet been measured; the printed transmission includes a 2:1 reduction as margin, and a higher-torque servo is the fallback.</w:t>
+        <w:t xml:space="preserve">Simulation-based evidence. All quantitative results in Section 7 are simulation-based. The plant model is first-order and its constants are estimates; the real vessel will differ, and the PID gains will be retuned against it. What the simulation does establish is the correctness of the logic — sequencing, safety, statistics, analysis — which is exactly the part that does not change when the plant does.</w:t>
       </w:r>
     </w:p>
     <w:p>
@@ -2069,7 +5023,7 @@
           <w:sz w:val="22"/>
           <w:szCs w:val="22"/>
         </w:rPr>
-        <w:t xml:space="preserve">Manual volume reading. Permeate volume is still read by eye from the graduated container; an electronic scale or level sensor would close the last manual step.</w:t>
+        <w:t xml:space="preserve">Actuator torque margin. The valve-stem breakaway torque has not yet been measured; the printed transmission includes a 2:1 reduction as margin, and a higher-torque servo is the fallback.</w:t>
       </w:r>
     </w:p>
     <w:p>
@@ -2088,7 +5042,7 @@
           <w:sz w:val="22"/>
           <w:szCs w:val="22"/>
         </w:rPr>
-        <w:t xml:space="preserve">Feed-forward. If compressor cycling on the real rig exceeds what feedback alone rejects, a second transducer on the supply side (the ADC has spare channels) enables feed-forward compensation.</w:t>
+        <w:t xml:space="preserve">Manual volume reading. Permeate volume is still read by eye from the graduated container; an electronic scale streaming into the existing volume-entry API would close the last manual step and, incidentally, provide continuous flow curves rather than window averages.</w:t>
       </w:r>
     </w:p>
     <w:p>
@@ -2107,7 +5061,7 @@
           <w:sz w:val="22"/>
           <w:szCs w:val="22"/>
         </w:rPr>
-        <w:t xml:space="preserve">Hardware validation. All results reported here are simulation-based; instrument assembly and on-rig commissioning (transducer calibration, valve authority sweep, PID retuning against the physical plant) are the immediate next steps.</w:t>
+        <w:t xml:space="preserve">Feed-forward. If compressor cycling on the real rig exceeds what feedback alone rejects, a second transducer on the supply side (the ADC has three spare channels) enables feed-forward compensation: the controller would see the supply dip before the vessel does.</w:t>
       </w:r>
     </w:p>
     <w:p>
@@ -2122,7 +5076,7 @@
           <w:sz w:val="24"/>
           <w:szCs w:val="24"/>
         </w:rPr>
-        <w:t xml:space="preserve">7. Conclusion</w:t>
+        <w:t xml:space="preserve">11. Conclusion</w:t>
       </w:r>
     </w:p>
     <w:p>
@@ -2136,7 +5090,7 @@
           <w:sz w:val="22"/>
           <w:szCs w:val="22"/>
         </w:rPr>
-        <w:t xml:space="preserve">A complete automation platform for constant-pressure membrane permeability testing was designed, implemented, and validated in simulation. The system replaces the two operator-dependent elements of the manual protocol — pressure holding and collection timing — with closed-loop control and solenoid-switched routing, adds in-situ temperature-compensated viscosity, and reduces a full multi-pressure characterization with analysis, plotting, and spreadsheet export to a single button press followed by one volume reading per test point. The layered software design permitted the entire instrument to be verified before any hardware was purchased, and the same simulation now provides a regression harness for future development.</w:t>
+        <w:t xml:space="preserve">A complete automation platform for constant-pressure membrane permeability testing was designed, implemented, and validated in simulation. The two operator-dependent elements of the manual protocol — pressure holding and collection timing — are replaced by a 20 Hz PID loop whose implementation choices (derivative-on-measurement, filtered rate, back-calculation anti-windup, ramped targets) each neutralize a specific practical failure, and by solenoid-switched routing timed by the same clock that samples the pressure. The analysis regresses flow against measured mean pressures, converting residual regulation error from hidden bias into visible scatter, and corrects for water viscosity using in-situ temperature so that the reported permeability is a property of the membrane alone — a claim the system itself verifies, holding k constant to five significant figures across a 15 °C temperature sweep while the raw slope changed by 39%. A full multi-pressure characterization with fitted permeability, pore size, chart, and spreadsheet now costs one button press plus one volume reading per point. The layered architecture, with its swappable simulated plant, allowed every one of these claims to be tested before the hardware was purchased, and the same simulation now stands as a permanent regression harness for the instrument's future development.</w:t>
       </w:r>
     </w:p>
     <w:p>
@@ -2241,6 +5195,20 @@
     </w:p>
     <w:p>
       <w:pPr>
+        <w:spacing w:after="60" w:line="276"/>
+        <w:jc w:val="both"/>
+      </w:pPr>
+      <w:r>
+        <w:rPr>
+          <w:rFonts w:ascii="Times New Roman" w:cs="Times New Roman" w:eastAsia="Times New Roman" w:hAnsi="Times New Roman"/>
+          <w:sz w:val="22"/>
+          <w:szCs w:val="22"/>
+        </w:rPr>
+        <w:t xml:space="preserve">[5] F. M. White, Fluid Mechanics, 8th ed., McGraw-Hill Education, New York, 2016.</w:t>
+      </w:r>
+    </w:p>
+    <w:p>
+      <w:pPr>
         <w:spacing w:after="0" w:line="276"/>
         <w:jc w:val="both"/>
       </w:pPr>
@@ -2260,7 +5228,7 @@
           <w:sz w:val="22"/>
           <w:szCs w:val="22"/>
         </w:rPr>
-        <w:t xml:space="preserve">the full control software, simulation mode, and assembly documentation are maintained in a version-controlled repository available from the author.</w:t>
+        <w:t xml:space="preserve">the full control software, simulation mode, assembly documentation, and the scripts that regenerate every figure and number in this paper are maintained in a version-controlled repository available from the author.</w:t>
       </w:r>
     </w:p>
     <w:sectPr>

</xml_diff>

<commit_message>
docs(paper): the manual volume reading widens k, it does not bias it (Sec 10)
Datos' result, and it is worth stating because it closes the argument the
paper opens in Sec 1.2. Reading the cylinder to a fixed ±δV over a common
window is the same ABSOLUTE error in every flow rate — equal variance across
points, which is exactly the assumption the unweighted least-squares fit
already relies on. So the last operator-dependent step left in the procedure
widens the slope's uncertainty without biasing it: ~0.4% in k at ±5 mL over
60 s for the 20/40/60 kPa ladder.

Also notes the collection time is configurable and will be set from the rig's
real flow, rather than committing the paper to 60 s — Datos flagged that the
simulated flow would fill a 1 L cylinder in well under a minute.

Tightened this bullet and the relief-valve one to hold 16 pages: the addition
had spilled a 3-line orphan (just the software-availability note) onto a 17th.
No safety wording in Sec 8 was touched to buy that space.
</commit_message>
<xml_diff>
--- a/docs/paper/Automated_Membrane_Permeability_System_Martinez.docx
+++ b/docs/paper/Automated_Membrane_Permeability_System_Martinez.docx
@@ -5456,7 +5456,7 @@
           <w:sz w:val="22"/>
           <w:szCs w:val="22"/>
         </w:rPr>
-        <w:t xml:space="preserve">No hardware-only protective layer. The specified mechanical relief valve was not fitted, so every layer of Table 3 depends on the controller running (Section 8). Until it is added, the supply regulator setting and the end-of-session manual shut-off are the only bounds that survive a dead controller — and fitting it is the cheapest, highest-value change available to this instrument.</w:t>
+        <w:t xml:space="preserve">No hardware-only protective layer. The specified mechanical relief valve was not fitted, so every layer of Table 3 depends on the controller running (Section 8). Until it is added, the regulator setting and the manual shut-off at the end of a session are the only bounds that survive a dead controller — and fitting it is the cheapest, highest-value change to this instrument.</w:t>
       </w:r>
     </w:p>
     <w:p>
@@ -5494,7 +5494,7 @@
           <w:sz w:val="22"/>
           <w:szCs w:val="22"/>
         </w:rPr>
-        <w:t xml:space="preserve">Manual volume reading. Permeate volume is still read by eye from the graduated container; an electronic scale streaming into the existing volume-entry API would close the last manual step and, incidentally, provide continuous flow curves rather than window averages.</w:t>
+        <w:t xml:space="preserve">Manual volume reading. Permeate volume is still read by eye — the one operator-dependent step left. It is benign in a useful way: a fixed ±δV over a common window is the same absolute error in every flow rate, so it widens the fitted slope's uncertainty without biasing it, and preserves the equal-variance assumption behind the unweighted fit of Section 6. For the 20/40/60 kPa ladder that costs about 0.4% in k at ±5 mL over 60 s; the collection time is itself configurable and will be set from the rig's real flow rate. An electronic scale streaming into the volume-entry API would close the step and, incidentally, give continuous flow curves rather than window averages.</w:t>
       </w:r>
     </w:p>
     <w:p>

</xml_diff>

<commit_message>
docs(paper): Fig. 5 now carries k's error bar — say so in the caption
Datos' 95fa661 added '± 0.10%' to the chart the instrument produces. The
caption enumerates what the figure shows, so leaving it unchanged would have
made it incomplete about its own figure — and the evidence-trail bullet
listed the analysis JSON's contents without the new field.

The .docx already embedded the updated PNG (it was on disk when the previous
commit regenerated), verified by hashing fig5_fit.png against the images
inside the archive — so no figure re-run was needed, only the wording.

Still 16 pages. No fit number moved: slope 8.0361e-07, R2 1.00000,
k 1.4365e-12, pore 6.780 um, and trace.csv byte-identical (Datos verified),
so nothing hardcoded in this file went stale.
</commit_message>
<xml_diff>
--- a/docs/paper/Automated_Membrane_Permeability_System_Martinez.docx
+++ b/docs/paper/Automated_Membrane_Permeability_System_Martinez.docx
@@ -3174,7 +3174,7 @@
           <w:sz w:val="22"/>
           <w:szCs w:val="22"/>
         </w:rPr>
-        <w:t xml:space="preserve">An analysis JSON with the fit (slope, intercept, R²), k, pore size, viscosity, and temperature.</w:t>
+        <w:t xml:space="preserve">An analysis JSON with the fit (slope, intercept, R²), k and the standard error of the slope propagated onto it, pore size, viscosity, and temperature.</w:t>
       </w:r>
     </w:p>
     <w:p>
@@ -3255,7 +3255,7 @@
           <w:sz w:val="20"/>
           <w:szCs w:val="20"/>
         </w:rPr>
-        <w:t xml:space="preserve">Figure 5. The chart the instrument itself produces for the simulated run of Fig. 4: flow rate versus measured mean pressure, the fitted line (Eq. 2), and the derived permeability and pore size, annotated with the water temperature and viscosity used.</w:t>
+        <w:t xml:space="preserve">Figure 5. The chart the instrument itself produces for the simulated run of Fig. 4: flow rate versus measured mean pressure, the fitted line (Eq. 2), and the derived permeability with its standard error and pore size, annotated with the water temperature and viscosity used.</w:t>
       </w:r>
     </w:p>
     <w:p>

</xml_diff>